<commit_message>
Manus §E: legg inn «tolv taler»-vits med 02:30-bussen
Tidlig i regi-infoen: tolv taler på programmet, og ekstra-taler er
velkomne – på bussen hjem 02:30 (callback til siste buss). Oppdaterer
HUSK-lappen og regenererer A5-kortene (manus.docx).

Co-Authored-By: Claude Opus 4.8 <noreply@anthropic.com>
Claude-Session: https://claude.ai/code/session_01HH3S616y2naKXPCG25iHhw
</commit_message>
<xml_diff>
--- a/manus.docx
+++ b/manus.docx
@@ -3078,7 +3078,7 @@
           <w:color w:val="CC0000"/>
           <w:sz w:val="22"/>
         </w:rPr>
-        <w:t>🔔 HUSK (gj.gang 1): hold dette kort. Ikke gå inn i en lang forklaring om antall bolker/taler/«sett dere ned» – det tappet energien etter inngangen. Det er tre timer (ikke fire) og tre intro-taler før buffet (ikke to).</w:t>
+        <w:t>🔔 HUSK (gj.gang 1): hold dette kort. «Tolv taler»-vitsen under er BRA – men stopp der; ikke ramle ut i en lang forklaring om bolker/antall/«sett dere ned» (det tappet energien i gj.gang 1). Det er tre timer (ikke fire) og tre intro-taler før buffet (ikke to).</w:t>
       </w:r>
     </w:p>
     <w:p>
@@ -3107,6 +3107,100 @@
           <w:sz w:val="28"/>
         </w:rPr>
         <w:t>Det er bare å spenne fast setebeltet: tre timer med mat, taler og praktiske ting.</w:t>
+      </w:r>
+    </w:p>
+    <w:p>
+      <w:r>
+        <w:rPr>
+          <w:i/>
+          <w:color w:val="CC0000"/>
+          <w:sz w:val="22"/>
+        </w:rPr>
+        <w:t>(tørr)</w:t>
+      </w:r>
+      <w:r>
+        <w:rPr>
+          <w:b w:val="0"/>
+          <w:color w:val="000000"/>
+          <w:sz w:val="28"/>
+        </w:rPr>
+        <w:t xml:space="preserve"> Vi har tolv taler på programmet i kveld. </w:t>
+      </w:r>
+      <w:r>
+        <w:rPr>
+          <w:i/>
+          <w:color w:val="CC0000"/>
+          <w:sz w:val="22"/>
+        </w:rPr>
+        <w:t>(beat)</w:t>
+      </w:r>
+      <w:r>
+        <w:rPr>
+          <w:b w:val="0"/>
+          <w:color w:val="000000"/>
+          <w:sz w:val="28"/>
+        </w:rPr>
+        <w:t xml:space="preserve"> Tolv. Ikke tretten.</w:t>
+      </w:r>
+    </w:p>
+    <w:p>
+      <w:r>
+        <w:rPr>
+          <w:i/>
+          <w:color w:val="CC0000"/>
+          <w:sz w:val="22"/>
+        </w:rPr>
+        <w:t>(varm)</w:t>
+      </w:r>
+      <w:r>
+        <w:rPr>
+          <w:b w:val="0"/>
+          <w:color w:val="000000"/>
+          <w:sz w:val="28"/>
+        </w:rPr>
+        <w:t xml:space="preserve"> Skulle noen brenne inne med en ekstra tale, er dere hjertelig velkomne til å holde den. </w:t>
+      </w:r>
+      <w:r>
+        <w:rPr>
+          <w:i/>
+          <w:color w:val="CC0000"/>
+          <w:sz w:val="22"/>
+        </w:rPr>
+        <w:t>(beat)</w:t>
+      </w:r>
+      <w:r>
+        <w:rPr>
+          <w:b w:val="0"/>
+          <w:color w:val="000000"/>
+          <w:sz w:val="28"/>
+        </w:rPr>
+        <w:t xml:space="preserve"> På bussen hjem. </w:t>
+      </w:r>
+      <w:r>
+        <w:rPr>
+          <w:i/>
+          <w:color w:val="CC0000"/>
+          <w:sz w:val="22"/>
+        </w:rPr>
+        <w:t>(beat)</w:t>
+      </w:r>
+      <w:r>
+        <w:rPr>
+          <w:b w:val="0"/>
+          <w:color w:val="000000"/>
+          <w:sz w:val="28"/>
+        </w:rPr>
+        <w:t xml:space="preserve"> Klokka 02:30.</w:t>
+      </w:r>
+    </w:p>
+    <w:p>
+      <w:r>
+        <w:rPr>
+          <w:i/>
+          <w:color w:val="CC0000"/>
+          <w:sz w:val="22"/>
+        </w:rPr>
+        <w:t>(beat – la latter komme)</w:t>
       </w:r>
     </w:p>
     <w:p>

</xml_diff>

<commit_message>
Manus §B: selvironi-meny til starten (flinke folk, FAU, Sonja)
Legger til opp-til-start-forslag i §B: «så mange flinke folk – hva
trenger dere meg til → jeg er byråkrat, gjør meg viktig på de minste
ting», pluss to toastmaster-analogier (FAU/elevråd som trygg, dronning
Sonja som høyrisiko). Merket som meny (velg lite utvalg, jf. standup §7).
Regenererer A5-kortene.

Co-Authored-By: Claude Opus 4.8 <noreply@anthropic.com>
Claude-Session: https://claude.ai/code/session_01HH3S616y2naKXPCG25iHhw
</commit_message>
<xml_diff>
--- a/manus.docx
+++ b/manus.docx
@@ -2503,6 +2503,16 @@
           <w:color w:val="CC0000"/>
           <w:sz w:val="22"/>
         </w:rPr>
+        <w:t>[SELVIRONI-MENY TIL STARTEN (standup-teknikk §7: maks ~3 selvironi-linjer totalt, ellers leses det som usikkerhet). Alt under er forslag å plukke fra – velg et lite, stramt utvalg, ikke lever hele rekka.]</w:t>
+      </w:r>
+    </w:p>
+    <w:p>
+      <w:r>
+        <w:rPr>
+          <w:i/>
+          <w:color w:val="CC0000"/>
+          <w:sz w:val="22"/>
+        </w:rPr>
         <w:t>(tørr)</w:t>
       </w:r>
       <w:r>
@@ -2511,7 +2521,257 @@
           <w:color w:val="000000"/>
           <w:sz w:val="28"/>
         </w:rPr>
-        <w:t xml:space="preserve"> Jeg jobber i det offentlige, så ting tar jævlig lang tid. Men dere skal få talene.</w:t>
+        <w:t xml:space="preserve"> Egentlig sliter jeg litt med å skjønne hva jeg skal gjøre her i kveld.</w:t>
+      </w:r>
+    </w:p>
+    <w:p>
+      <w:r>
+        <w:rPr>
+          <w:i/>
+          <w:color w:val="CC0000"/>
+          <w:sz w:val="22"/>
+        </w:rPr>
+        <w:t>(bygg)</w:t>
+      </w:r>
+      <w:r>
+        <w:rPr>
+          <w:b w:val="0"/>
+          <w:color w:val="000000"/>
+          <w:sz w:val="28"/>
+        </w:rPr>
+        <w:t xml:space="preserve"> Vi har skaffet lydtekniker. Vi har DJ. Vi har fotograf. </w:t>
+      </w:r>
+      <w:r>
+        <w:rPr>
+          <w:i/>
+          <w:color w:val="CC0000"/>
+          <w:sz w:val="22"/>
+        </w:rPr>
+        <w:t>(beat)</w:t>
+      </w:r>
+      <w:r>
+        <w:rPr>
+          <w:b w:val="0"/>
+          <w:color w:val="000000"/>
+          <w:sz w:val="28"/>
+        </w:rPr>
+        <w:t xml:space="preserve"> Vi har til og med presten.</w:t>
+      </w:r>
+    </w:p>
+    <w:p>
+      <w:r>
+        <w:rPr>
+          <w:i/>
+          <w:color w:val="CC0000"/>
+          <w:sz w:val="22"/>
+        </w:rPr>
+        <w:t>(beat)</w:t>
+      </w:r>
+      <w:r>
+        <w:rPr>
+          <w:b w:val="0"/>
+          <w:color w:val="000000"/>
+          <w:sz w:val="28"/>
+        </w:rPr>
+        <w:t xml:space="preserve"> Med så mange flinke folk – hva trenger dere egentlig meg til?</w:t>
+      </w:r>
+    </w:p>
+    <w:p>
+      <w:r>
+        <w:rPr>
+          <w:i/>
+          <w:color w:val="CC0000"/>
+          <w:sz w:val="22"/>
+        </w:rPr>
+        <w:t>(LAND 2 sek)</w:t>
+      </w:r>
+    </w:p>
+    <w:p>
+      <w:r>
+        <w:rPr>
+          <w:i/>
+          <w:color w:val="CC0000"/>
+          <w:sz w:val="22"/>
+        </w:rPr>
+        <w:t>(tørr)</w:t>
+      </w:r>
+      <w:r>
+        <w:rPr>
+          <w:b w:val="0"/>
+          <w:color w:val="000000"/>
+          <w:sz w:val="28"/>
+        </w:rPr>
+        <w:t xml:space="preserve"> Men én ting har jeg ikke fortalt dere: jeg er byråkrat i staten. </w:t>
+      </w:r>
+      <w:r>
+        <w:rPr>
+          <w:i/>
+          <w:color w:val="CC0000"/>
+          <w:sz w:val="22"/>
+        </w:rPr>
+        <w:t>(beat)</w:t>
+      </w:r>
+      <w:r>
+        <w:rPr>
+          <w:b w:val="0"/>
+          <w:color w:val="000000"/>
+          <w:sz w:val="28"/>
+        </w:rPr>
+        <w:t xml:space="preserve"> Så jeg klarer å gjøre meg viktig på de minste ting.</w:t>
+      </w:r>
+    </w:p>
+    <w:p>
+      <w:r>
+        <w:rPr>
+          <w:i/>
+          <w:color w:val="CC0000"/>
+          <w:sz w:val="22"/>
+        </w:rPr>
+        <w:t>(beat – la latter komme)</w:t>
+      </w:r>
+    </w:p>
+    <w:p>
+      <w:r>
+        <w:rPr>
+          <w:i/>
+          <w:color w:val="CC0000"/>
+          <w:sz w:val="22"/>
+        </w:rPr>
+        <w:t>[TOASTMASTER-ANALOGI (valgfri – plukk ÉN, ikke begge). Samme «jeg ble lurt inn i vervet»-poeng, to risikonivåer:]</w:t>
+      </w:r>
+    </w:p>
+    <w:p>
+      <w:pPr>
+        <w:ind w:left="283"/>
+      </w:pPr>
+      <w:r>
+        <w:rPr>
+          <w:b/>
+          <w:color w:val="000000"/>
+          <w:sz w:val="28"/>
+        </w:rPr>
+        <w:t>a) FAU/elevrådet (trygg):</w:t>
+      </w:r>
+      <w:r>
+        <w:rPr>
+          <w:b w:val="0"/>
+          <w:color w:val="000000"/>
+          <w:sz w:val="28"/>
+        </w:rPr>
+        <w:t xml:space="preserve"> «Å være toastmaster er litt som å stille til FAU eller elevrådet. </w:t>
+      </w:r>
+      <w:r>
+        <w:rPr>
+          <w:i/>
+          <w:color w:val="CC0000"/>
+          <w:sz w:val="22"/>
+        </w:rPr>
+        <w:t>(beat)</w:t>
+      </w:r>
+      <w:r>
+        <w:rPr>
+          <w:b w:val="0"/>
+          <w:color w:val="000000"/>
+          <w:sz w:val="28"/>
+        </w:rPr>
+        <w:t xml:space="preserve"> Ingen vil egentlig ha vervet. </w:t>
+      </w:r>
+      <w:r>
+        <w:rPr>
+          <w:i/>
+          <w:color w:val="CC0000"/>
+          <w:sz w:val="22"/>
+        </w:rPr>
+        <w:t>(beat)</w:t>
+      </w:r>
+      <w:r>
+        <w:rPr>
+          <w:b w:val="0"/>
+          <w:color w:val="000000"/>
+          <w:sz w:val="28"/>
+        </w:rPr>
+        <w:t xml:space="preserve"> Men har du det først, oppfører du deg som om du styrer hele skolen.»</w:t>
+      </w:r>
+    </w:p>
+    <w:p>
+      <w:pPr>
+        <w:ind w:left="283"/>
+      </w:pPr>
+      <w:r>
+        <w:rPr>
+          <w:b/>
+          <w:color w:val="000000"/>
+          <w:sz w:val="28"/>
+        </w:rPr>
+        <w:t>b) Dronning Sonja (HØYEST RISIKO – les rommet):</w:t>
+      </w:r>
+      <w:r>
+        <w:rPr>
+          <w:b w:val="0"/>
+          <w:color w:val="000000"/>
+          <w:sz w:val="28"/>
+        </w:rPr>
+        <w:t xml:space="preserve"> «Å være toastmaster er litt som å ligge med dronning Sonja. </w:t>
+      </w:r>
+      <w:r>
+        <w:rPr>
+          <w:i/>
+          <w:color w:val="CC0000"/>
+          <w:sz w:val="22"/>
+        </w:rPr>
+        <w:t>(beat)</w:t>
+      </w:r>
+      <w:r>
+        <w:rPr>
+          <w:b w:val="0"/>
+          <w:color w:val="000000"/>
+          <w:sz w:val="28"/>
+        </w:rPr>
+        <w:t xml:space="preserve"> Du føler du ikke kan si nei … </w:t>
+      </w:r>
+      <w:r>
+        <w:rPr>
+          <w:i/>
+          <w:color w:val="CC0000"/>
+          <w:sz w:val="22"/>
+        </w:rPr>
+        <w:t>(beat)</w:t>
+      </w:r>
+      <w:r>
+        <w:rPr>
+          <w:b w:val="0"/>
+          <w:color w:val="000000"/>
+          <w:sz w:val="28"/>
+        </w:rPr>
+        <w:t xml:space="preserve"> men du har ikke så lyst heller.»</w:t>
+      </w:r>
+    </w:p>
+    <w:p>
+      <w:r>
+        <w:rPr>
+          <w:i/>
+          <w:color w:val="CC0000"/>
+          <w:sz w:val="22"/>
+        </w:rPr>
+        <w:t>[NB Sonja-linja er kveldens frekkeste (kongehus + seksuelt), og mormor + besteforeldre er til stede (jf. §E). FAU-varianten gir samme poeng uten risiko – test Sonja på brudeparet før du evt. bruker den.]</w:t>
+      </w:r>
+    </w:p>
+    <w:p>
+      <w:r>
+        <w:rPr>
+          <w:i/>
+          <w:color w:val="CC0000"/>
+          <w:sz w:val="22"/>
+        </w:rPr>
+        <w:t>(tørr)</w:t>
+      </w:r>
+      <w:r>
+        <w:rPr>
+          <w:b w:val="0"/>
+          <w:color w:val="000000"/>
+          <w:sz w:val="28"/>
+        </w:rPr>
+        <w:t xml:space="preserve"> Og siden jeg jobber i det offentlige, tar ting jævlig lang tid. Men dere skal få talene.</w:t>
       </w:r>
     </w:p>
     <w:p>

</xml_diff>

<commit_message>
Manus §D: «lukk øynene»-oppfordring før brudeparet inn
Legger inn et stille intensjonsøyeblikk rett før inngangen: gjestene
lukker øynene og tenker «hvordan kan JEG bidra til det beste bryllupet
jeg har vært i», åpner øynene, «nå starter det for fullt» -> reis dere
+ servietter + Let's Get Ready to Rumble + brudeparet inn. Ro før
eksplosjon. Regenererer A5-kortene.

Co-Authored-By: Claude Opus 4.8 <noreply@anthropic.com>
Claude-Session: https://claude.ai/code/session_01HH3S616y2naKXPCG25iHhw
</commit_message>
<xml_diff>
--- a/manus.docx
+++ b/manus.docx
@@ -3168,7 +3168,7 @@
           <w:color w:val="CC0000"/>
           <w:sz w:val="28"/>
         </w:rPr>
-        <w:t>D — Brudeparet inn (servietter som startflagg)</w:t>
+        <w:t>D — Én oppfordring + brudeparet inn (servietter som startflagg)</w:t>
       </w:r>
     </w:p>
     <w:p>
@@ -3184,11 +3184,121 @@
     <w:p>
       <w:r>
         <w:rPr>
-          <w:b w:val="0"/>
-          <w:color w:val="000000"/>
-          <w:sz w:val="28"/>
-        </w:rPr>
-        <w:t xml:space="preserve">Og nå – det viktigste i hele kvelden. </w:t>
+          <w:i/>
+          <w:color w:val="CC0000"/>
+          <w:sz w:val="22"/>
+        </w:rPr>
+        <w:t>(varm, ro – senk tempoet helt ned)</w:t>
+      </w:r>
+      <w:r>
+        <w:rPr>
+          <w:b w:val="0"/>
+          <w:color w:val="000000"/>
+          <w:sz w:val="28"/>
+        </w:rPr>
+        <w:t xml:space="preserve"> Men aller først ber jeg dere om én ting i løpet av kvelden.</w:t>
+      </w:r>
+    </w:p>
+    <w:p>
+      <w:r>
+        <w:rPr>
+          <w:i/>
+          <w:color w:val="CC0000"/>
+          <w:sz w:val="22"/>
+        </w:rPr>
+        <w:t>(myk)</w:t>
+      </w:r>
+      <w:r>
+        <w:rPr>
+          <w:b w:val="0"/>
+          <w:color w:val="000000"/>
+          <w:sz w:val="28"/>
+        </w:rPr>
+        <w:t xml:space="preserve"> Lukk øynene et lite øyeblikk.</w:t>
+      </w:r>
+    </w:p>
+    <w:p>
+      <w:r>
+        <w:rPr>
+          <w:i/>
+          <w:color w:val="CC0000"/>
+          <w:sz w:val="22"/>
+        </w:rPr>
+        <w:t>(2 sek)</w:t>
+      </w:r>
+    </w:p>
+    <w:p>
+      <w:r>
+        <w:rPr>
+          <w:i/>
+          <w:color w:val="CC0000"/>
+          <w:sz w:val="22"/>
+        </w:rPr>
+        <w:t>(dempet)</w:t>
+      </w:r>
+      <w:r>
+        <w:rPr>
+          <w:b w:val="0"/>
+          <w:color w:val="000000"/>
+          <w:sz w:val="28"/>
+        </w:rPr>
+        <w:t xml:space="preserve"> Og tenk, helt for dere selv: hvordan kan JEG bidra til at dette blir det beste bryllupet jeg noen gang har vært i?</w:t>
+      </w:r>
+    </w:p>
+    <w:p>
+      <w:r>
+        <w:rPr>
+          <w:i/>
+          <w:color w:val="CC0000"/>
+          <w:sz w:val="22"/>
+        </w:rPr>
+        <w:t>(LAND 3 sek. La spørsmålet henge. Ikke fyll stillheten.)</w:t>
+      </w:r>
+    </w:p>
+    <w:p>
+      <w:r>
+        <w:rPr>
+          <w:i/>
+          <w:color w:val="CC0000"/>
+          <w:sz w:val="22"/>
+        </w:rPr>
+        <w:t>(varm)</w:t>
+      </w:r>
+      <w:r>
+        <w:rPr>
+          <w:b w:val="0"/>
+          <w:color w:val="000000"/>
+          <w:sz w:val="28"/>
+        </w:rPr>
+        <w:t xml:space="preserve"> Så kan dere åpne øynene igjen.</w:t>
+      </w:r>
+    </w:p>
+    <w:p>
+      <w:r>
+        <w:rPr>
+          <w:i/>
+          <w:color w:val="CC0000"/>
+          <w:sz w:val="22"/>
+        </w:rPr>
+        <w:t>[bygg energi – herfra og ut er det full gass]</w:t>
+      </w:r>
+    </w:p>
+    <w:p>
+      <w:r>
+        <w:rPr>
+          <w:i/>
+          <w:color w:val="CC0000"/>
+          <w:sz w:val="22"/>
+        </w:rPr>
+        <w:t>(høyere energi)</w:t>
+      </w:r>
+      <w:r>
+        <w:rPr>
+          <w:b w:val="0"/>
+          <w:color w:val="000000"/>
+          <w:sz w:val="28"/>
+        </w:rPr>
+        <w:t xml:space="preserve"> For nå starter det for fullt. </w:t>
       </w:r>
       <w:r>
         <w:rPr>

</xml_diff>

<commit_message>
A5-kort: legg til sidetall i bunntekst (Side X / Y)
Baker «Side X / Y» inn i generatoren (PAGE/NUMPAGES-felt) slik at alle
fremtidige versjoner av manus.docx alltid får sidetall – viktig for kort
som kan komme i uorden.

Co-Authored-By: Claude Opus 4.8 <noreply@anthropic.com>
Claude-Session: https://claude.ai/code/session_01HH3S616y2naKXPCG25iHhw
</commit_message>
<xml_diff>
--- a/manus.docx
+++ b/manus.docx
@@ -10003,6 +10003,7 @@
       </w:r>
     </w:p>
     <w:sectPr>
+      <w:footerReference w:type="default" r:id="rId9"/>
       <w:pgSz w:w="8391" w:h="11906"/>
       <w:pgMar w:top="680" w:right="680" w:bottom="680" w:left="680" w:header="720" w:footer="720" w:gutter="0"/>
       <w:cols w:space="720"/>
@@ -10010,6 +10011,49 @@
     </w:sectPr>
   </w:body>
 </w:document>
+</file>
+
+<file path=word/footer1.xml><?xml version="1.0" encoding="utf-8"?>
+<w:ftr xmlns:m="http://schemas.openxmlformats.org/officeDocument/2006/math" xmlns:mc="http://schemas.openxmlformats.org/markup-compatibility/2006" xmlns:mo="http://schemas.microsoft.com/office/mac/office/2008/main" xmlns:mv="urn:schemas-microsoft-com:mac:vml" xmlns:o="urn:schemas-microsoft-com:office:office" xmlns:r="http://schemas.openxmlformats.org/officeDocument/2006/relationships" xmlns:v="urn:schemas-microsoft-com:vml" xmlns:w10="urn:schemas-microsoft-com:office:word" xmlns:w14="http://schemas.microsoft.com/office/word/2010/wordml" xmlns:w="http://schemas.openxmlformats.org/wordprocessingml/2006/main" xmlns:wne="http://schemas.microsoft.com/office/word/2006/wordml" xmlns:wp14="http://schemas.microsoft.com/office/word/2010/wordprocessingDrawing" xmlns:wp="http://schemas.openxmlformats.org/drawingml/2006/wordprocessingDrawing" xmlns:wpc="http://schemas.microsoft.com/office/word/2010/wordprocessingCanvas" xmlns:wpg="http://schemas.microsoft.com/office/word/2010/wordprocessingGroup" xmlns:wpi="http://schemas.microsoft.com/office/word/2010/wordprocessingInk" xmlns:wps="http://schemas.microsoft.com/office/word/2010/wordprocessingShape" mc:Ignorable="w14 wp14">
+  <w:p>
+    <w:pPr>
+      <w:pStyle w:val="Footer"/>
+      <w:jc w:val="center"/>
+    </w:pPr>
+    <w:r>
+      <w:rPr>
+        <w:color w:val="555555"/>
+        <w:sz w:val="18"/>
+      </w:rPr>
+      <w:t xml:space="preserve">Side </w:t>
+    </w:r>
+    <w:r>
+      <w:rPr>
+        <w:color w:val="555555"/>
+        <w:sz w:val="18"/>
+      </w:rPr>
+      <w:fldChar w:fldCharType="begin"/>
+      <w:instrText xml:space="preserve">PAGE</w:instrText>
+      <w:fldChar w:fldCharType="end"/>
+    </w:r>
+    <w:r>
+      <w:rPr>
+        <w:color w:val="555555"/>
+        <w:sz w:val="18"/>
+      </w:rPr>
+      <w:t xml:space="preserve"> / </w:t>
+    </w:r>
+    <w:r>
+      <w:rPr>
+        <w:color w:val="555555"/>
+        <w:sz w:val="18"/>
+      </w:rPr>
+      <w:fldChar w:fldCharType="begin"/>
+      <w:instrText xml:space="preserve">NUMPAGES</w:instrText>
+      <w:fldChar w:fldCharType="end"/>
+    </w:r>
+  </w:p>
+</w:ftr>
 </file>
 
 <file path=word/numbering.xml><?xml version="1.0" encoding="utf-8"?>

</xml_diff>

<commit_message>
Manus: første servering rett etter FF-presentasjonen
Per avklaring: forrett (buffet 1) åpnes rett etter at FF-jentene har
presentert maten (etter Werner). Anders + Michelle + Helan går + Fireball
1 beholdes før hovedretten, men ligger nå etter forrett-serveringen.
Fireball-runde 1 omdøpt til «etter forretten» (passer Fireball-kadensen:
én runde etter hver servering). Oppdaterer Velkomstbolk-note + FF-note.

Co-Authored-By: Claude Opus 4.8 <noreply@anthropic.com>
Claude-Session: https://claude.ai/code/session_01HH3S616y2naKXPCG25iHhw
</commit_message>
<xml_diff>
--- a/manus.docx
+++ b/manus.docx
@@ -3347,7 +3347,23 @@
           <w:color w:val="CC0000"/>
           <w:sz w:val="22"/>
         </w:rPr>
-        <w:t>Tre taler FØR mat: brudens far, Anders→Michelle og Michelle→Anders (paret- utveksling tidlig). Deretter Helan går + velkomstshot. Setter energien før folk reiser seg til buffet. Søstre og søsken er flyttet til hovedrett, rett etter forloverne.</w:t>
+        <w:t xml:space="preserve">Werner taler FØR mat. Så presenterer FF-jentene maten, og </w:t>
+      </w:r>
+      <w:r>
+        <w:rPr>
+          <w:i/>
+          <w:color w:val="CC0000"/>
+          <w:sz w:val="22"/>
+        </w:rPr>
+        <w:t>første servering (forrett) åpnes</w:t>
+      </w:r>
+      <w:r>
+        <w:rPr>
+          <w:i/>
+          <w:color w:val="CC0000"/>
+          <w:sz w:val="22"/>
+        </w:rPr>
+        <w:t>. Anders→Michelle og Michelle→Anders (paret-utveksling) taler når folk har forsynt seg – før hovedretten. Deretter Helan går + Fireball (etter forretten). Søstre og søsken er flyttet til hovedrett, rett etter forloverne.</w:t>
       </w:r>
     </w:p>
     <w:p>
@@ -3481,7 +3497,23 @@
           <w:color w:val="CC0000"/>
           <w:sz w:val="22"/>
         </w:rPr>
-        <w:t>[Rett etter Werners tale. FF-jentene = «Feminin og fornem» (Michelles Ås-venninner, samme gjeng som Tale 10). Oda-rollen avklares nærmere – poenget her er at FF-jentene presenterer maten. Selve buffeten åpnes som før, etter Fireball-runde 1.]</w:t>
+        <w:t xml:space="preserve">[Rett etter Werners tale. FF-jentene = «Feminin og fornem» (Michelles Ås-venninner, samme gjeng som Tale 10). Oda-rollen avklares nærmere – poenget her er at FF-jentene presenterer maten. </w:t>
+      </w:r>
+      <w:r>
+        <w:rPr>
+          <w:i/>
+          <w:color w:val="CC0000"/>
+          <w:sz w:val="22"/>
+        </w:rPr>
+        <w:t>Første servering (forrett) åpnes rett etter denne presentasjonen</w:t>
+      </w:r>
+      <w:r>
+        <w:rPr>
+          <w:i/>
+          <w:color w:val="CC0000"/>
+          <w:sz w:val="22"/>
+        </w:rPr>
+        <w:t xml:space="preserve"> – se under.]</w:t>
       </w:r>
     </w:p>
     <w:p>
@@ -3627,7 +3659,7 @@
           <w:color w:val="CC0000"/>
           <w:sz w:val="28"/>
         </w:rPr>
-        <w:t>Intro tale 2 — Anders til Michelle</w:t>
+        <w:t>🍽️ Første servering — forrett (buffet 1 åpnes)</w:t>
       </w:r>
     </w:p>
     <w:p>
@@ -3637,37 +3669,7 @@
           <w:color w:val="CC0000"/>
           <w:sz w:val="22"/>
         </w:rPr>
-        <w:t>[Intro-sang: Burning Love, 20 sek]</w:t>
-      </w:r>
-    </w:p>
-    <w:p>
-      <w:r>
-        <w:rPr>
-          <w:b w:val="0"/>
-          <w:color w:val="000000"/>
-          <w:sz w:val="28"/>
-        </w:rPr>
-        <w:t>Neste taler har gjort karriere på å holde pitch deck.</w:t>
-      </w:r>
-    </w:p>
-    <w:p>
-      <w:r>
-        <w:rPr>
-          <w:b w:val="0"/>
-          <w:color w:val="000000"/>
-          <w:sz w:val="28"/>
-        </w:rPr>
-        <w:t>I kveld holder han tale.</w:t>
-      </w:r>
-    </w:p>
-    <w:p>
-      <w:r>
-        <w:rPr>
-          <w:b w:val="0"/>
-          <w:color w:val="000000"/>
-          <w:sz w:val="28"/>
-        </w:rPr>
-        <w:t>Forskjellen er at han ikke kan avslutte med «any questions?» – svigerfaren sitter på første rad.</w:t>
+        <w:t>[Rett etter FF-presentasjonen. Folk reiser seg og henter forrett; kjøkkenet styrer bord-rotasjon. Anders' og Michelles taler kommer når alle har satt seg igjen og fått en gaffel – før hovedretten.]</w:t>
       </w:r>
     </w:p>
     <w:p>
@@ -3677,53 +3679,25 @@
           <w:color w:val="CC0000"/>
           <w:sz w:val="22"/>
         </w:rPr>
-        <w:t>[Anders-beskrivelse (din):]</w:t>
-      </w:r>
-    </w:p>
-    <w:p>
-      <w:r>
-        <w:rPr>
-          <w:b w:val="0"/>
-          <w:color w:val="000000"/>
-          <w:sz w:val="28"/>
-        </w:rPr>
-        <w:t xml:space="preserve">Anders har en lang merittliste – en ambisiøs «posterboy» fra Vinger. Varm, smart, god og nysgjerrig. </w:t>
-      </w:r>
+        <w:t>(varm)</w:t>
+      </w:r>
+      <w:r>
+        <w:rPr>
+          <w:b w:val="0"/>
+          <w:color w:val="000000"/>
+          <w:sz w:val="28"/>
+        </w:rPr>
+        <w:t xml:space="preserve"> Og med det er forretten servert – første buffet er åpen. Vel bekomme!</w:t>
+      </w:r>
+    </w:p>
+    <w:p>
       <w:r>
         <w:rPr>
           <w:i/>
           <w:color w:val="CC0000"/>
           <w:sz w:val="22"/>
         </w:rPr>
-        <w:t>(beat)</w:t>
-      </w:r>
-      <w:r>
-        <w:rPr>
-          <w:b w:val="0"/>
-          <w:color w:val="000000"/>
-          <w:sz w:val="28"/>
-        </w:rPr>
-        <w:t xml:space="preserve"> Men de fleste vil nok først og fremst beskrive deg som smart.</w:t>
-      </w:r>
-    </w:p>
-    <w:p>
-      <w:r>
-        <w:rPr>
-          <w:b w:val="0"/>
-          <w:color w:val="000000"/>
-          <w:sz w:val="28"/>
-        </w:rPr>
-        <w:t>Anders – scenen er din.</w:t>
-      </w:r>
-    </w:p>
-    <w:p>
-      <w:r>
-        <w:rPr>
-          <w:i/>
-          <w:color w:val="CC0000"/>
-          <w:sz w:val="22"/>
-        </w:rPr>
-        <w:t>[Tale 2, 5 min]</w:t>
+        <w:t>(Folk henter forrett og setter seg igjen. Vent med Anders' tale til alle sitter.)</w:t>
       </w:r>
     </w:p>
     <w:p>
@@ -3745,7 +3719,7 @@
           <w:color w:val="CC0000"/>
           <w:sz w:val="28"/>
         </w:rPr>
-        <w:t>Intro tale 3 — Michelle (brudens tale, paret-utveksling)</w:t>
+        <w:t>Intro tale 2 — Anders til Michelle</w:t>
       </w:r>
     </w:p>
     <w:p>
@@ -3755,7 +3729,37 @@
           <w:color w:val="CC0000"/>
           <w:sz w:val="22"/>
         </w:rPr>
-        <w:t>[Intro-sang: Mamma Mia, 20 sek. Tonen senkes – feminin og fornem.]</w:t>
+        <w:t>[Intro-sang: Burning Love, 20 sek]</w:t>
+      </w:r>
+    </w:p>
+    <w:p>
+      <w:r>
+        <w:rPr>
+          <w:b w:val="0"/>
+          <w:color w:val="000000"/>
+          <w:sz w:val="28"/>
+        </w:rPr>
+        <w:t>Neste taler har gjort karriere på å holde pitch deck.</w:t>
+      </w:r>
+    </w:p>
+    <w:p>
+      <w:r>
+        <w:rPr>
+          <w:b w:val="0"/>
+          <w:color w:val="000000"/>
+          <w:sz w:val="28"/>
+        </w:rPr>
+        <w:t>I kveld holder han tale.</w:t>
+      </w:r>
+    </w:p>
+    <w:p>
+      <w:r>
+        <w:rPr>
+          <w:b w:val="0"/>
+          <w:color w:val="000000"/>
+          <w:sz w:val="28"/>
+        </w:rPr>
+        <w:t>Forskjellen er at han ikke kan avslutte med «any questions?» – svigerfaren sitter på første rad.</w:t>
       </w:r>
     </w:p>
     <w:p>
@@ -3765,107 +3769,53 @@
           <w:color w:val="CC0000"/>
           <w:sz w:val="22"/>
         </w:rPr>
-        <w:t>(Pause. Bytt rytme. Senke skuldrene.)</w:t>
-      </w:r>
-    </w:p>
-    <w:p>
+        <w:t>[Anders-beskrivelse (din):]</w:t>
+      </w:r>
+    </w:p>
+    <w:p>
+      <w:r>
+        <w:rPr>
+          <w:b w:val="0"/>
+          <w:color w:val="000000"/>
+          <w:sz w:val="28"/>
+        </w:rPr>
+        <w:t xml:space="preserve">Anders har en lang merittliste – en ambisiøs «posterboy» fra Vinger. Varm, smart, god og nysgjerrig. </w:t>
+      </w:r>
       <w:r>
         <w:rPr>
           <w:i/>
           <w:color w:val="CC0000"/>
           <w:sz w:val="22"/>
         </w:rPr>
-        <w:t>[Utkast – ny åpning (uferdig, fyll inn slutten):]</w:t>
-      </w:r>
-      <w:r>
-        <w:rPr>
-          <w:b w:val="0"/>
-          <w:color w:val="000000"/>
-          <w:sz w:val="28"/>
-        </w:rPr>
-        <w:t xml:space="preserve"> Jeg ringte rundt til flere og fikk særlig høre en hyggelig kommentar fra tanta mi Kjersti – Michelles svigermor: «hu var da ei veldig søt jinta, hu jinta hu dærre Michelle.» </w:t>
-      </w:r>
+        <w:t>(beat)</w:t>
+      </w:r>
+      <w:r>
+        <w:rPr>
+          <w:b w:val="0"/>
+          <w:color w:val="000000"/>
+          <w:sz w:val="28"/>
+        </w:rPr>
+        <w:t xml:space="preserve"> Men de fleste vil nok først og fremst beskrive deg som smart.</w:t>
+      </w:r>
+    </w:p>
+    <w:p>
+      <w:r>
+        <w:rPr>
+          <w:b w:val="0"/>
+          <w:color w:val="000000"/>
+          <w:sz w:val="28"/>
+        </w:rPr>
+        <w:t>Anders – scenen er din.</w:t>
+      </w:r>
+    </w:p>
+    <w:p>
       <w:r>
         <w:rPr>
           <w:i/>
           <w:color w:val="CC0000"/>
           <w:sz w:val="22"/>
         </w:rPr>
-        <w:t>(varm)</w:t>
-      </w:r>
-      <w:r>
-        <w:rPr>
-          <w:b w:val="0"/>
-          <w:color w:val="000000"/>
-          <w:sz w:val="28"/>
-        </w:rPr>
-        <w:t xml:space="preserve"> Michelle, du er …</w:t>
-      </w:r>
-    </w:p>
-    <w:p>
-      <w:r>
-        <w:rPr>
-          <w:b w:val="0"/>
-          <w:color w:val="000000"/>
-          <w:sz w:val="28"/>
-        </w:rPr>
-        <w:t>Anders har akkurat fortalt oss hvem Michelle er for ham.</w:t>
-      </w:r>
-    </w:p>
-    <w:p>
-      <w:r>
-        <w:rPr>
-          <w:b w:val="0"/>
-          <w:color w:val="000000"/>
-          <w:sz w:val="28"/>
-        </w:rPr>
-        <w:t>Det er sjelden vi får høre brudens egne ord så tidlig i et bryllup.</w:t>
-      </w:r>
-    </w:p>
-    <w:p>
-      <w:r>
-        <w:rPr>
-          <w:b w:val="0"/>
-          <w:color w:val="000000"/>
-          <w:sz w:val="28"/>
-        </w:rPr>
-        <w:t>I kveld får vi.</w:t>
-      </w:r>
-    </w:p>
-    <w:p>
-      <w:r>
-        <w:rPr>
-          <w:b w:val="0"/>
-          <w:color w:val="000000"/>
-          <w:sz w:val="28"/>
-        </w:rPr>
-        <w:t xml:space="preserve">Bruden – </w:t>
-      </w:r>
-      <w:r>
-        <w:rPr>
-          <w:b/>
-          <w:color w:val="000000"/>
-          <w:sz w:val="28"/>
-        </w:rPr>
-        <w:t>Michelle</w:t>
-      </w:r>
-      <w:r>
-        <w:rPr>
-          <w:b w:val="0"/>
-          <w:color w:val="000000"/>
-          <w:sz w:val="28"/>
-        </w:rPr>
-        <w:t>.</w:t>
-      </w:r>
-    </w:p>
-    <w:p>
-      <w:r>
-        <w:rPr>
-          <w:i/>
-          <w:color w:val="CC0000"/>
-          <w:sz w:val="22"/>
-        </w:rPr>
-        <w:t>[Tale 3, 5 min – Michelles egne ord, feminin og fornem levering.]</w:t>
+        <w:t>[Tale 2, 5 min]</w:t>
       </w:r>
     </w:p>
     <w:p>
@@ -3887,7 +3837,7 @@
           <w:color w:val="CC0000"/>
           <w:sz w:val="28"/>
         </w:rPr>
-        <w:t>Helan går — obligatorisk skål</w:t>
+        <w:t>Intro tale 3 — Michelle (brudens tale, paret-utveksling)</w:t>
       </w:r>
     </w:p>
     <w:p>
@@ -3897,27 +3847,107 @@
           <w:color w:val="CC0000"/>
           <w:sz w:val="22"/>
         </w:rPr>
-        <w:t>[Etter de tre talene. PowerPoint: tekst]</w:t>
-      </w:r>
-    </w:p>
-    <w:p>
-      <w:r>
-        <w:rPr>
-          <w:b w:val="0"/>
-          <w:color w:val="000000"/>
-          <w:sz w:val="28"/>
-        </w:rPr>
-        <w:t>Tre flotte taler – det fortjener en ekte skål.</w:t>
-      </w:r>
-    </w:p>
-    <w:p>
+        <w:t>[Intro-sang: Mamma Mia, 20 sek. Tonen senkes – feminin og fornem.]</w:t>
+      </w:r>
+    </w:p>
+    <w:p>
+      <w:r>
+        <w:rPr>
+          <w:i/>
+          <w:color w:val="CC0000"/>
+          <w:sz w:val="22"/>
+        </w:rPr>
+        <w:t>(Pause. Bytt rytme. Senke skuldrene.)</w:t>
+      </w:r>
+    </w:p>
+    <w:p>
+      <w:r>
+        <w:rPr>
+          <w:i/>
+          <w:color w:val="CC0000"/>
+          <w:sz w:val="22"/>
+        </w:rPr>
+        <w:t>[Utkast – ny åpning (uferdig, fyll inn slutten):]</w:t>
+      </w:r>
+      <w:r>
+        <w:rPr>
+          <w:b w:val="0"/>
+          <w:color w:val="000000"/>
+          <w:sz w:val="28"/>
+        </w:rPr>
+        <w:t xml:space="preserve"> Jeg ringte rundt til flere og fikk særlig høre en hyggelig kommentar fra tanta mi Kjersti – Michelles svigermor: «hu var da ei veldig søt jinta, hu jinta hu dærre Michelle.» </w:t>
+      </w:r>
+      <w:r>
+        <w:rPr>
+          <w:i/>
+          <w:color w:val="CC0000"/>
+          <w:sz w:val="22"/>
+        </w:rPr>
+        <w:t>(varm)</w:t>
+      </w:r>
+      <w:r>
+        <w:rPr>
+          <w:b w:val="0"/>
+          <w:color w:val="000000"/>
+          <w:sz w:val="28"/>
+        </w:rPr>
+        <w:t xml:space="preserve"> Michelle, du er …</w:t>
+      </w:r>
+    </w:p>
+    <w:p>
+      <w:r>
+        <w:rPr>
+          <w:b w:val="0"/>
+          <w:color w:val="000000"/>
+          <w:sz w:val="28"/>
+        </w:rPr>
+        <w:t>Anders har akkurat fortalt oss hvem Michelle er for ham.</w:t>
+      </w:r>
+    </w:p>
+    <w:p>
+      <w:r>
+        <w:rPr>
+          <w:b w:val="0"/>
+          <w:color w:val="000000"/>
+          <w:sz w:val="28"/>
+        </w:rPr>
+        <w:t>Det er sjelden vi får høre brudens egne ord så tidlig i et bryllup.</w:t>
+      </w:r>
+    </w:p>
+    <w:p>
+      <w:r>
+        <w:rPr>
+          <w:b w:val="0"/>
+          <w:color w:val="000000"/>
+          <w:sz w:val="28"/>
+        </w:rPr>
+        <w:t>I kveld får vi.</w:t>
+      </w:r>
+    </w:p>
+    <w:p>
+      <w:r>
+        <w:rPr>
+          <w:b w:val="0"/>
+          <w:color w:val="000000"/>
+          <w:sz w:val="28"/>
+        </w:rPr>
+        <w:t xml:space="preserve">Bruden – </w:t>
+      </w:r>
       <w:r>
         <w:rPr>
           <w:b/>
           <w:color w:val="000000"/>
           <w:sz w:val="28"/>
         </w:rPr>
-        <w:t>Helan går!</w:t>
+        <w:t>Michelle</w:t>
+      </w:r>
+      <w:r>
+        <w:rPr>
+          <w:b w:val="0"/>
+          <w:color w:val="000000"/>
+          <w:sz w:val="28"/>
+        </w:rPr>
+        <w:t>.</w:t>
       </w:r>
     </w:p>
     <w:p>
@@ -3927,7 +3957,7 @@
           <w:color w:val="CC0000"/>
           <w:sz w:val="22"/>
         </w:rPr>
-        <w:t>[Hele salen, 1 vers + skål. Ned i ett.]</w:t>
+        <w:t>[Tale 3, 5 min – Michelles egne ord, feminin og fornem levering.]</w:t>
       </w:r>
     </w:p>
     <w:p>
@@ -3949,7 +3979,7 @@
           <w:color w:val="CC0000"/>
           <w:sz w:val="28"/>
         </w:rPr>
-        <w:t>🔥 Fireball-runde 1 — velkomstshot</w:t>
+        <w:t>Helan går — obligatorisk skål</w:t>
       </w:r>
     </w:p>
     <w:p>
@@ -3959,17 +3989,79 @@
           <w:color w:val="CC0000"/>
           <w:sz w:val="22"/>
         </w:rPr>
-        <w:t>[PowerPoint: 🔥 FIREBALL slide. Forlovere har shotbrett klare.]</w:t>
-      </w:r>
-    </w:p>
-    <w:p>
-      <w:r>
-        <w:rPr>
-          <w:b w:val="0"/>
-          <w:color w:val="000000"/>
-          <w:sz w:val="28"/>
-        </w:rPr>
-        <w:t>Og før vi slipper løs på buffet – én ekstra runde.</w:t>
+        <w:t>[Etter de tre talene. PowerPoint: tekst]</w:t>
+      </w:r>
+    </w:p>
+    <w:p>
+      <w:r>
+        <w:rPr>
+          <w:b w:val="0"/>
+          <w:color w:val="000000"/>
+          <w:sz w:val="28"/>
+        </w:rPr>
+        <w:t>Tre flotte taler – det fortjener en ekte skål.</w:t>
+      </w:r>
+    </w:p>
+    <w:p>
+      <w:r>
+        <w:rPr>
+          <w:b/>
+          <w:color w:val="000000"/>
+          <w:sz w:val="28"/>
+        </w:rPr>
+        <w:t>Helan går!</w:t>
+      </w:r>
+    </w:p>
+    <w:p>
+      <w:r>
+        <w:rPr>
+          <w:i/>
+          <w:color w:val="CC0000"/>
+          <w:sz w:val="22"/>
+        </w:rPr>
+        <w:t>[Hele salen, 1 vers + skål. Ned i ett.]</w:t>
+      </w:r>
+    </w:p>
+    <w:p>
+      <w:pPr>
+        <w:pBdr>
+          <w:bottom w:val="single" w:sz="6" w:space="1" w:color="CC0000"/>
+        </w:pBdr>
+      </w:pPr>
+    </w:p>
+    <w:p>
+      <w:pPr>
+        <w:pageBreakBefore/>
+        <w:spacing w:before="40"/>
+      </w:pPr>
+      <w:r>
+        <w:rPr>
+          <w:b/>
+          <w:i w:val="0"/>
+          <w:color w:val="CC0000"/>
+          <w:sz w:val="28"/>
+        </w:rPr>
+        <w:t>🔥 Fireball-runde 1 — etter forretten</w:t>
+      </w:r>
+    </w:p>
+    <w:p>
+      <w:r>
+        <w:rPr>
+          <w:i/>
+          <w:color w:val="CC0000"/>
+          <w:sz w:val="22"/>
+        </w:rPr>
+        <w:t>[PowerPoint: 🔥 FIREBALL slide. Forlovere har shotbrett klare. Fireball-kadens: én runde etter hver servering – dette er runden etter forretten, før hovedretten.]</w:t>
+      </w:r>
+    </w:p>
+    <w:p>
+      <w:r>
+        <w:rPr>
+          <w:b w:val="0"/>
+          <w:color w:val="000000"/>
+          <w:sz w:val="28"/>
+        </w:rPr>
+        <w:t>Tre flotte taler og vel overstått forrett – det fortjener en runde til.</w:t>
       </w:r>
     </w:p>
     <w:p>
@@ -3995,21 +4087,11 @@
     <w:p>
       <w:r>
         <w:rPr>
-          <w:b w:val="0"/>
-          <w:color w:val="000000"/>
-          <w:sz w:val="28"/>
-        </w:rPr>
-        <w:t>Og med det – buffet 1 er åpen. Vel bekomme!</w:t>
-      </w:r>
-    </w:p>
-    <w:p>
-      <w:r>
-        <w:rPr>
           <w:i/>
           <w:color w:val="CC0000"/>
           <w:sz w:val="22"/>
         </w:rPr>
-        <w:t>(Buffet 1 åpnes. Folk reiser seg, henter forrett. Kjøkkenet styrer bord-rotasjon.)</w:t>
+        <w:t>(Og så gjør vi oss klare til hovedretten.)</w:t>
       </w:r>
     </w:p>
     <w:p>

</xml_diff>

<commit_message>
Manus: bygg inn feedback fra gjennomgang 2 (med broren)
- Erik: «de ringer Erik»-struktur (Bane NOR/Forsvaret -> salen svarer).
- Ola + Ingrid: Ingrid (russ/prioriterte bryllupet) + Olas eskalerende
  ironiske CV (fotball -> Australia -> NHH -> «upcoming stor mann»).
- Anders: planlegger-humor (servietter, bordplassering som regneark,
  pizzaboller som forretningsplan).
- Michelle: detaljfokusert + baking, ironisk + telefonrunde-HUSK.
- §E: plassholder for drikke-føringer tidlig.
- Maarud: verifisert 2-linjers historie (potetgull 1936). Nazi-/
  krigsforbryter-vinkel avvist (ingen kilde, feil tone).
- Huskeliste: si rolle/tittel ved hver intro; cue musikk til refrenget;
  Werner lander på Michelle. simen-lyd.md: cue-til-refrenget-prinsipp.
- Logger gjennomgang 2 i gjennomganger.md.

Co-Authored-By: Claude Opus 4.8 <noreply@anthropic.com>
Claude-Session: https://claude.ai/code/session_01HH3S616y2naKXPCG25iHhw
</commit_message>
<xml_diff>
--- a/manus.docx
+++ b/manus.docx
@@ -1543,7 +1543,55 @@
           <w:color w:val="000000"/>
           <w:sz w:val="28"/>
         </w:rPr>
-        <w:t>. NB: runde 1 er i dag en velkomstshot FØR buffet 1 – flytt/legg til så det blir én etter hver servering (se tidsplan.md / simen-lyd.md / powerpoint-plan.md).</w:t>
+        <w:t xml:space="preserve">. NB: runde 1 er i dag en velkomstshot FØR buffet 1 – flytt/legg til så det blir én etter hver servering (se tidsplan.md / simen-lyd.md / powerpoint-plan.md). 9. </w:t>
+      </w:r>
+      <w:r>
+        <w:rPr>
+          <w:b/>
+          <w:color w:val="000000"/>
+          <w:sz w:val="28"/>
+        </w:rPr>
+        <w:t>Si rollen/tittelen ved HVER intro</w:t>
+      </w:r>
+      <w:r>
+        <w:rPr>
+          <w:b w:val="0"/>
+          <w:color w:val="000000"/>
+          <w:sz w:val="28"/>
+        </w:rPr>
+        <w:t xml:space="preserve"> – brudens far, brudgommens far, forlover, søster osv. Gjesten skal vite hvem taleren er for brudeparet. 10. </w:t>
+      </w:r>
+      <w:r>
+        <w:rPr>
+          <w:b/>
+          <w:color w:val="000000"/>
+          <w:sz w:val="28"/>
+        </w:rPr>
+        <w:t>🎵 Cue musikken til refrenget</w:t>
+      </w:r>
+      <w:r>
+        <w:rPr>
+          <w:b w:val="0"/>
+          <w:color w:val="000000"/>
+          <w:sz w:val="28"/>
+        </w:rPr>
+        <w:t xml:space="preserve"> – intro-låtene skal treffe selve refrenget når de spilles, ikke introen av låta. Avklar med Simen (simen-lyd.md §3) og merk start-tid per spor. 11. </w:t>
+      </w:r>
+      <w:r>
+        <w:rPr>
+          <w:b/>
+          <w:color w:val="000000"/>
+          <w:sz w:val="28"/>
+        </w:rPr>
+        <w:t>Werner-introen handler om datteren Michelle</w:t>
+      </w:r>
+      <w:r>
+        <w:rPr>
+          <w:b w:val="0"/>
+          <w:color w:val="000000"/>
+          <w:sz w:val="28"/>
+        </w:rPr>
+        <w:t xml:space="preserve"> – land der (jf. punkt 4).</w:t>
       </w:r>
     </w:p>
     <w:p>
@@ -1908,6 +1956,71 @@
           <w:color w:val="000000"/>
           <w:sz w:val="28"/>
         </w:rPr>
+        <w:t>Maarud-historie (2 linjer – valgfri lokalfarge, verifisert)</w:t>
+      </w:r>
+    </w:p>
+    <w:p>
+      <w:pPr>
+        <w:ind w:left="283"/>
+      </w:pPr>
+      <w:r>
+        <w:rPr>
+          <w:b w:val="0"/>
+          <w:color w:val="000000"/>
+          <w:sz w:val="28"/>
+        </w:rPr>
+        <w:t xml:space="preserve">«Litt om stedet vi sitter på: her på Maarud begynte hele potetgull-eventyret i 1936 – etter at Thomas Stang hadde vært i USA og smakt chips. </w:t>
+      </w:r>
+      <w:r>
+        <w:rPr>
+          <w:i/>
+          <w:color w:val="CC0000"/>
+          <w:sz w:val="22"/>
+        </w:rPr>
+        <w:t>(beat)</w:t>
+      </w:r>
+      <w:r>
+        <w:rPr>
+          <w:b w:val="0"/>
+          <w:color w:val="000000"/>
+          <w:sz w:val="28"/>
+        </w:rPr>
+        <w:t xml:space="preserve"> Så ja: dere feirer bryllup i selve chipsens fødeby.»</w:t>
+      </w:r>
+    </w:p>
+    <w:p>
+      <w:r>
+        <w:rPr>
+          <w:i/>
+          <w:color w:val="CC0000"/>
+          <w:sz w:val="22"/>
+        </w:rPr>
+        <w:t>Verifisert (potetgull fra 1936, Stang/USA-tur – kilde: Wikipedia/maarudgaard.no). For mer lokalfarge: mild bygdehumor (gjedde i Glomma, tjuvjakt) funker.</w:t>
+      </w:r>
+      <w:r>
+        <w:rPr>
+          <w:b w:val="0"/>
+          <w:color w:val="000000"/>
+          <w:sz w:val="28"/>
+        </w:rPr>
+        <w:t xml:space="preserve"> </w:t>
+      </w:r>
+      <w:r>
+        <w:rPr>
+          <w:i/>
+          <w:color w:val="CC0000"/>
+          <w:sz w:val="22"/>
+        </w:rPr>
+        <w:t>🔴 IKKE bruk krigsforbryter-/nazisympatisør-vinkelen: jeg fant INGEN kilde som støtter at gården ble brukt slik, og uansett er det helt feil tone for et bryllup. Hold deg til chips + Glomma.</w:t>
+      </w:r>
+    </w:p>
+    <w:p>
+      <w:r>
+        <w:rPr>
+          <w:b/>
+          <w:color w:val="000000"/>
+          <w:sz w:val="28"/>
+        </w:rPr>
         <w:t>Alt. 5 – Fetteren med full tilgang</w:t>
       </w:r>
     </w:p>
@@ -3037,6 +3150,32 @@
           <w:color w:val="CC0000"/>
           <w:sz w:val="22"/>
         </w:rPr>
+        <w:t>(varm)</w:t>
+      </w:r>
+      <w:r>
+        <w:rPr>
+          <w:b w:val="0"/>
+          <w:color w:val="000000"/>
+          <w:sz w:val="28"/>
+        </w:rPr>
+        <w:t xml:space="preserve"> Og en liten ting om drikke: </w:t>
+      </w:r>
+      <w:r>
+        <w:rPr>
+          <w:i/>
+          <w:color w:val="CC0000"/>
+          <w:sz w:val="22"/>
+        </w:rPr>
+        <w:t>[fyll inn føringer – hva er inkludert (vin/øl til maten?), når åpner baren, og om det er bong/betaling. Si dette tidlig så folk slipper å lure.]</w:t>
+      </w:r>
+    </w:p>
+    <w:p>
+      <w:r>
+        <w:rPr>
+          <w:i/>
+          <w:color w:val="CC0000"/>
+          <w:sz w:val="22"/>
+        </w:rPr>
         <w:t>(beat)</w:t>
       </w:r>
       <w:r>
@@ -3769,7 +3908,7 @@
           <w:color w:val="CC0000"/>
           <w:sz w:val="22"/>
         </w:rPr>
-        <w:t>[Anders-beskrivelse (din):]</w:t>
+        <w:t>[Anders-beskrivelse (din) + planlegger-humor – flere konkrete eksempler gjør det morsomt.]</w:t>
       </w:r>
     </w:p>
     <w:p>
@@ -3796,6 +3935,90 @@
           <w:sz w:val="28"/>
         </w:rPr>
         <w:t xml:space="preserve"> Men de fleste vil nok først og fremst beskrive deg som smart.</w:t>
+      </w:r>
+    </w:p>
+    <w:p>
+      <w:r>
+        <w:rPr>
+          <w:i/>
+          <w:color w:val="CC0000"/>
+          <w:sz w:val="22"/>
+        </w:rPr>
+        <w:t>(tørr)</w:t>
+      </w:r>
+      <w:r>
+        <w:rPr>
+          <w:b w:val="0"/>
+          <w:color w:val="000000"/>
+          <w:sz w:val="28"/>
+        </w:rPr>
+        <w:t xml:space="preserve"> Og grundig. </w:t>
+      </w:r>
+      <w:r>
+        <w:rPr>
+          <w:i/>
+          <w:color w:val="CC0000"/>
+          <w:sz w:val="22"/>
+        </w:rPr>
+        <w:t>(beat)</w:t>
+      </w:r>
+      <w:r>
+        <w:rPr>
+          <w:b w:val="0"/>
+          <w:color w:val="000000"/>
+          <w:sz w:val="28"/>
+        </w:rPr>
+        <w:t xml:space="preserve"> Anders har planlagt dette bryllupet ned til minste detalj. Han har brukt timer på å velge servietter. </w:t>
+      </w:r>
+      <w:r>
+        <w:rPr>
+          <w:i/>
+          <w:color w:val="CC0000"/>
+          <w:sz w:val="22"/>
+        </w:rPr>
+        <w:t>(beat)</w:t>
+      </w:r>
+      <w:r>
+        <w:rPr>
+          <w:b w:val="0"/>
+          <w:color w:val="000000"/>
+          <w:sz w:val="28"/>
+        </w:rPr>
+        <w:t xml:space="preserve"> Bordplasseringen er optimalisert som et regneark.</w:t>
+      </w:r>
+    </w:p>
+    <w:p>
+      <w:r>
+        <w:rPr>
+          <w:i/>
+          <w:color w:val="CC0000"/>
+          <w:sz w:val="22"/>
+        </w:rPr>
+        <w:t>(beat)</w:t>
+      </w:r>
+      <w:r>
+        <w:rPr>
+          <w:b w:val="0"/>
+          <w:color w:val="000000"/>
+          <w:sz w:val="28"/>
+        </w:rPr>
+        <w:t xml:space="preserve"> Og mannen baker pizzaboller som om det var en del av en forretningsplan. </w:t>
+      </w:r>
+      <w:r>
+        <w:rPr>
+          <w:i/>
+          <w:color w:val="CC0000"/>
+          <w:sz w:val="22"/>
+        </w:rPr>
+        <w:t>(beat)</w:t>
+      </w:r>
+      <w:r>
+        <w:rPr>
+          <w:b w:val="0"/>
+          <w:color w:val="000000"/>
+          <w:sz w:val="28"/>
+        </w:rPr>
+        <w:t xml:space="preserve"> Det er rett og slett ikke måte på hva Anders har bidratt med – på sitt eget bryllup.</w:t>
       </w:r>
     </w:p>
     <w:p>
@@ -3927,6 +4150,58 @@
     <w:p>
       <w:r>
         <w:rPr>
+          <w:i/>
+          <w:color w:val="CC0000"/>
+          <w:sz w:val="22"/>
+        </w:rPr>
+        <w:t>(varm, lett ironisk)</w:t>
+      </w:r>
+      <w:r>
+        <w:rPr>
+          <w:b w:val="0"/>
+          <w:color w:val="000000"/>
+          <w:sz w:val="28"/>
+        </w:rPr>
+        <w:t xml:space="preserve"> Michelle er detaljfokusert og glad i baking, med et øye for det som skal være akkurat riktig. </w:t>
+      </w:r>
+      <w:r>
+        <w:rPr>
+          <w:i/>
+          <w:color w:val="CC0000"/>
+          <w:sz w:val="22"/>
+        </w:rPr>
+        <w:t>(beat)</w:t>
+      </w:r>
+      <w:r>
+        <w:rPr>
+          <w:b w:val="0"/>
+          <w:color w:val="000000"/>
+          <w:sz w:val="28"/>
+        </w:rPr>
+        <w:t xml:space="preserve"> På sett og vis har Anders og Michelle funnet hverandre i detaljene.</w:t>
+      </w:r>
+    </w:p>
+    <w:p>
+      <w:r>
+        <w:rPr>
+          <w:i/>
+          <w:color w:val="CC0000"/>
+          <w:sz w:val="22"/>
+        </w:rPr>
+        <w:t>[HUSK: flett inn 1–2 konkrete poenger/sitater om Michelle fra telefonrunden – sjekk det de andre har sagt (telefonnotater-</w:t>
+      </w:r>
+      <w:r>
+        <w:rPr>
+          <w:b w:val="0"/>
+          <w:color w:val="000000"/>
+          <w:sz w:val="28"/>
+        </w:rPr>
+        <w:t>.md).]*</w:t>
+      </w:r>
+    </w:p>
+    <w:p>
+      <w:r>
+        <w:rPr>
           <w:b w:val="0"/>
           <w:color w:val="000000"/>
           <w:sz w:val="28"/>
@@ -4191,11 +4466,93 @@
     <w:p>
       <w:r>
         <w:rPr>
-          <w:b w:val="0"/>
-          <w:color w:val="000000"/>
-          <w:sz w:val="28"/>
-        </w:rPr>
-        <w:t>Når Bane NOR står fast og noe må fikses – er det én person de ringer.</w:t>
+          <w:i/>
+          <w:color w:val="CC0000"/>
+          <w:sz w:val="22"/>
+        </w:rPr>
+        <w:t>[Bygg «de ringer Erik»-strukturen – eskaler de tre, og la salen svare på den siste. Spiller på Hold the Line / «hold linjen».]</w:t>
+      </w:r>
+    </w:p>
+    <w:p>
+      <w:r>
+        <w:rPr>
+          <w:b w:val="0"/>
+          <w:color w:val="000000"/>
+          <w:sz w:val="28"/>
+        </w:rPr>
+        <w:t>Når Bane NOR står fast og toget må fram – er det én person de ringer.</w:t>
+      </w:r>
+    </w:p>
+    <w:p>
+      <w:r>
+        <w:rPr>
+          <w:i/>
+          <w:color w:val="CC0000"/>
+          <w:sz w:val="22"/>
+        </w:rPr>
+        <w:t>(beat)</w:t>
+      </w:r>
+      <w:r>
+        <w:rPr>
+          <w:b w:val="0"/>
+          <w:color w:val="000000"/>
+          <w:sz w:val="28"/>
+        </w:rPr>
+        <w:t xml:space="preserve"> Når Forsvaret skal trappe opp satsingen på digitalisering og data – er det én person de ringer.</w:t>
+      </w:r>
+    </w:p>
+    <w:p>
+      <w:r>
+        <w:rPr>
+          <w:i/>
+          <w:color w:val="CC0000"/>
+          <w:sz w:val="22"/>
+        </w:rPr>
+        <w:t>(beat)</w:t>
+      </w:r>
+      <w:r>
+        <w:rPr>
+          <w:b w:val="0"/>
+          <w:color w:val="000000"/>
+          <w:sz w:val="28"/>
+        </w:rPr>
+        <w:t xml:space="preserve"> Og når vi i kveld skal ha den aller beste til å snakke for brudgommens foreldre … </w:t>
+      </w:r>
+      <w:r>
+        <w:rPr>
+          <w:i/>
+          <w:color w:val="CC0000"/>
+          <w:sz w:val="22"/>
+        </w:rPr>
+        <w:t>(varm, til salen)</w:t>
+      </w:r>
+      <w:r>
+        <w:rPr>
+          <w:b w:val="0"/>
+          <w:color w:val="000000"/>
+          <w:sz w:val="28"/>
+        </w:rPr>
+        <w:t xml:space="preserve"> hvem ringer vi da?</w:t>
+      </w:r>
+    </w:p>
+    <w:p>
+      <w:r>
+        <w:rPr>
+          <w:i/>
+          <w:color w:val="CC0000"/>
+          <w:sz w:val="22"/>
+        </w:rPr>
+        <w:t>(2 sek – la salen svare)</w:t>
+      </w:r>
+    </w:p>
+    <w:p>
+      <w:r>
+        <w:rPr>
+          <w:b/>
+          <w:color w:val="000000"/>
+          <w:sz w:val="28"/>
+        </w:rPr>
+        <w:t>Erik Nilsen!</w:t>
       </w:r>
     </w:p>
     <w:p>
@@ -6934,21 +7291,209 @@
     <w:p>
       <w:r>
         <w:rPr>
-          <w:b w:val="0"/>
-          <w:color w:val="000000"/>
-          <w:sz w:val="28"/>
-        </w:rPr>
-        <w:t>To brødre. Én familiebil. Én sportsbil. Spørsmålet er hvem som er hvem.</w:t>
-      </w:r>
-    </w:p>
-    <w:p>
-      <w:r>
-        <w:rPr>
-          <w:b w:val="0"/>
-          <w:color w:val="000000"/>
-          <w:sz w:val="28"/>
-        </w:rPr>
-        <w:t>Svaret er ikke det du tror.</w:t>
+          <w:i/>
+          <w:color w:val="CC0000"/>
+          <w:sz w:val="22"/>
+        </w:rPr>
+        <w:t>[Ingrid først – varm og ekte.]</w:t>
+      </w:r>
+    </w:p>
+    <w:p>
+      <w:r>
+        <w:rPr>
+          <w:b w:val="0"/>
+          <w:color w:val="000000"/>
+          <w:sz w:val="28"/>
+        </w:rPr>
+        <w:t xml:space="preserve">Ingrid har akkurat lagt russetiden bak seg – og har faktisk prioritert å bruke helga på dette bryllupet, framfor det de fleste attenåringer ville valgt. </w:t>
+      </w:r>
+      <w:r>
+        <w:rPr>
+          <w:i/>
+          <w:color w:val="CC0000"/>
+          <w:sz w:val="22"/>
+        </w:rPr>
+        <w:t>(varm)</w:t>
+      </w:r>
+      <w:r>
+        <w:rPr>
+          <w:b w:val="0"/>
+          <w:color w:val="000000"/>
+          <w:sz w:val="28"/>
+        </w:rPr>
+        <w:t xml:space="preserve"> Det settes det stor pris på.</w:t>
+      </w:r>
+    </w:p>
+    <w:p>
+      <w:r>
+        <w:rPr>
+          <w:i/>
+          <w:color w:val="CC0000"/>
+          <w:sz w:val="22"/>
+        </w:rPr>
+        <w:t>[Ola – eskalerende, ironisk CV. Helt seriøst ansikt, bygg større og større.]</w:t>
+      </w:r>
+    </w:p>
+    <w:p>
+      <w:r>
+        <w:rPr>
+          <w:b w:val="0"/>
+          <w:color w:val="000000"/>
+          <w:sz w:val="28"/>
+        </w:rPr>
+        <w:t>Ola har reist helt fra Bergen for å være her – og det er en mann med en viss fartstid.</w:t>
+      </w:r>
+    </w:p>
+    <w:p>
+      <w:r>
+        <w:rPr>
+          <w:i/>
+          <w:color w:val="CC0000"/>
+          <w:sz w:val="22"/>
+        </w:rPr>
+        <w:t>(tørr, bygg)</w:t>
+      </w:r>
+      <w:r>
+        <w:rPr>
+          <w:b w:val="0"/>
+          <w:color w:val="000000"/>
+          <w:sz w:val="28"/>
+        </w:rPr>
+        <w:t xml:space="preserve"> Tidligere en av Norges beste fotballspillere. </w:t>
+      </w:r>
+      <w:r>
+        <w:rPr>
+          <w:i/>
+          <w:color w:val="CC0000"/>
+          <w:sz w:val="22"/>
+        </w:rPr>
+        <w:t>(beat)</w:t>
+      </w:r>
+      <w:r>
+        <w:rPr>
+          <w:b w:val="0"/>
+          <w:color w:val="000000"/>
+          <w:sz w:val="28"/>
+        </w:rPr>
+        <w:t xml:space="preserve"> Deretter damemagnet uten sidestykke. </w:t>
+      </w:r>
+      <w:r>
+        <w:rPr>
+          <w:i/>
+          <w:color w:val="CC0000"/>
+          <w:sz w:val="22"/>
+        </w:rPr>
+        <w:t>(beat)</w:t>
+      </w:r>
+      <w:r>
+        <w:rPr>
+          <w:b w:val="0"/>
+          <w:color w:val="000000"/>
+          <w:sz w:val="28"/>
+        </w:rPr>
+        <w:t xml:space="preserve"> Så bar det til Ås – sentral i Samfunnet, og økonomisjef med et av de største vervene på huset.</w:t>
+      </w:r>
+    </w:p>
+    <w:p>
+      <w:r>
+        <w:rPr>
+          <w:i/>
+          <w:color w:val="CC0000"/>
+          <w:sz w:val="22"/>
+        </w:rPr>
+        <w:t>(beat)</w:t>
+      </w:r>
+      <w:r>
+        <w:rPr>
+          <w:b w:val="0"/>
+          <w:color w:val="000000"/>
+          <w:sz w:val="28"/>
+        </w:rPr>
+        <w:t xml:space="preserve"> Så valgte han down under – Australia. </w:t>
+      </w:r>
+      <w:r>
+        <w:rPr>
+          <w:i/>
+          <w:color w:val="CC0000"/>
+          <w:sz w:val="22"/>
+        </w:rPr>
+        <w:t>(beat)</w:t>
+      </w:r>
+      <w:r>
+        <w:rPr>
+          <w:b w:val="0"/>
+          <w:color w:val="000000"/>
+          <w:sz w:val="28"/>
+        </w:rPr>
+        <w:t xml:space="preserve"> Så NHH i Bergen. </w:t>
+      </w:r>
+      <w:r>
+        <w:rPr>
+          <w:i/>
+          <w:color w:val="CC0000"/>
+          <w:sz w:val="22"/>
+        </w:rPr>
+        <w:t>(beat)</w:t>
+      </w:r>
+      <w:r>
+        <w:rPr>
+          <w:b w:val="0"/>
+          <w:color w:val="000000"/>
+          <w:sz w:val="28"/>
+        </w:rPr>
+        <w:t xml:space="preserve"> Og nå går ryktene om utveksling til en av Europas aller beste tekniske skoler.</w:t>
+      </w:r>
+    </w:p>
+    <w:p>
+      <w:r>
+        <w:rPr>
+          <w:i/>
+          <w:color w:val="CC0000"/>
+          <w:sz w:val="22"/>
+        </w:rPr>
+        <w:t>(varm, smil)</w:t>
+      </w:r>
+      <w:r>
+        <w:rPr>
+          <w:b w:val="0"/>
+          <w:color w:val="000000"/>
+          <w:sz w:val="28"/>
+        </w:rPr>
+        <w:t xml:space="preserve"> Dette er en «upcoming» stor mann. Følg med på Ola.</w:t>
+      </w:r>
+    </w:p>
+    <w:p>
+      <w:r>
+        <w:rPr>
+          <w:i/>
+          <w:color w:val="CC0000"/>
+          <w:sz w:val="22"/>
+        </w:rPr>
+        <w:t>(beat)</w:t>
+      </w:r>
+      <w:r>
+        <w:rPr>
+          <w:b w:val="0"/>
+          <w:color w:val="000000"/>
+          <w:sz w:val="28"/>
+        </w:rPr>
+        <w:t xml:space="preserve"> To brødre. Én familiebil. Én sportsbil. Spørsmålet er hvem som er hvem. </w:t>
+      </w:r>
+      <w:r>
+        <w:rPr>
+          <w:i/>
+          <w:color w:val="CC0000"/>
+          <w:sz w:val="22"/>
+        </w:rPr>
+        <w:t>(beat)</w:t>
+      </w:r>
+      <w:r>
+        <w:rPr>
+          <w:b w:val="0"/>
+          <w:color w:val="000000"/>
+          <w:sz w:val="28"/>
+        </w:rPr>
+        <w:t xml:space="preserve"> Svaret er ikke det du tror.</w:t>
       </w:r>
     </w:p>
     <w:p>

</xml_diff>

<commit_message>
Sluttfør Michelle-åpning + synk tidsplan med ny rekkefølge
- Michelle-introen ferdigstilt (tante Kjersti-sitatet lander, ingen
  uferdig-markør, baking/detalj + telefonrunde-HUSK beholdt).
- tidsplan.md synket: FF-jentene presenterer maten rett etter Werner,
  første servering (forrett) åpnes umiddelbart etter, Helan går +
  Fireball 1 flyttet til etter forretten. Fireball-kadens (én runde
  etter hver servering) dokumentert. Oppdatert topp-note, oppsummert
  tidsbudsjett og buffet-mekanikk-tabell.

Co-Authored-By: Claude Opus 4.8 <noreply@anthropic.com>
Claude-Session: https://claude.ai/code/session_01HH3S616y2naKXPCG25iHhw
</commit_message>
<xml_diff>
--- a/manus.docx
+++ b/manus.docx
@@ -4086,65 +4086,47 @@
     <w:p>
       <w:r>
         <w:rPr>
+          <w:b w:val="0"/>
+          <w:color w:val="000000"/>
+          <w:sz w:val="28"/>
+        </w:rPr>
+        <w:t>Jeg ringte rundt i forkant, og særlig én kommentar ble hengende igjen – fra tanta mi Kjersti, Michelles svigermor:</w:t>
+      </w:r>
+    </w:p>
+    <w:p>
+      <w:r>
+        <w:rPr>
           <w:i/>
           <w:color w:val="CC0000"/>
           <w:sz w:val="22"/>
         </w:rPr>
-        <w:t>[Utkast – ny åpning (uferdig, fyll inn slutten):]</w:t>
-      </w:r>
-      <w:r>
-        <w:rPr>
-          <w:b w:val="0"/>
-          <w:color w:val="000000"/>
-          <w:sz w:val="28"/>
-        </w:rPr>
-        <w:t xml:space="preserve"> Jeg ringte rundt til flere og fikk særlig høre en hyggelig kommentar fra tanta mi Kjersti – Michelles svigermor: «hu var da ei veldig søt jinta, hu jinta hu dærre Michelle.» </w:t>
-      </w:r>
+        <w:t>(varm)</w:t>
+      </w:r>
+      <w:r>
+        <w:rPr>
+          <w:b w:val="0"/>
+          <w:color w:val="000000"/>
+          <w:sz w:val="28"/>
+        </w:rPr>
+        <w:t xml:space="preserve"> «Hu var da ei veldig søt jinta, hu jinta hu dærre Michelle.»</w:t>
+      </w:r>
+    </w:p>
+    <w:p>
       <w:r>
         <w:rPr>
           <w:i/>
           <w:color w:val="CC0000"/>
           <w:sz w:val="22"/>
         </w:rPr>
-        <w:t>(varm)</w:t>
-      </w:r>
-      <w:r>
-        <w:rPr>
-          <w:b w:val="0"/>
-          <w:color w:val="000000"/>
-          <w:sz w:val="28"/>
-        </w:rPr>
-        <w:t xml:space="preserve"> Michelle, du er …</w:t>
-      </w:r>
-    </w:p>
-    <w:p>
-      <w:r>
-        <w:rPr>
-          <w:b w:val="0"/>
-          <w:color w:val="000000"/>
-          <w:sz w:val="28"/>
-        </w:rPr>
-        <w:t>Anders har akkurat fortalt oss hvem Michelle er for ham.</w:t>
-      </w:r>
-    </w:p>
-    <w:p>
-      <w:r>
-        <w:rPr>
-          <w:b w:val="0"/>
-          <w:color w:val="000000"/>
-          <w:sz w:val="28"/>
-        </w:rPr>
-        <w:t>Det er sjelden vi får høre brudens egne ord så tidlig i et bryllup.</w:t>
-      </w:r>
-    </w:p>
-    <w:p>
-      <w:r>
-        <w:rPr>
-          <w:b w:val="0"/>
-          <w:color w:val="000000"/>
-          <w:sz w:val="28"/>
-        </w:rPr>
-        <w:t>I kveld får vi.</w:t>
+        <w:t>(beat)</w:t>
+      </w:r>
+      <w:r>
+        <w:rPr>
+          <w:b w:val="0"/>
+          <w:color w:val="000000"/>
+          <w:sz w:val="28"/>
+        </w:rPr>
+        <w:t xml:space="preserve"> Og der har hun helt rett. Men Michelle er mye mer enn som så.</w:t>
       </w:r>
     </w:p>
     <w:p>
@@ -4162,7 +4144,7 @@
           <w:color w:val="000000"/>
           <w:sz w:val="28"/>
         </w:rPr>
-        <w:t xml:space="preserve"> Michelle er detaljfokusert og glad i baking, med et øye for det som skal være akkurat riktig. </w:t>
+        <w:t xml:space="preserve"> Detaljfokusert, glad i baking, med et øye for det som skal være akkurat riktig. </w:t>
       </w:r>
       <w:r>
         <w:rPr>
@@ -4178,7 +4160,7 @@
           <w:color w:val="000000"/>
           <w:sz w:val="28"/>
         </w:rPr>
-        <w:t xml:space="preserve"> På sett og vis har Anders og Michelle funnet hverandre i detaljene.</w:t>
+        <w:t xml:space="preserve"> På sett og vis har hun og Anders funnet hverandre i detaljene.</w:t>
       </w:r>
     </w:p>
     <w:p>
@@ -4188,7 +4170,7 @@
           <w:color w:val="CC0000"/>
           <w:sz w:val="22"/>
         </w:rPr>
-        <w:t>[HUSK: flett inn 1–2 konkrete poenger/sitater om Michelle fra telefonrunden – sjekk det de andre har sagt (telefonnotater-</w:t>
+        <w:t>[HUSK: flett gjerne inn 1–2 konkrete poenger/sitater om Michelle fra telefonrunden (telefonnotater-</w:t>
       </w:r>
       <w:r>
         <w:rPr>
@@ -4197,6 +4179,42 @@
           <w:sz w:val="28"/>
         </w:rPr>
         <w:t>.md).]*</w:t>
+      </w:r>
+    </w:p>
+    <w:p>
+      <w:r>
+        <w:rPr>
+          <w:i/>
+          <w:color w:val="CC0000"/>
+          <w:sz w:val="22"/>
+        </w:rPr>
+        <w:t>(myk)</w:t>
+      </w:r>
+      <w:r>
+        <w:rPr>
+          <w:b w:val="0"/>
+          <w:color w:val="000000"/>
+          <w:sz w:val="28"/>
+        </w:rPr>
+        <w:t xml:space="preserve"> Anders har nettopp fortalt oss hvem Michelle er for ham – og det er sjelden vi får høre brudens egne ord så tidlig i et bryllup.</w:t>
+      </w:r>
+    </w:p>
+    <w:p>
+      <w:r>
+        <w:rPr>
+          <w:i/>
+          <w:color w:val="CC0000"/>
+          <w:sz w:val="22"/>
+        </w:rPr>
+        <w:t>(beat)</w:t>
+      </w:r>
+      <w:r>
+        <w:rPr>
+          <w:b w:val="0"/>
+          <w:color w:val="000000"/>
+          <w:sz w:val="28"/>
+        </w:rPr>
+        <w:t xml:space="preserve"> I kveld får vi.</w:t>
       </w:r>
     </w:p>
     <w:p>

</xml_diff>

<commit_message>
Stikk 2: korriger anekdoten til den ekte historien + fyll inn drikke
- §E: drikke-føringer inn (bar åpen hele kvelden, vin på bordene, øl
  rundt, si fra til servitørene for annet).
- Stikk 2 (kveldens hjerte) rettet til faktisk forløp: Anders var mest
  interessert og ba om avstand; sommer uten kontakt; Even la ut bilde av
  Anders med en annen jente; MICHELLE så det, ble sjalu, skjønte hvor glad
  hun var, sendte melding dagen etter -> snakket hver dag. Landing og
  «hvem forstod når» rettet. Plassholder for Stikk 2-anekdote krysset av
  (med NB om at A1 «samme sykehus/dåp/konfirmasjon» ikke er bekreftet).

Co-Authored-By: Claude Opus 4.8 <noreply@anthropic.com>
Claude-Session: https://claude.ai/code/session_01HH3S616y2naKXPCG25iHhw
</commit_message>
<xml_diff>
--- a/manus.docx
+++ b/manus.docx
@@ -3158,15 +3158,23 @@
           <w:color w:val="000000"/>
           <w:sz w:val="28"/>
         </w:rPr>
-        <w:t xml:space="preserve"> Og en liten ting om drikke: </w:t>
-      </w:r>
-      <w:r>
-        <w:rPr>
-          <w:i/>
-          <w:color w:val="CC0000"/>
-          <w:sz w:val="22"/>
-        </w:rPr>
-        <w:t>[fyll inn føringer – hva er inkludert (vin/øl til maten?), når åpner baren, og om det er bong/betaling. Si dette tidlig så folk slipper å lure.]</w:t>
+        <w:t xml:space="preserve"> Og en liten ting om drikke: baren er åpen hele kvelden. Det står vin på bordene og øl rundt omkring – og vil dere ha noe annet, er det bare å si fra til servitørene. </w:t>
+      </w:r>
+      <w:r>
+        <w:rPr>
+          <w:i/>
+          <w:color w:val="CC0000"/>
+          <w:sz w:val="22"/>
+        </w:rPr>
+        <w:t>(beat)</w:t>
+      </w:r>
+      <w:r>
+        <w:rPr>
+          <w:b w:val="0"/>
+          <w:color w:val="000000"/>
+          <w:sz w:val="28"/>
+        </w:rPr>
+        <w:t xml:space="preserve"> Kort sagt: ingen skal gå tørste i kveld.</w:t>
       </w:r>
     </w:p>
     <w:p>
@@ -5791,10 +5799,8 @@
           <w:color w:val="000000"/>
           <w:sz w:val="28"/>
         </w:rPr>
-        <w:t>Sommeren 2015 «gadd ikke Anders mer». Det var hans formulering.</w:t>
-      </w:r>
-    </w:p>
-    <w:p>
+        <w:t xml:space="preserve">Anders hadde vært interessert lenge. </w:t>
+      </w:r>
       <w:r>
         <w:rPr>
           <w:i/>
@@ -5803,15 +5809,13 @@
         </w:rPr>
         <w:t>(beat)</w:t>
       </w:r>
-    </w:p>
-    <w:p>
-      <w:r>
-        <w:rPr>
-          <w:b w:val="0"/>
-          <w:color w:val="000000"/>
-          <w:sz w:val="28"/>
-        </w:rPr>
-        <w:t>Tre, fire uker uten dialog.</w:t>
+      <w:r>
+        <w:rPr>
+          <w:b w:val="0"/>
+          <w:color w:val="000000"/>
+          <w:sz w:val="28"/>
+        </w:rPr>
+        <w:t xml:space="preserve"> Mer enn Michelle.</w:t>
       </w:r>
     </w:p>
     <w:p>
@@ -5831,6 +5835,98 @@
           <w:color w:val="000000"/>
           <w:sz w:val="28"/>
         </w:rPr>
+        <w:t xml:space="preserve">Og til slutt sa han det rett ut: hvis dette ikke skulle bli noe, kunne de ikke henge så mye – </w:t>
+      </w:r>
+      <w:r>
+        <w:rPr>
+          <w:i/>
+          <w:color w:val="CC0000"/>
+          <w:sz w:val="22"/>
+        </w:rPr>
+        <w:t>(beat)</w:t>
+      </w:r>
+      <w:r>
+        <w:rPr>
+          <w:b w:val="0"/>
+          <w:color w:val="000000"/>
+          <w:sz w:val="28"/>
+        </w:rPr>
+        <w:t xml:space="preserve"> «jeg har følelser for deg, og da må jeg få litt avstand, så jeg kommer meg over deg.»</w:t>
+      </w:r>
+    </w:p>
+    <w:p>
+      <w:r>
+        <w:rPr>
+          <w:i/>
+          <w:color w:val="CC0000"/>
+          <w:sz w:val="22"/>
+        </w:rPr>
+        <w:t>(beat)</w:t>
+      </w:r>
+    </w:p>
+    <w:p>
+      <w:r>
+        <w:rPr>
+          <w:b w:val="0"/>
+          <w:color w:val="000000"/>
+          <w:sz w:val="28"/>
+        </w:rPr>
+        <w:t>Så de tok avstand.</w:t>
+      </w:r>
+    </w:p>
+    <w:p>
+      <w:r>
+        <w:rPr>
+          <w:i/>
+          <w:color w:val="CC0000"/>
+          <w:sz w:val="22"/>
+        </w:rPr>
+        <w:t>(beat)</w:t>
+      </w:r>
+    </w:p>
+    <w:p>
+      <w:r>
+        <w:rPr>
+          <w:b w:val="0"/>
+          <w:color w:val="000000"/>
+          <w:sz w:val="28"/>
+        </w:rPr>
+        <w:t xml:space="preserve">Fem, seks uker uten et ord. </w:t>
+      </w:r>
+      <w:r>
+        <w:rPr>
+          <w:i/>
+          <w:color w:val="CC0000"/>
+          <w:sz w:val="22"/>
+        </w:rPr>
+        <w:t>(beat)</w:t>
+      </w:r>
+      <w:r>
+        <w:rPr>
+          <w:b w:val="0"/>
+          <w:color w:val="000000"/>
+          <w:sz w:val="28"/>
+        </w:rPr>
+        <w:t xml:space="preserve"> En hel sommerferie.</w:t>
+      </w:r>
+    </w:p>
+    <w:p>
+      <w:r>
+        <w:rPr>
+          <w:i/>
+          <w:color w:val="CC0000"/>
+          <w:sz w:val="22"/>
+        </w:rPr>
+        <w:t>(beat)</w:t>
+      </w:r>
+    </w:p>
+    <w:p>
+      <w:r>
+        <w:rPr>
+          <w:b w:val="0"/>
+          <w:color w:val="000000"/>
+          <w:sz w:val="28"/>
+        </w:rPr>
         <w:t>Stille.</w:t>
       </w:r>
     </w:p>
@@ -5859,7 +5955,7 @@
           <w:color w:val="000000"/>
           <w:sz w:val="28"/>
         </w:rPr>
-        <w:t xml:space="preserve"> Slutt.</w:t>
+        <w:t xml:space="preserve"> Slutt – trodde vi.</w:t>
       </w:r>
     </w:p>
     <w:p>
@@ -6033,7 +6129,7 @@
           <w:color w:val="000000"/>
           <w:sz w:val="28"/>
         </w:rPr>
-        <w:t xml:space="preserve"> Jeg er fetteren hans. Jeg så det fra utsiden. Jeg så at han trakk seg unna. Og jeg trodde at det betydde at det var slutt.</w:t>
+        <w:t xml:space="preserve"> Jeg er fetteren hans. Jeg så det fra utsiden. Jeg så at Anders var helt borte i henne – og at Michelle ikke var helt der ennå.</w:t>
       </w:r>
     </w:p>
     <w:p>
@@ -6053,7 +6149,7 @@
           <w:color w:val="000000"/>
           <w:sz w:val="28"/>
         </w:rPr>
-        <w:t>I familien begynte vi å snakke om det. Hvis Anders ikke gadd – så fortjente kanskje ikke Anders henne.</w:t>
+        <w:t>I familien begynte vi å snakke om det. Hvis hun ikke var sikker, burde kanskje Anders spare seg selv.</w:t>
       </w:r>
     </w:p>
     <w:p>
@@ -6083,7 +6179,7 @@
           <w:color w:val="000000"/>
           <w:sz w:val="28"/>
         </w:rPr>
-        <w:t>Jeg sa det høyt.</w:t>
+        <w:t>Jeg sa det høyt: gi deg, gutt – hun er ikke interessert.</w:t>
       </w:r>
     </w:p>
     <w:p>
@@ -6161,7 +6257,7 @@
           <w:color w:val="000000"/>
           <w:sz w:val="28"/>
         </w:rPr>
-        <w:t>Anders så et bilde på Instagram.</w:t>
+        <w:t>Even – Anders' forlover – la ut et bilde på storyen sin.</w:t>
       </w:r>
     </w:p>
     <w:p>
@@ -6181,20 +6277,8 @@
           <w:color w:val="000000"/>
           <w:sz w:val="28"/>
         </w:rPr>
-        <w:t>Even – forloveren hans – sto med noen jenter.</w:t>
-      </w:r>
-    </w:p>
-    <w:p>
-      <w:r>
-        <w:rPr>
-          <w:b w:val="0"/>
-          <w:color w:val="000000"/>
-          <w:sz w:val="28"/>
-        </w:rPr>
-        <w:t>Anders så på bildet.</w:t>
-      </w:r>
-    </w:p>
-    <w:p>
+        <w:t xml:space="preserve">Anders. På en fest. I en sofa. </w:t>
+      </w:r>
       <w:r>
         <w:rPr>
           <w:i/>
@@ -6203,15 +6287,13 @@
         </w:rPr>
         <w:t>(beat)</w:t>
       </w:r>
-    </w:p>
-    <w:p>
-      <w:r>
-        <w:rPr>
-          <w:b w:val="0"/>
-          <w:color w:val="000000"/>
-          <w:sz w:val="28"/>
-        </w:rPr>
-        <w:t>Og spurte seg selv:</w:t>
+      <w:r>
+        <w:rPr>
+          <w:b w:val="0"/>
+          <w:color w:val="000000"/>
+          <w:sz w:val="28"/>
+        </w:rPr>
+        <w:t xml:space="preserve"> Med en annen jente.</w:t>
       </w:r>
     </w:p>
     <w:p>
@@ -6225,26 +6307,51 @@
       </w:r>
     </w:p>
     <w:p>
-      <w:pPr>
-        <w:ind w:left="283"/>
-      </w:pPr>
-      <w:r>
-        <w:rPr>
-          <w:b w:val="0"/>
-          <w:color w:val="000000"/>
-          <w:sz w:val="28"/>
-        </w:rPr>
-        <w:t>«Hvem faen er denne jenta?»</w:t>
-      </w:r>
-    </w:p>
-    <w:p>
-      <w:r>
-        <w:rPr>
-          <w:i/>
-          <w:color w:val="CC0000"/>
-          <w:sz w:val="22"/>
-        </w:rPr>
-        <w:t>(beat – la latter komme)</w:t>
+      <w:r>
+        <w:rPr>
+          <w:i/>
+          <w:color w:val="CC0000"/>
+          <w:sz w:val="22"/>
+        </w:rPr>
+        <w:t>(myk)</w:t>
+      </w:r>
+      <w:r>
+        <w:rPr>
+          <w:b w:val="0"/>
+          <w:color w:val="000000"/>
+          <w:sz w:val="28"/>
+        </w:rPr>
+        <w:t xml:space="preserve"> Og det var ikke Anders som så det bildet.</w:t>
+      </w:r>
+    </w:p>
+    <w:p>
+      <w:r>
+        <w:rPr>
+          <w:i/>
+          <w:color w:val="CC0000"/>
+          <w:sz w:val="22"/>
+        </w:rPr>
+        <w:t>(beat)</w:t>
+      </w:r>
+    </w:p>
+    <w:p>
+      <w:r>
+        <w:rPr>
+          <w:b w:val="0"/>
+          <w:color w:val="000000"/>
+          <w:sz w:val="28"/>
+        </w:rPr>
+        <w:t>Det var Michelle.</w:t>
+      </w:r>
+    </w:p>
+    <w:p>
+      <w:r>
+        <w:rPr>
+          <w:i/>
+          <w:color w:val="CC0000"/>
+          <w:sz w:val="22"/>
+        </w:rPr>
+        <w:t>(LAND – 3 sek)</w:t>
       </w:r>
     </w:p>
     <w:p>
@@ -6262,17 +6369,43 @@
           <w:color w:val="000000"/>
           <w:sz w:val="28"/>
         </w:rPr>
-        <w:t xml:space="preserve"> Det var ikke Even som var problemet.</w:t>
-      </w:r>
-    </w:p>
-    <w:p>
-      <w:r>
-        <w:rPr>
-          <w:b w:val="0"/>
-          <w:color w:val="000000"/>
-          <w:sz w:val="28"/>
-        </w:rPr>
-        <w:t>Det var én jente på bildet som ikke var Michelle.</w:t>
+        <w:t xml:space="preserve"> I det øyeblikket – da hun så ham sitte der med en annen – skjønte Michelle noe hun ikke helt hadde innrømmet for seg selv:</w:t>
+      </w:r>
+    </w:p>
+    <w:p>
+      <w:r>
+        <w:rPr>
+          <w:i/>
+          <w:color w:val="CC0000"/>
+          <w:sz w:val="22"/>
+        </w:rPr>
+        <w:t>(beat)</w:t>
+      </w:r>
+    </w:p>
+    <w:p>
+      <w:r>
+        <w:rPr>
+          <w:b w:val="0"/>
+          <w:color w:val="000000"/>
+          <w:sz w:val="28"/>
+        </w:rPr>
+        <w:t xml:space="preserve">At hun var mye mer glad i ham enn hun trodde. </w:t>
+      </w:r>
+      <w:r>
+        <w:rPr>
+          <w:i/>
+          <w:color w:val="CC0000"/>
+          <w:sz w:val="22"/>
+        </w:rPr>
+        <w:t>(beat)</w:t>
+      </w:r>
+      <w:r>
+        <w:rPr>
+          <w:b w:val="0"/>
+          <w:color w:val="000000"/>
+          <w:sz w:val="28"/>
+        </w:rPr>
+        <w:t xml:space="preserve"> At hun ikke ante hvor avhengig hun egentlig var.</w:t>
       </w:r>
     </w:p>
     <w:p>
@@ -6288,21 +6421,11 @@
     <w:p>
       <w:r>
         <w:rPr>
-          <w:i/>
-          <w:color w:val="CC0000"/>
-          <w:sz w:val="22"/>
-        </w:rPr>
-        <w:t>(myk)</w:t>
-      </w:r>
-    </w:p>
-    <w:p>
-      <w:r>
-        <w:rPr>
-          <w:b w:val="0"/>
-          <w:color w:val="000000"/>
-          <w:sz w:val="28"/>
-        </w:rPr>
-        <w:t>I det øyeblikket forstod Anders at det var én han ville se på Even-bilder i fremtiden.</w:t>
+          <w:b w:val="0"/>
+          <w:color w:val="000000"/>
+          <w:sz w:val="28"/>
+        </w:rPr>
+        <w:t>Dagen etter sendte hun en melding.</w:t>
       </w:r>
     </w:p>
     <w:p>
@@ -6322,7 +6445,23 @@
           <w:color w:val="000000"/>
           <w:sz w:val="28"/>
         </w:rPr>
-        <w:t>Og det var Michelle.</w:t>
+        <w:t xml:space="preserve">Og etter det snakket de sammen </w:t>
+      </w:r>
+      <w:r>
+        <w:rPr>
+          <w:i/>
+          <w:color w:val="CC0000"/>
+          <w:sz w:val="22"/>
+        </w:rPr>
+        <w:t>(beat)</w:t>
+      </w:r>
+      <w:r>
+        <w:rPr>
+          <w:b w:val="0"/>
+          <w:color w:val="000000"/>
+          <w:sz w:val="28"/>
+        </w:rPr>
+        <w:t xml:space="preserve"> hver eneste dag.</w:t>
       </w:r>
     </w:p>
     <w:p>
@@ -6666,7 +6805,7 @@
           <w:color w:val="000000"/>
           <w:sz w:val="28"/>
         </w:rPr>
-        <w:t>Anders forstod det i 2015.</w:t>
+        <w:t>Anders hadde forstått det for lengst.</w:t>
       </w:r>
     </w:p>
     <w:p>
@@ -6686,7 +6825,7 @@
           <w:color w:val="000000"/>
           <w:sz w:val="28"/>
         </w:rPr>
-        <w:t>Michelle forstod det rundt julaften.</w:t>
+        <w:t>Michelle forstod det sommeren 2015 – da hun så det bildet.</w:t>
       </w:r>
     </w:p>
     <w:p>
@@ -9665,7 +9804,7 @@
           <w:color w:val="000000"/>
           <w:sz w:val="28"/>
         </w:rPr>
-        <w:t xml:space="preserve">☐ </w:t>
+        <w:t xml:space="preserve">✔ </w:t>
       </w:r>
       <w:r>
         <w:rPr>
@@ -9681,7 +9820,17 @@
           <w:color w:val="000000"/>
           <w:sz w:val="28"/>
         </w:rPr>
-        <w:t xml:space="preserve"> (A1 + B + A2 + landing, 4 deler)</w:t>
+        <w:t xml:space="preserve"> – ekte historie inn (Anders var mest interessert</w:t>
+      </w:r>
+    </w:p>
+    <w:p>
+      <w:r>
+        <w:rPr>
+          <w:b w:val="0"/>
+          <w:color w:val="000000"/>
+          <w:sz w:val="28"/>
+        </w:rPr>
+        <w:t>→ ba om avstand → sommer uten kontakt → Even la ut bilde av Anders med annen jente → Michelle ble sjalu/skjønte følelsene → sendte melding dagen etter → snakket hver dag). NB: A1 «født samme sykehus / døpt / konfirmert samme dag» er IKKE bekreftet av deg – sjekk om det stemmer eller skal kuttes.</w:t>
       </w:r>
     </w:p>
     <w:p>

</xml_diff>

<commit_message>
Rolle-annonsering i hver intro + Maarud-råversjon + Ola-detaljer
- Hver intro har nå tydelig rolle i hand-off: brudens far (Werner),
  brudgommen (Anders), brudgommens foreldre (Kjersti+Erik), brudens/
  brudgommens forlover (Helene/Even), brudens storesøstre (Cathrine+
  Anette), brudgommens søsken (Ingrid+Ola), brudens barndomsvenner
  (Kongsvinger), brudens Ås-gjeng (Feminin og fornem), brudgommens
  Ås-gjeng (Broderskapet), brudgommens gode venn (Tom Christian).
- Maarud: lagt inn brukerens råversjon (1936 + krig/region) som tydelig
  merket UTKAST med sterk advarsel (uverifisert + tung tone).
- Ola-CV utvidet med «Juicy»-gjengen + flagget uklart ledd fra opptaket.

Co-Authored-By: Claude Opus 4.8 <noreply@anthropic.com>
Claude-Session: https://claude.ai/code/session_01HH3S616y2naKXPCG25iHhw
</commit_message>
<xml_diff>
--- a/manus.docx
+++ b/manus.docx
@@ -1995,23 +1995,72 @@
           <w:color w:val="CC0000"/>
           <w:sz w:val="22"/>
         </w:rPr>
-        <w:t>Verifisert (potetgull fra 1936, Stang/USA-tur – kilde: Wikipedia/maarudgaard.no). For mer lokalfarge: mild bygdehumor (gjedde i Glomma, tjuvjakt) funker.</w:t>
-      </w:r>
-      <w:r>
-        <w:rPr>
-          <w:b w:val="0"/>
-          <w:color w:val="000000"/>
-          <w:sz w:val="28"/>
-        </w:rPr>
-        <w:t xml:space="preserve"> </w:t>
-      </w:r>
-      <w:r>
-        <w:rPr>
-          <w:i/>
-          <w:color w:val="CC0000"/>
-          <w:sz w:val="22"/>
-        </w:rPr>
-        <w:t>🔴 IKKE bruk krigsforbryter-/nazisympatisør-vinkelen: jeg fant INGEN kilde som støtter at gården ble brukt slik, og uansett er det helt feil tone for et bryllup. Hold deg til chips + Glomma.</w:t>
+        <w:t>Verifisert (potetgull fra 1936, Stang/USA-tur – kilde: Wikipedia/maarudgaard.no).</w:t>
+      </w:r>
+    </w:p>
+    <w:p>
+      <w:r>
+        <w:rPr>
+          <w:b/>
+          <w:color w:val="000000"/>
+          <w:sz w:val="28"/>
+        </w:rPr>
+        <w:t>Maarud-historie – din råversjon (UTKAST, ikke verifisert – les advarsel):</w:t>
+      </w:r>
+    </w:p>
+    <w:p>
+      <w:pPr>
+        <w:ind w:left="283"/>
+      </w:pPr>
+      <w:r>
+        <w:rPr>
+          <w:b w:val="0"/>
+          <w:color w:val="000000"/>
+          <w:sz w:val="28"/>
+        </w:rPr>
+        <w:t xml:space="preserve">«Gården ble stiftet i 1936. Så gikk det tre-fire år, og så kom krigen. </w:t>
+      </w:r>
+      <w:r>
+        <w:rPr>
+          <w:i/>
+          <w:color w:val="CC0000"/>
+          <w:sz w:val="22"/>
+        </w:rPr>
+        <w:t>(beat)</w:t>
+      </w:r>
+      <w:r>
+        <w:rPr>
+          <w:b w:val="0"/>
+          <w:color w:val="000000"/>
+          <w:sz w:val="28"/>
+        </w:rPr>
+        <w:t xml:space="preserve"> Etter den ble gården brukt i et oppgjør med krigsforbrytelser. </w:t>
+      </w:r>
+      <w:r>
+        <w:rPr>
+          <w:i/>
+          <w:color w:val="CC0000"/>
+          <w:sz w:val="22"/>
+        </w:rPr>
+        <w:t>(beat)</w:t>
+      </w:r>
+      <w:r>
+        <w:rPr>
+          <w:b w:val="0"/>
+          <w:color w:val="000000"/>
+          <w:sz w:val="28"/>
+        </w:rPr>
+        <w:t xml:space="preserve"> Og regionen her har jo en fortid – fra nazisympatisører til tjuvjakt, stjeling og gjedde i Glomma.»</w:t>
+      </w:r>
+    </w:p>
+    <w:p>
+      <w:r>
+        <w:rPr>
+          <w:i/>
+          <w:color w:val="CC0000"/>
+          <w:sz w:val="22"/>
+        </w:rPr>
+        <w:t>🔴 STERK ADVARSEL – les før du vurderer denne: (1) Jeg fant INGEN kilde som bekrefter at Maarud ble brukt i et krigsforbryter-oppgjør, eller nazi-påstanden om regionen – å si dette som fakta fra scenen er risikabelt og kan rett og slett være feil. (2) Krig/nazisme/krigsforbrytelser er uansett en tung tone midt i en bryllupsåpning og kan såre gjester. Min anbefaling: dropp krig/nazi-leddet helt, behold bare den lette bygdehumoren (tjuvjakt + gjedde i Glomma) – samme glimt i øyet uten risikoen. Sjekk fakta og tøm den med brudeparet før du bruker noe av dette.</w:t>
       </w:r>
     </w:p>
     <w:p>
@@ -3602,7 +3651,23 @@
           <w:color w:val="000000"/>
           <w:sz w:val="28"/>
         </w:rPr>
-        <w:t>Ordet er ditt, Werner Seigerud.</w:t>
+        <w:t xml:space="preserve">Brudens far – </w:t>
+      </w:r>
+      <w:r>
+        <w:rPr>
+          <w:b/>
+          <w:color w:val="000000"/>
+          <w:sz w:val="28"/>
+        </w:rPr>
+        <w:t>Werner Seigerud</w:t>
+      </w:r>
+      <w:r>
+        <w:rPr>
+          <w:b w:val="0"/>
+          <w:color w:val="000000"/>
+          <w:sz w:val="28"/>
+        </w:rPr>
+        <w:t>. Ordet er ditt.</w:t>
       </w:r>
     </w:p>
     <w:p>
@@ -4036,7 +4101,23 @@
           <w:color w:val="000000"/>
           <w:sz w:val="28"/>
         </w:rPr>
-        <w:t>Anders – scenen er din.</w:t>
+        <w:t xml:space="preserve">Brudgommen selv – </w:t>
+      </w:r>
+      <w:r>
+        <w:rPr>
+          <w:b/>
+          <w:color w:val="000000"/>
+          <w:sz w:val="28"/>
+        </w:rPr>
+        <w:t>Anders</w:t>
+      </w:r>
+      <w:r>
+        <w:rPr>
+          <w:b w:val="0"/>
+          <w:color w:val="000000"/>
+          <w:sz w:val="28"/>
+        </w:rPr>
+        <w:t>. Scenen er din.</w:t>
       </w:r>
     </w:p>
     <w:p>
@@ -4628,7 +4709,23 @@
           <w:color w:val="000000"/>
           <w:sz w:val="28"/>
         </w:rPr>
-        <w:t>Ta imot Anders' mor og far – Kjersti og Erik Nilsen.</w:t>
+        <w:t xml:space="preserve">Ta imot brudgommens foreldre – </w:t>
+      </w:r>
+      <w:r>
+        <w:rPr>
+          <w:b/>
+          <w:color w:val="000000"/>
+          <w:sz w:val="28"/>
+        </w:rPr>
+        <w:t>Kjersti og Erik Nilsen</w:t>
+      </w:r>
+      <w:r>
+        <w:rPr>
+          <w:b w:val="0"/>
+          <w:color w:val="000000"/>
+          <w:sz w:val="28"/>
+        </w:rPr>
+        <w:t>.</w:t>
       </w:r>
     </w:p>
     <w:p>
@@ -7098,7 +7195,23 @@
           <w:color w:val="000000"/>
           <w:sz w:val="28"/>
         </w:rPr>
-        <w:t>Applaus til Michelles forlover – Helene.</w:t>
+        <w:t xml:space="preserve">Applaus til brudens forlover – </w:t>
+      </w:r>
+      <w:r>
+        <w:rPr>
+          <w:b/>
+          <w:color w:val="000000"/>
+          <w:sz w:val="28"/>
+        </w:rPr>
+        <w:t>Helene</w:t>
+      </w:r>
+      <w:r>
+        <w:rPr>
+          <w:b w:val="0"/>
+          <w:color w:val="000000"/>
+          <w:sz w:val="28"/>
+        </w:rPr>
+        <w:t>.</w:t>
       </w:r>
     </w:p>
     <w:p>
@@ -7242,7 +7355,23 @@
           <w:color w:val="000000"/>
           <w:sz w:val="28"/>
         </w:rPr>
-        <w:t>Vær så god – Anders' forlover, Even.</w:t>
+        <w:t xml:space="preserve">Vær så god – brudgommens forlover, </w:t>
+      </w:r>
+      <w:r>
+        <w:rPr>
+          <w:b/>
+          <w:color w:val="000000"/>
+          <w:sz w:val="28"/>
+        </w:rPr>
+        <w:t>Even</w:t>
+      </w:r>
+      <w:r>
+        <w:rPr>
+          <w:b w:val="0"/>
+          <w:color w:val="000000"/>
+          <w:sz w:val="28"/>
+        </w:rPr>
+        <w:t>.</w:t>
       </w:r>
     </w:p>
     <w:p>
@@ -7370,7 +7499,23 @@
           <w:color w:val="000000"/>
           <w:sz w:val="28"/>
         </w:rPr>
-        <w:t>I felles regi – Cathrine og Anette.</w:t>
+        <w:t xml:space="preserve">Brudens storesøstre, i felles regi – </w:t>
+      </w:r>
+      <w:r>
+        <w:rPr>
+          <w:b/>
+          <w:color w:val="000000"/>
+          <w:sz w:val="28"/>
+        </w:rPr>
+        <w:t>Cathrine og Anette</w:t>
+      </w:r>
+      <w:r>
+        <w:rPr>
+          <w:b w:val="0"/>
+          <w:color w:val="000000"/>
+          <w:sz w:val="28"/>
+        </w:rPr>
+        <w:t>.</w:t>
       </w:r>
     </w:p>
     <w:p>
@@ -7548,10 +7693,24 @@
           <w:color w:val="000000"/>
           <w:sz w:val="28"/>
         </w:rPr>
-        <w:t xml:space="preserve"> Så bar det til Ås – sentral i Samfunnet, og økonomisjef med et av de største vervene på huset.</w:t>
-      </w:r>
-    </w:p>
-    <w:p>
+        <w:t xml:space="preserve"> Og – etter sigende – en av landets hardeste </w:t>
+      </w:r>
+      <w:r>
+        <w:rPr>
+          <w:i/>
+          <w:color w:val="CC0000"/>
+          <w:sz w:val="22"/>
+        </w:rPr>
+        <w:t>[rallysjåfører? «rullestol/rullesjef» var utydelig i opptaket – avklar ordet]</w:t>
+      </w:r>
+      <w:r>
+        <w:rPr>
+          <w:b w:val="0"/>
+          <w:color w:val="000000"/>
+          <w:sz w:val="28"/>
+        </w:rPr>
+        <w:t xml:space="preserve">. </w:t>
+      </w:r>
       <w:r>
         <w:rPr>
           <w:i/>
@@ -7566,6 +7725,24 @@
           <w:color w:val="000000"/>
           <w:sz w:val="28"/>
         </w:rPr>
+        <w:t xml:space="preserve"> Så bar det til Ås: med i gjengen «Juicy», sentral i Samfunnet, og økonomisjef med et av de største vervene på huset.</w:t>
+      </w:r>
+    </w:p>
+    <w:p>
+      <w:r>
+        <w:rPr>
+          <w:i/>
+          <w:color w:val="CC0000"/>
+          <w:sz w:val="22"/>
+        </w:rPr>
+        <w:t>(beat)</w:t>
+      </w:r>
+      <w:r>
+        <w:rPr>
+          <w:b w:val="0"/>
+          <w:color w:val="000000"/>
+          <w:sz w:val="28"/>
+        </w:rPr>
         <w:t xml:space="preserve"> Så valgte han down under – Australia. </w:t>
       </w:r>
       <w:r>
@@ -7660,7 +7837,23 @@
           <w:color w:val="000000"/>
           <w:sz w:val="28"/>
         </w:rPr>
-        <w:t>I kveld kommer det i samlet pakke – ta imot Anders' søsken, Ingrid og Ola.</w:t>
+        <w:t xml:space="preserve">I kveld kommer det i samlet pakke – ta imot brudgommens søsken, </w:t>
+      </w:r>
+      <w:r>
+        <w:rPr>
+          <w:b/>
+          <w:color w:val="000000"/>
+          <w:sz w:val="28"/>
+        </w:rPr>
+        <w:t>Ingrid og Ola</w:t>
+      </w:r>
+      <w:r>
+        <w:rPr>
+          <w:b w:val="0"/>
+          <w:color w:val="000000"/>
+          <w:sz w:val="28"/>
+        </w:rPr>
+        <w:t>.</w:t>
       </w:r>
     </w:p>
     <w:p>
@@ -8079,7 +8272,23 @@
           <w:color w:val="000000"/>
           <w:sz w:val="28"/>
         </w:rPr>
-        <w:t>Ta vel imot – Kongsvinger-vennene.</w:t>
+        <w:t xml:space="preserve">Ta vel imot brudens barndomsvenner – </w:t>
+      </w:r>
+      <w:r>
+        <w:rPr>
+          <w:b/>
+          <w:color w:val="000000"/>
+          <w:sz w:val="28"/>
+        </w:rPr>
+        <w:t>Kongsvinger-vennene</w:t>
+      </w:r>
+      <w:r>
+        <w:rPr>
+          <w:b w:val="0"/>
+          <w:color w:val="000000"/>
+          <w:sz w:val="28"/>
+        </w:rPr>
+        <w:t>.</w:t>
       </w:r>
     </w:p>
     <w:p>
@@ -8187,7 +8396,23 @@
           <w:color w:val="000000"/>
           <w:sz w:val="28"/>
         </w:rPr>
-        <w:t>Ta vel imot – «Feminin og fornem».</w:t>
+        <w:t xml:space="preserve">Ta vel imot brudens Ås-gjeng – </w:t>
+      </w:r>
+      <w:r>
+        <w:rPr>
+          <w:b/>
+          <w:color w:val="000000"/>
+          <w:sz w:val="28"/>
+        </w:rPr>
+        <w:t>«Feminin og fornem»</w:t>
+      </w:r>
+      <w:r>
+        <w:rPr>
+          <w:b w:val="0"/>
+          <w:color w:val="000000"/>
+          <w:sz w:val="28"/>
+        </w:rPr>
+        <w:t>.</w:t>
       </w:r>
     </w:p>
     <w:p>
@@ -8259,7 +8484,23 @@
           <w:color w:val="000000"/>
           <w:sz w:val="28"/>
         </w:rPr>
-        <w:t>Broderskapet Unity – scenen er deres.</w:t>
+        <w:t xml:space="preserve">Brudgommens Ås-gjeng – </w:t>
+      </w:r>
+      <w:r>
+        <w:rPr>
+          <w:b/>
+          <w:color w:val="000000"/>
+          <w:sz w:val="28"/>
+        </w:rPr>
+        <w:t>Broderskapet Unity</w:t>
+      </w:r>
+      <w:r>
+        <w:rPr>
+          <w:b w:val="0"/>
+          <w:color w:val="000000"/>
+          <w:sz w:val="28"/>
+        </w:rPr>
+        <w:t>. Scenen er deres.</w:t>
       </w:r>
     </w:p>
     <w:p>
@@ -8341,7 +8582,23 @@
           <w:color w:val="000000"/>
           <w:sz w:val="28"/>
         </w:rPr>
-        <w:t>Tom Christian – ordet er ditt.</w:t>
+        <w:t xml:space="preserve">Brudgommens gode venn – </w:t>
+      </w:r>
+      <w:r>
+        <w:rPr>
+          <w:b/>
+          <w:color w:val="000000"/>
+          <w:sz w:val="28"/>
+        </w:rPr>
+        <w:t>Tom Christian</w:t>
+      </w:r>
+      <w:r>
+        <w:rPr>
+          <w:b w:val="0"/>
+          <w:color w:val="000000"/>
+          <w:sz w:val="28"/>
+        </w:rPr>
+        <w:t>. Ordet er ditt.</w:t>
       </w:r>
     </w:p>
     <w:p>

</xml_diff>

<commit_message>
Løs Tale 7/8-konflikt (søstre først) + rydd siste rester
Bruker valgte: Tale 7 = Cathrine & Anette (brudens søstre), Tale 8 =
Ingrid & Ola (brudgommens søsken) – som manus.
- tidsplan.md: byttet Tale 7/8 i tidslinja + sjekklista + buffet-mekanikk
  + oppsummering.
- simen-lyd.md: byttet cue-rekkefølge + oppdatert OBS-note (nå samkjørt).
- innslag.md: byttet Tale 7/8 i §7-tidslinja.
- telefonnotater (helene/kjersti-erik): rettet tale-nummer-referanser.
- manus.md: dramaturgisk oversikt skrevet om til kanonisk rekkefølge
  (Fireball-kadens, søstre før søsken); Huskeliste punkt 8 oppdatert
  (kadens gjennomført); Stikk 4-Fireball omdøpt til «siste» + flagget som
  mulig 4. runde.

Alle dokumenter er nå samkjørt. Gjenstår én avklaring: 3 vs 4 Fireball.

Co-Authored-By: Claude Opus 4.8 <noreply@anthropic.com>
Claude-Session: https://claude.ai/code/session_01HH3S616y2naKXPCG25iHhw
</commit_message>
<xml_diff>
--- a/manus.docx
+++ b/manus.docx
@@ -1503,47 +1503,15 @@
           <w:color w:val="000000"/>
           <w:sz w:val="28"/>
         </w:rPr>
-        <w:t>🔥 Fireball-kadens</w:t>
-      </w:r>
-      <w:r>
-        <w:rPr>
-          <w:b w:val="0"/>
-          <w:color w:val="000000"/>
-          <w:sz w:val="28"/>
-        </w:rPr>
-        <w:t xml:space="preserve">: Fireball-shot skal på </w:t>
-      </w:r>
-      <w:r>
-        <w:rPr>
-          <w:b/>
-          <w:color w:val="000000"/>
-          <w:sz w:val="28"/>
-        </w:rPr>
-        <w:t>etter hver buffet</w:t>
-      </w:r>
-      <w:r>
-        <w:rPr>
-          <w:b w:val="0"/>
-          <w:color w:val="000000"/>
-          <w:sz w:val="28"/>
-        </w:rPr>
-        <w:t xml:space="preserve"> (forrett + hovedrett) </w:t>
-      </w:r>
-      <w:r>
-        <w:rPr>
-          <w:b/>
-          <w:color w:val="000000"/>
-          <w:sz w:val="28"/>
-        </w:rPr>
-        <w:t>og etter dessert</w:t>
-      </w:r>
-      <w:r>
-        <w:rPr>
-          <w:b w:val="0"/>
-          <w:color w:val="000000"/>
-          <w:sz w:val="28"/>
-        </w:rPr>
-        <w:t xml:space="preserve">. NB: runde 1 er i dag en velkomstshot FØR buffet 1 – flytt/legg til så det blir én etter hver servering (se tidsplan.md / simen-lyd.md / powerpoint-plan.md). 9. </w:t>
+        <w:t>🔥 Fireball-kadens (gjennomført)</w:t>
+      </w:r>
+      <w:r>
+        <w:rPr>
+          <w:b w:val="0"/>
+          <w:color w:val="000000"/>
+          <w:sz w:val="28"/>
+        </w:rPr>
+        <w:t xml:space="preserve">: én runde etter hver servering – etter forrett (runde 1, ~19:11), hovedrett (runde 2, ~20:13) og dessert (runde 3, ~21:37). Samkjørt i tidsplan.md / simen-lyd.md / powerpoint-plan.md. 9. </w:t>
       </w:r>
       <w:r>
         <w:rPr>
@@ -9151,7 +9119,17 @@
           <w:color w:val="CC0000"/>
           <w:sz w:val="28"/>
         </w:rPr>
-        <w:t>Fireball-runde 3 + dansen åpner</w:t>
+        <w:t>Siste Fireball + dansen åpner</w:t>
+      </w:r>
+    </w:p>
+    <w:p>
+      <w:r>
+        <w:rPr>
+          <w:i/>
+          <w:color w:val="CC0000"/>
+          <w:sz w:val="22"/>
+        </w:rPr>
+        <w:t>[NB: kadens-rundene 1–3 er etter forrett/hovedrett/dessert (siste ~21:37). Denne shoten ved dansestart blir altså en 4. runde. Avklar om du vil ha den i tillegg, eller om dansen åpnes uten shot.]</w:t>
       </w:r>
     </w:p>
     <w:p>
@@ -9181,7 +9159,7 @@
           <w:color w:val="000000"/>
           <w:sz w:val="28"/>
         </w:rPr>
-        <w:t>Og før vi slipper dem løs – siste runde Fireball. Glassene opp!</w:t>
+        <w:t>Og før vi slipper dem løs – en aller siste Fireball til dans. Glassene opp!</w:t>
       </w:r>
     </w:p>
     <w:p>
@@ -10365,7 +10343,7 @@
           <w:color w:val="CC0000"/>
           <w:sz w:val="18"/>
         </w:rPr>
-        <w:t>Werner Seigerud    ██        Tyngde</w:t>
+        <w:t>Werner Seigerud    ██        Brudens far – tyngde (FØR mat)</w:t>
       </w:r>
     </w:p>
     <w:p>
@@ -10385,7 +10363,7 @@
           <w:color w:val="CC0000"/>
           <w:sz w:val="18"/>
         </w:rPr>
-        <w:t>Anders til brud    ███       Burning Love</w:t>
+        <w:t>— forrett (buffet 1) —</w:t>
       </w:r>
     </w:p>
     <w:p>
@@ -10395,7 +10373,7 @@
           <w:color w:val="CC0000"/>
           <w:sz w:val="18"/>
         </w:rPr>
-        <w:t>Michelle til Anders███       Mamma Mia, feminin og fornem (paret-utveksling)</w:t>
+        <w:t>Anders til brud    ███       Burning Love (etter forretten)</w:t>
       </w:r>
     </w:p>
     <w:p>
@@ -10405,7 +10383,7 @@
           <w:color w:val="CC0000"/>
           <w:sz w:val="18"/>
         </w:rPr>
-        <w:t>Cathrine + Anette  ██        Walking On Sunshine, søster-duo</w:t>
+        <w:t>Michelle til Anders███       Mamma Mia, paret-utveksling</w:t>
       </w:r>
     </w:p>
     <w:p>
@@ -10425,7 +10403,7 @@
           <w:color w:val="CC0000"/>
           <w:sz w:val="18"/>
         </w:rPr>
-        <w:t>Fireball 1         ███       Velkomstshot</w:t>
+        <w:t>Fireball 1         ███       Etter forrett (kadens)</w:t>
       </w:r>
     </w:p>
     <w:p>
@@ -10435,7 +10413,7 @@
           <w:color w:val="CC0000"/>
           <w:sz w:val="18"/>
         </w:rPr>
-        <w:t>— buffet 1 —</w:t>
+        <w:t>Kjersti + Erik N.  ██        Arv eller miljø + tog-metafor</w:t>
       </w:r>
     </w:p>
     <w:p>
@@ -10445,7 +10423,7 @@
           <w:color w:val="CC0000"/>
           <w:sz w:val="18"/>
         </w:rPr>
-        <w:t>Kjersti + Erik N.  ██        Arv eller miljø + tog-metafor</w:t>
+        <w:t>— hovedrett (buffet 2) —</w:t>
       </w:r>
     </w:p>
     <w:p>
@@ -10455,7 +10433,7 @@
           <w:color w:val="CC0000"/>
           <w:sz w:val="18"/>
         </w:rPr>
-        <w:t>— pissepause + buffet 2 —</w:t>
+        <w:t>Fireball 2         ██        Etter hovedrett (kadens)</w:t>
       </w:r>
     </w:p>
     <w:p>
@@ -10475,7 +10453,7 @@
           <w:color w:val="CC0000"/>
           <w:sz w:val="18"/>
         </w:rPr>
-        <w:t>Ingrid + Ola       ████      Crazy Train, søsken-duo</w:t>
+        <w:t>Helene             ███       Fanga av stormvind, forlover brud</w:t>
       </w:r>
     </w:p>
     <w:p>
@@ -10485,6 +10463,66 @@
           <w:color w:val="CC0000"/>
           <w:sz w:val="18"/>
         </w:rPr>
+        <w:t>Even               ████      Thunderstruck + Rumble, forlover brudgom</w:t>
+      </w:r>
+    </w:p>
+    <w:p>
+      <w:r>
+        <w:rPr>
+          <w:rFonts w:ascii="Consolas" w:hAnsi="Consolas"/>
+          <w:color w:val="CC0000"/>
+          <w:sz w:val="18"/>
+        </w:rPr>
+        <w:t>Cathrine + Anette  ██        Walking On Sunshine, søstre (Tale 7)</w:t>
+      </w:r>
+    </w:p>
+    <w:p>
+      <w:r>
+        <w:rPr>
+          <w:rFonts w:ascii="Consolas" w:hAnsi="Consolas"/>
+          <w:color w:val="CC0000"/>
+          <w:sz w:val="18"/>
+        </w:rPr>
+        <w:t>Ingrid + Ola       ████      Crazy Train, søsken (Tale 8)</w:t>
+      </w:r>
+    </w:p>
+    <w:p>
+      <w:r>
+        <w:rPr>
+          <w:rFonts w:ascii="Consolas" w:hAnsi="Consolas"/>
+          <w:color w:val="CC0000"/>
+          <w:sz w:val="18"/>
+        </w:rPr>
+        <w:t>— dessert (buffet 3) —</w:t>
+      </w:r>
+    </w:p>
+    <w:p>
+      <w:r>
+        <w:rPr>
+          <w:rFonts w:ascii="Consolas" w:hAnsi="Consolas"/>
+          <w:color w:val="CC0000"/>
+          <w:sz w:val="18"/>
+        </w:rPr>
+        <w:t>Fireball 3         ██        Etter dessert (kadens)</w:t>
+      </w:r>
+    </w:p>
+    <w:p>
+      <w:r>
+        <w:rPr>
+          <w:rFonts w:ascii="Consolas" w:hAnsi="Consolas"/>
+          <w:color w:val="CC0000"/>
+          <w:sz w:val="18"/>
+        </w:rPr>
+        <w:t>Stikk 3            ██        Jeg ringte rundt</w:t>
+      </w:r>
+    </w:p>
+    <w:p>
+      <w:r>
+        <w:rPr>
+          <w:rFonts w:ascii="Consolas" w:hAnsi="Consolas"/>
+          <w:color w:val="CC0000"/>
+          <w:sz w:val="18"/>
+        </w:rPr>
         <w:t>Kongsvinger        ██        Forza Vinger, lokal forankring</w:t>
       </w:r>
     </w:p>
@@ -10505,7 +10543,7 @@
           <w:color w:val="CC0000"/>
           <w:sz w:val="18"/>
         </w:rPr>
-        <w:t>— pause + Fireball 2 —</w:t>
+        <w:t>Broderskapet Unity ████      Enter Sandman, INNSLAG</w:t>
       </w:r>
     </w:p>
     <w:p>
@@ -10515,7 +10553,7 @@
           <w:color w:val="CC0000"/>
           <w:sz w:val="18"/>
         </w:rPr>
-        <w:t>— dessert —</w:t>
+        <w:t>Tom Christian      ███       Vennegjeng-tale (KVELDENS SISTE)</w:t>
       </w:r>
     </w:p>
     <w:p>
@@ -10525,57 +10563,7 @@
           <w:color w:val="CC0000"/>
           <w:sz w:val="18"/>
         </w:rPr>
-        <w:t>Stikk 3            ██        Jeg ringte rundt</w:t>
-      </w:r>
-    </w:p>
-    <w:p>
-      <w:r>
-        <w:rPr>
-          <w:rFonts w:ascii="Consolas" w:hAnsi="Consolas"/>
-          <w:color w:val="CC0000"/>
-          <w:sz w:val="18"/>
-        </w:rPr>
-        <w:t>Helene             ███       Fanga av stormvind</w:t>
-      </w:r>
-    </w:p>
-    <w:p>
-      <w:r>
-        <w:rPr>
-          <w:rFonts w:ascii="Consolas" w:hAnsi="Consolas"/>
-          <w:color w:val="CC0000"/>
-          <w:sz w:val="18"/>
-        </w:rPr>
-        <w:t>Even               ████      Thunderstruck-flaske + Rumble</w:t>
-      </w:r>
-    </w:p>
-    <w:p>
-      <w:r>
-        <w:rPr>
-          <w:rFonts w:ascii="Consolas" w:hAnsi="Consolas"/>
-          <w:color w:val="CC0000"/>
-          <w:sz w:val="18"/>
-        </w:rPr>
-        <w:t>Broderskapet Unity ████      Enter Sandman, INNSLAG</w:t>
-      </w:r>
-    </w:p>
-    <w:p>
-      <w:r>
-        <w:rPr>
-          <w:rFonts w:ascii="Consolas" w:hAnsi="Consolas"/>
-          <w:color w:val="CC0000"/>
-          <w:sz w:val="18"/>
-        </w:rPr>
-        <w:t>Tom Christian      ███       Vennegjeng-tale (KVELDENS SISTE)</w:t>
-      </w:r>
-    </w:p>
-    <w:p>
-      <w:r>
-        <w:rPr>
-          <w:rFonts w:ascii="Consolas" w:hAnsi="Consolas"/>
-          <w:color w:val="CC0000"/>
-          <w:sz w:val="18"/>
-        </w:rPr>
-        <w:t>Stikk 4            ███       Take on Me + Fireball 3 + landing</w:t>
+        <w:t>Stikk 4            ███       Take on Me + landing + dans</w:t>
       </w:r>
     </w:p>
     <w:p>

</xml_diff>

<commit_message>
Fireball: 3 runder (én etter hvert måltid), kutt shot ved dansestart
Per avklaring: én Fireball etter hvert måltid (forrett/hovedrett/dessert)
= 3 runder. Stikk 4 åpner dansen UTEN shot (fjernet «siste Fireball»).
Ryddet powerpoint runde 3-merknad (etter dessert / før venne-talene).

Co-Authored-By: Claude Opus 4.8 <noreply@anthropic.com>
Claude-Session: https://claude.ai/code/session_01HH3S616y2naKXPCG25iHhw
</commit_message>
<xml_diff>
--- a/manus.docx
+++ b/manus.docx
@@ -9119,17 +9119,17 @@
           <w:color w:val="CC0000"/>
           <w:sz w:val="28"/>
         </w:rPr>
-        <w:t>Siste Fireball + dansen åpner</w:t>
-      </w:r>
-    </w:p>
-    <w:p>
-      <w:r>
-        <w:rPr>
-          <w:i/>
-          <w:color w:val="CC0000"/>
-          <w:sz w:val="22"/>
-        </w:rPr>
-        <w:t>[NB: kadens-rundene 1–3 er etter forrett/hovedrett/dessert (siste ~21:37). Denne shoten ved dansestart blir altså en 4. runde. Avklar om du vil ha den i tillegg, eller om dansen åpnes uten shot.]</w:t>
+        <w:t>Dansen åpner</w:t>
+      </w:r>
+    </w:p>
+    <w:p>
+      <w:r>
+        <w:rPr>
+          <w:i/>
+          <w:color w:val="CC0000"/>
+          <w:sz w:val="22"/>
+        </w:rPr>
+        <w:t>[Fireball-kadens: én runde etter hvert måltid (forrett/hovedrett/dessert) – INGEN shot ved dansestart. Dansen åpnes uten Fireball.]</w:t>
       </w:r>
     </w:p>
     <w:p>
@@ -9140,36 +9140,6 @@
           <w:sz w:val="28"/>
         </w:rPr>
         <w:t>Takk for maten! En applaus til kjøkkenet.</w:t>
-      </w:r>
-    </w:p>
-    <w:p>
-      <w:r>
-        <w:rPr>
-          <w:i/>
-          <w:color w:val="CC0000"/>
-          <w:sz w:val="22"/>
-        </w:rPr>
-        <w:t>[PowerPoint: 🔥 FIREBALL slide]</w:t>
-      </w:r>
-    </w:p>
-    <w:p>
-      <w:r>
-        <w:rPr>
-          <w:b w:val="0"/>
-          <w:color w:val="000000"/>
-          <w:sz w:val="28"/>
-        </w:rPr>
-        <w:t>Og før vi slipper dem løs – en aller siste Fireball til dans. Glassene opp!</w:t>
-      </w:r>
-    </w:p>
-    <w:p>
-      <w:r>
-        <w:rPr>
-          <w:i/>
-          <w:color w:val="CC0000"/>
-          <w:sz w:val="22"/>
-        </w:rPr>
-        <w:t>[Felles skål, ned i ett.]</w:t>
       </w:r>
     </w:p>
     <w:p>

</xml_diff>

<commit_message>
§A: ny strammere åpning med byråkrat + plant integrert
Bytter inn brukerens versjon av åpningen: «stillingsbeskrivelse» →
fagfolk på plass → «hva er vitsen med meg» → byråkrat-ekspert → CHEKHOV
PLANT 1 («forsøkte å forhindre at dere ble sammen … den tar vi senere»).
Planten ligger nå direkte i §A; oppdatert NB-note + Huskeliste punkt 2.

Co-Authored-By: Claude Opus 4.8 <noreply@anthropic.com>
Claude-Session: https://claude.ai/code/session_01HH3S616y2naKXPCG25iHhw
</commit_message>
<xml_diff>
--- a/manus.docx
+++ b/manus.docx
@@ -1375,31 +1375,15 @@
           <w:color w:val="000000"/>
           <w:sz w:val="28"/>
         </w:rPr>
-        <w:t>🔴 «Jeg var imot at de ble sammen»-planten må sies</w:t>
-      </w:r>
-      <w:r>
-        <w:rPr>
-          <w:b w:val="0"/>
-          <w:color w:val="000000"/>
-          <w:sz w:val="28"/>
-        </w:rPr>
-        <w:t xml:space="preserve"> (CHEKHOV PLANT 1, betales ut i Stikk 2). §B er fjernet, så denne MÅ komme fra åpneren – bruk </w:t>
-      </w:r>
-      <w:r>
-        <w:rPr>
-          <w:b/>
-          <w:color w:val="000000"/>
-          <w:sz w:val="28"/>
-        </w:rPr>
-        <w:t>Alt. 3</w:t>
-      </w:r>
-      <w:r>
-        <w:rPr>
-          <w:b w:val="0"/>
-          <w:color w:val="000000"/>
-          <w:sz w:val="28"/>
-        </w:rPr>
-        <w:t xml:space="preserve">. Uten den henger Stikk 2. 3. </w:t>
+        <w:t>🔴 «Jeg var imot»-planten må sies</w:t>
+      </w:r>
+      <w:r>
+        <w:rPr>
+          <w:b w:val="0"/>
+          <w:color w:val="000000"/>
+          <w:sz w:val="28"/>
+        </w:rPr>
+        <w:t xml:space="preserve"> (CHEKHOV PLANT 1, betales ut i Stikk 2). Ligger nå i §A-teksten («forsøkte å forhindre at dere to ble sammen … den tar vi senere»). Ikke dropp den – uten den henger Stikk 2. 3. </w:t>
       </w:r>
       <w:r>
         <w:rPr>
@@ -2412,7 +2396,7 @@
           <w:color w:val="CC0000"/>
           <w:sz w:val="22"/>
         </w:rPr>
-        <w:t>[NB: §B (egen troverdighet) er nå slått sammen inn i §A. «Jeg var imot»- planten (Chekhov 1, betales ut i Stikk 2) må derfor komme fra åpneren – bruk Alt. 3, ellers henger Stikk 2 i løse lufta.]</w:t>
+        <w:t>[NB: §B (egen troverdighet) er slått sammen inn i §A. «Jeg var imot»-planten (Chekhov 1, betales ut i Stikk 2) ligger nå i §A-teksten under – du trenger den ikke fra åpneren.]</w:t>
       </w:r>
     </w:p>
     <w:p>
@@ -2486,7 +2470,7 @@
           <w:color w:val="000000"/>
           <w:sz w:val="28"/>
         </w:rPr>
-        <w:t xml:space="preserve"> Egentlig sliter jeg litt med å skjønne hva jeg skal gjøre her i kveld.</w:t>
+        <w:t xml:space="preserve"> Jeg sliter egentlig med å forstå min egen stillingsbeskrivelse her i kveld som toastmaster.</w:t>
       </w:r>
     </w:p>
     <w:p>
@@ -2504,8 +2488,10 @@
           <w:color w:val="000000"/>
           <w:sz w:val="28"/>
         </w:rPr>
-        <w:t xml:space="preserve"> Vi har skaffet lydtekniker. Vi har DJ. Vi har fotograf. </w:t>
-      </w:r>
+        <w:t xml:space="preserve"> Lydtekniker, DJ, fotograf, prest … alle fagfolk er på plass.</w:t>
+      </w:r>
+    </w:p>
+    <w:p>
       <w:r>
         <w:rPr>
           <w:i/>
@@ -2520,10 +2506,36 @@
           <w:color w:val="000000"/>
           <w:sz w:val="28"/>
         </w:rPr>
-        <w:t xml:space="preserve"> Vi har til og med presten.</w:t>
-      </w:r>
-    </w:p>
-    <w:p>
+        <w:t xml:space="preserve"> Med så mye kompetanse i rommet – hva er vitsen med meg?</w:t>
+      </w:r>
+    </w:p>
+    <w:p>
+      <w:r>
+        <w:rPr>
+          <w:i/>
+          <w:color w:val="CC0000"/>
+          <w:sz w:val="22"/>
+        </w:rPr>
+        <w:t>(LAND 2 sek)</w:t>
+      </w:r>
+    </w:p>
+    <w:p>
+      <w:r>
+        <w:rPr>
+          <w:i/>
+          <w:color w:val="CC0000"/>
+          <w:sz w:val="22"/>
+        </w:rPr>
+        <w:t>(tørr)</w:t>
+      </w:r>
+      <w:r>
+        <w:rPr>
+          <w:b w:val="0"/>
+          <w:color w:val="000000"/>
+          <w:sz w:val="28"/>
+        </w:rPr>
+        <w:t xml:space="preserve"> Heldigvis er jeg byråkrat i staten. </w:t>
+      </w:r>
       <w:r>
         <w:rPr>
           <w:i/>
@@ -2538,36 +2550,20 @@
           <w:color w:val="000000"/>
           <w:sz w:val="28"/>
         </w:rPr>
-        <w:t xml:space="preserve"> Med så mange flinke folk – hva trenger dere egentlig meg til?</w:t>
-      </w:r>
-    </w:p>
-    <w:p>
-      <w:r>
-        <w:rPr>
-          <w:i/>
-          <w:color w:val="CC0000"/>
-          <w:sz w:val="22"/>
-        </w:rPr>
-        <w:t>(LAND 2 sek)</w:t>
-      </w:r>
-    </w:p>
-    <w:p>
-      <w:r>
-        <w:rPr>
-          <w:i/>
-          <w:color w:val="CC0000"/>
-          <w:sz w:val="22"/>
-        </w:rPr>
-        <w:t>(tørr)</w:t>
-      </w:r>
-      <w:r>
-        <w:rPr>
-          <w:b w:val="0"/>
-          <w:color w:val="000000"/>
-          <w:sz w:val="28"/>
-        </w:rPr>
-        <w:t xml:space="preserve"> Men én ting har jeg ikke fortalt dere: jeg er byråkrat i staten. </w:t>
-      </w:r>
+        <w:t xml:space="preserve"> Så jeg er ekspert på å gjøre meg viktig på de minste ting.</w:t>
+      </w:r>
+    </w:p>
+    <w:p>
+      <w:r>
+        <w:rPr>
+          <w:i/>
+          <w:color w:val="CC0000"/>
+          <w:sz w:val="22"/>
+        </w:rPr>
+        <w:t>[CHEKHOV PLANT 1: «jeg var imot» – betales ut i Stikk 2 («den tar vi senere»).]</w:t>
+      </w:r>
+    </w:p>
+    <w:p>
       <w:r>
         <w:rPr>
           <w:i/>
@@ -2582,7 +2578,23 @@
           <w:color w:val="000000"/>
           <w:sz w:val="28"/>
         </w:rPr>
-        <w:t xml:space="preserve"> Så jeg klarer å gjøre meg viktig på de minste ting.</w:t>
+        <w:t xml:space="preserve"> Akkurat som den gangen jeg aktivt forsøkte å forhindre at dere to ble sammen. </w:t>
+      </w:r>
+      <w:r>
+        <w:rPr>
+          <w:i/>
+          <w:color w:val="CC0000"/>
+          <w:sz w:val="22"/>
+        </w:rPr>
+        <w:t>(beat)</w:t>
+      </w:r>
+      <w:r>
+        <w:rPr>
+          <w:b w:val="0"/>
+          <w:color w:val="000000"/>
+          <w:sz w:val="28"/>
+        </w:rPr>
+        <w:t xml:space="preserve"> … Men akkurat den saken, den tar vi senere i kveld.</w:t>
       </w:r>
     </w:p>
     <w:p>

</xml_diff>

<commit_message>
Snu rekkefølge: Ola+Ingrid (Tale 7) før Cathrine+Anette (Tale 8)
Per ny avklaring snakker Anders' søsken før Michelles søstre.
- manus.md: byttet intro-seksjonene fysisk, flyttet «balanse»-grepet til
  Cathrine+Anette-introen, oppdatert dramaturgisk oversikt + plassholdere.
- Alle andre doc (tidsplan, simen-lyd, innslag, powerpoint, slides,
  gjesteliste, notatbank, telefonnotater, brief, musikkplan): Tale 7 =
  Ingrid & Ola (Crazy Train), Tale 8 = Cathrine & Anette (Walking On
  Sunshine). Tider/sanger/dessert-etter-Tale-8 samkjørt.
- Musikk: Fireball-rundene bruker nå den ekte Fireball (Pitbull)-låta fra
  den endelige spillelista, ikke Crazy Train-jingelen (Crazy Train er
  Tale 7-intro).

Co-Authored-By: Claude Opus 4.8 <noreply@anthropic.com>
Claude-Session: https://claude.ai/code/session_01HH3S616y2naKXPCG25iHhw
</commit_message>
<xml_diff>
--- a/manus.docx
+++ b/manus.docx
@@ -7383,50 +7383,48 @@
           <w:color w:val="CC0000"/>
           <w:sz w:val="28"/>
         </w:rPr>
-        <w:t>Intro tale 7 — Cathrine + Anette (Michelles storesøstre, felles tale)</w:t>
-      </w:r>
-    </w:p>
-    <w:p>
-      <w:r>
-        <w:rPr>
-          <w:i/>
-          <w:color w:val="CC0000"/>
-          <w:sz w:val="22"/>
-        </w:rPr>
-        <w:t>[Intro-sang: Walking On Sunshine, 20 sek]</w:t>
-      </w:r>
-    </w:p>
-    <w:p>
-      <w:r>
-        <w:rPr>
-          <w:b w:val="0"/>
-          <w:color w:val="000000"/>
-          <w:sz w:val="28"/>
-        </w:rPr>
-        <w:t>Michelle har ikke én storesøster.</w:t>
-      </w:r>
-    </w:p>
-    <w:p>
-      <w:r>
-        <w:rPr>
-          <w:b w:val="0"/>
-          <w:color w:val="000000"/>
-          <w:sz w:val="28"/>
-        </w:rPr>
-        <w:t>Hun har to.</w:t>
-      </w:r>
-    </w:p>
-    <w:p>
-      <w:r>
-        <w:rPr>
-          <w:b w:val="0"/>
-          <w:color w:val="000000"/>
-          <w:sz w:val="28"/>
-        </w:rPr>
-        <w:t>Det betyr at hun aldri har kommet unna med noenting.</w:t>
-      </w:r>
-    </w:p>
-    <w:p>
+        <w:t>Intro tale 7 — Ingrid + Ola (Anders' søsken, felles tale)</w:t>
+      </w:r>
+    </w:p>
+    <w:p>
+      <w:r>
+        <w:rPr>
+          <w:i/>
+          <w:color w:val="CC0000"/>
+          <w:sz w:val="22"/>
+        </w:rPr>
+        <w:t>[Intro-sang: Crazy Train, 15 sek. «Gå sakte mot personen»-grep fra Lars/Julie §3.2 – Fredrik beveger seg sakte mot Olas bord.]</w:t>
+      </w:r>
+    </w:p>
+    <w:p>
+      <w:r>
+        <w:rPr>
+          <w:b w:val="0"/>
+          <w:color w:val="000000"/>
+          <w:sz w:val="28"/>
+        </w:rPr>
+        <w:t>Anders har én bror og én søster – og i kveld får vi høre fra begge.</w:t>
+      </w:r>
+    </w:p>
+    <w:p>
+      <w:r>
+        <w:rPr>
+          <w:i/>
+          <w:color w:val="CC0000"/>
+          <w:sz w:val="22"/>
+        </w:rPr>
+        <w:t>[Ingrid først – varm og ekte.]</w:t>
+      </w:r>
+    </w:p>
+    <w:p>
+      <w:r>
+        <w:rPr>
+          <w:b w:val="0"/>
+          <w:color w:val="000000"/>
+          <w:sz w:val="28"/>
+        </w:rPr>
+        <w:t xml:space="preserve">Ingrid har akkurat lagt russetiden bak seg – og har faktisk prioritert å bruke helga på dette bryllupet, framfor det de fleste attenåringer ville valgt. </w:t>
+      </w:r>
       <w:r>
         <w:rPr>
           <w:i/>
@@ -7441,10 +7439,46 @@
           <w:color w:val="000000"/>
           <w:sz w:val="28"/>
         </w:rPr>
-        <w:t xml:space="preserve"> Men Michelle har sagt det selv, og finere kan det ikke sies: hun har vært heldig som ikke bare har hatt én mamma – ikke to – men hele tre.</w:t>
-      </w:r>
-    </w:p>
-    <w:p>
+        <w:t xml:space="preserve"> Det settes det stor pris på.</w:t>
+      </w:r>
+    </w:p>
+    <w:p>
+      <w:r>
+        <w:rPr>
+          <w:i/>
+          <w:color w:val="CC0000"/>
+          <w:sz w:val="22"/>
+        </w:rPr>
+        <w:t>[Ola – eskalerende, ironisk CV. Helt seriøst ansikt, bygg større og større.]</w:t>
+      </w:r>
+    </w:p>
+    <w:p>
+      <w:r>
+        <w:rPr>
+          <w:b w:val="0"/>
+          <w:color w:val="000000"/>
+          <w:sz w:val="28"/>
+        </w:rPr>
+        <w:t>Ola har reist helt fra Bergen for å være her – og det er en mann med en viss fartstid.</w:t>
+      </w:r>
+    </w:p>
+    <w:p>
+      <w:r>
+        <w:rPr>
+          <w:i/>
+          <w:color w:val="CC0000"/>
+          <w:sz w:val="22"/>
+        </w:rPr>
+        <w:t>(tørr, bygg)</w:t>
+      </w:r>
+      <w:r>
+        <w:rPr>
+          <w:b w:val="0"/>
+          <w:color w:val="000000"/>
+          <w:sz w:val="28"/>
+        </w:rPr>
+        <w:t xml:space="preserve"> Tidligere en av Norges beste fotballspillere. </w:t>
+      </w:r>
       <w:r>
         <w:rPr>
           <w:i/>
@@ -7459,27 +7493,167 @@
           <w:color w:val="000000"/>
           <w:sz w:val="28"/>
         </w:rPr>
-        <w:t xml:space="preserve"> Cathrine og Anette har stått ved siden av henne hele veien. Gode rollemodeller, og de tryggeste støttespillerne en lillesøster kan ha.</w:t>
-      </w:r>
-    </w:p>
-    <w:p>
-      <w:r>
-        <w:rPr>
-          <w:b w:val="0"/>
-          <w:color w:val="000000"/>
-          <w:sz w:val="28"/>
-        </w:rPr>
-        <w:t>To storesøstre = dobbel kjærlighet og dobbel oppdragelse.</w:t>
-      </w:r>
-    </w:p>
-    <w:p>
-      <w:r>
-        <w:rPr>
-          <w:b w:val="0"/>
-          <w:color w:val="000000"/>
-          <w:sz w:val="28"/>
-        </w:rPr>
-        <w:t xml:space="preserve">Brudens storesøstre, i felles regi – </w:t>
+        <w:t xml:space="preserve"> Deretter damemagnet uten sidestykke. </w:t>
+      </w:r>
+      <w:r>
+        <w:rPr>
+          <w:i/>
+          <w:color w:val="CC0000"/>
+          <w:sz w:val="22"/>
+        </w:rPr>
+        <w:t>(beat)</w:t>
+      </w:r>
+      <w:r>
+        <w:rPr>
+          <w:b w:val="0"/>
+          <w:color w:val="000000"/>
+          <w:sz w:val="28"/>
+        </w:rPr>
+        <w:t xml:space="preserve"> Og – etter sigende – en av landets hardeste </w:t>
+      </w:r>
+      <w:r>
+        <w:rPr>
+          <w:i/>
+          <w:color w:val="CC0000"/>
+          <w:sz w:val="22"/>
+        </w:rPr>
+        <w:t>[rallysjåfører? «rullestol/rullesjef» var utydelig i opptaket – avklar ordet]</w:t>
+      </w:r>
+      <w:r>
+        <w:rPr>
+          <w:b w:val="0"/>
+          <w:color w:val="000000"/>
+          <w:sz w:val="28"/>
+        </w:rPr>
+        <w:t xml:space="preserve">. </w:t>
+      </w:r>
+      <w:r>
+        <w:rPr>
+          <w:i/>
+          <w:color w:val="CC0000"/>
+          <w:sz w:val="22"/>
+        </w:rPr>
+        <w:t>(beat)</w:t>
+      </w:r>
+      <w:r>
+        <w:rPr>
+          <w:b w:val="0"/>
+          <w:color w:val="000000"/>
+          <w:sz w:val="28"/>
+        </w:rPr>
+        <w:t xml:space="preserve"> Så bar det til Ås: med i gjengen «Juicy», sentral i Samfunnet, og økonomisjef med et av de største vervene på huset.</w:t>
+      </w:r>
+    </w:p>
+    <w:p>
+      <w:r>
+        <w:rPr>
+          <w:i/>
+          <w:color w:val="CC0000"/>
+          <w:sz w:val="22"/>
+        </w:rPr>
+        <w:t>(beat)</w:t>
+      </w:r>
+      <w:r>
+        <w:rPr>
+          <w:b w:val="0"/>
+          <w:color w:val="000000"/>
+          <w:sz w:val="28"/>
+        </w:rPr>
+        <w:t xml:space="preserve"> Så valgte han down under – Australia. </w:t>
+      </w:r>
+      <w:r>
+        <w:rPr>
+          <w:i/>
+          <w:color w:val="CC0000"/>
+          <w:sz w:val="22"/>
+        </w:rPr>
+        <w:t>(beat)</w:t>
+      </w:r>
+      <w:r>
+        <w:rPr>
+          <w:b w:val="0"/>
+          <w:color w:val="000000"/>
+          <w:sz w:val="28"/>
+        </w:rPr>
+        <w:t xml:space="preserve"> Så NHH i Bergen. </w:t>
+      </w:r>
+      <w:r>
+        <w:rPr>
+          <w:i/>
+          <w:color w:val="CC0000"/>
+          <w:sz w:val="22"/>
+        </w:rPr>
+        <w:t>(beat)</w:t>
+      </w:r>
+      <w:r>
+        <w:rPr>
+          <w:b w:val="0"/>
+          <w:color w:val="000000"/>
+          <w:sz w:val="28"/>
+        </w:rPr>
+        <w:t xml:space="preserve"> Og nå går ryktene om utveksling til en av Europas aller beste tekniske skoler.</w:t>
+      </w:r>
+    </w:p>
+    <w:p>
+      <w:r>
+        <w:rPr>
+          <w:i/>
+          <w:color w:val="CC0000"/>
+          <w:sz w:val="22"/>
+        </w:rPr>
+        <w:t>(varm, smil)</w:t>
+      </w:r>
+      <w:r>
+        <w:rPr>
+          <w:b w:val="0"/>
+          <w:color w:val="000000"/>
+          <w:sz w:val="28"/>
+        </w:rPr>
+        <w:t xml:space="preserve"> Dette er en «upcoming» stor mann. Følg med på Ola.</w:t>
+      </w:r>
+    </w:p>
+    <w:p>
+      <w:r>
+        <w:rPr>
+          <w:i/>
+          <w:color w:val="CC0000"/>
+          <w:sz w:val="22"/>
+        </w:rPr>
+        <w:t>(beat)</w:t>
+      </w:r>
+      <w:r>
+        <w:rPr>
+          <w:b w:val="0"/>
+          <w:color w:val="000000"/>
+          <w:sz w:val="28"/>
+        </w:rPr>
+        <w:t xml:space="preserve"> To brødre. Én familiebil. Én sportsbil. Spørsmålet er hvem som er hvem. </w:t>
+      </w:r>
+      <w:r>
+        <w:rPr>
+          <w:i/>
+          <w:color w:val="CC0000"/>
+          <w:sz w:val="22"/>
+        </w:rPr>
+        <w:t>(beat)</w:t>
+      </w:r>
+      <w:r>
+        <w:rPr>
+          <w:b w:val="0"/>
+          <w:color w:val="000000"/>
+          <w:sz w:val="28"/>
+        </w:rPr>
+        <w:t xml:space="preserve"> Svaret er ikke det du tror.</w:t>
+      </w:r>
+    </w:p>
+    <w:p>
+      <w:r>
+        <w:rPr>
+          <w:b w:val="0"/>
+          <w:color w:val="000000"/>
+          <w:sz w:val="28"/>
+        </w:rPr>
+        <w:t xml:space="preserve">I kveld kommer det i samlet pakke – ta imot brudgommens søsken, </w:t>
       </w:r>
       <w:r>
         <w:rPr>
@@ -7487,7 +7661,7 @@
           <w:color w:val="000000"/>
           <w:sz w:val="28"/>
         </w:rPr>
-        <w:t>Cathrine og Anette</w:t>
+        <w:t>Ingrid og Ola</w:t>
       </w:r>
       <w:r>
         <w:rPr>
@@ -7527,68 +7701,82 @@
           <w:color w:val="CC0000"/>
           <w:sz w:val="28"/>
         </w:rPr>
-        <w:t>Intro tale 8 — Ingrid + Ola (Anders' søsken, felles tale)</w:t>
-      </w:r>
-    </w:p>
-    <w:p>
-      <w:r>
-        <w:rPr>
-          <w:i/>
-          <w:color w:val="CC0000"/>
-          <w:sz w:val="22"/>
-        </w:rPr>
-        <w:t>[Intro-sang: Crazy Train, 15 sek. «Gå sakte mot personen»-grep fra Lars/Julie §3.2 – Fredrik beveger seg sakte mot Olas bord.]</w:t>
-      </w:r>
-    </w:p>
-    <w:p>
-      <w:r>
-        <w:rPr>
-          <w:b w:val="0"/>
-          <w:color w:val="000000"/>
-          <w:sz w:val="28"/>
-        </w:rPr>
-        <w:t>Michelle har to storesøstre.</w:t>
-      </w:r>
-    </w:p>
-    <w:p>
-      <w:r>
-        <w:rPr>
-          <w:b w:val="0"/>
-          <w:color w:val="000000"/>
-          <w:sz w:val="28"/>
-        </w:rPr>
-        <w:t>Anders har én bror og én søster.</w:t>
-      </w:r>
-    </w:p>
-    <w:p>
-      <w:r>
-        <w:rPr>
-          <w:b w:val="0"/>
-          <w:color w:val="000000"/>
-          <w:sz w:val="28"/>
-        </w:rPr>
-        <w:t>Balansen er tilbake.</w:t>
-      </w:r>
-    </w:p>
-    <w:p>
-      <w:r>
-        <w:rPr>
-          <w:i/>
-          <w:color w:val="CC0000"/>
-          <w:sz w:val="22"/>
-        </w:rPr>
-        <w:t>[Ingrid først – varm og ekte.]</w:t>
-      </w:r>
-    </w:p>
-    <w:p>
-      <w:r>
-        <w:rPr>
-          <w:b w:val="0"/>
-          <w:color w:val="000000"/>
-          <w:sz w:val="28"/>
-        </w:rPr>
-        <w:t xml:space="preserve">Ingrid har akkurat lagt russetiden bak seg – og har faktisk prioritert å bruke helga på dette bryllupet, framfor det de fleste attenåringer ville valgt. </w:t>
-      </w:r>
+        <w:t>Intro tale 8 — Cathrine + Anette (Michelles storesøstre, felles tale)</w:t>
+      </w:r>
+    </w:p>
+    <w:p>
+      <w:r>
+        <w:rPr>
+          <w:i/>
+          <w:color w:val="CC0000"/>
+          <w:sz w:val="22"/>
+        </w:rPr>
+        <w:t>[Intro-sang: Walking On Sunshine, 20 sek]</w:t>
+      </w:r>
+    </w:p>
+    <w:p>
+      <w:r>
+        <w:rPr>
+          <w:b w:val="0"/>
+          <w:color w:val="000000"/>
+          <w:sz w:val="28"/>
+        </w:rPr>
+        <w:t xml:space="preserve">Vi har nettopp hørt fra Anders' søsken. </w:t>
+      </w:r>
+      <w:r>
+        <w:rPr>
+          <w:i/>
+          <w:color w:val="CC0000"/>
+          <w:sz w:val="22"/>
+        </w:rPr>
+        <w:t>(beat)</w:t>
+      </w:r>
+      <w:r>
+        <w:rPr>
+          <w:b w:val="0"/>
+          <w:color w:val="000000"/>
+          <w:sz w:val="28"/>
+        </w:rPr>
+        <w:t xml:space="preserve"> Da balanserer vi – med Michelles side.</w:t>
+      </w:r>
+    </w:p>
+    <w:p>
+      <w:r>
+        <w:rPr>
+          <w:b w:val="0"/>
+          <w:color w:val="000000"/>
+          <w:sz w:val="28"/>
+        </w:rPr>
+        <w:t xml:space="preserve">Michelle har ikke én storesøster. </w:t>
+      </w:r>
+      <w:r>
+        <w:rPr>
+          <w:i/>
+          <w:color w:val="CC0000"/>
+          <w:sz w:val="22"/>
+        </w:rPr>
+        <w:t>(beat)</w:t>
+      </w:r>
+      <w:r>
+        <w:rPr>
+          <w:b w:val="0"/>
+          <w:color w:val="000000"/>
+          <w:sz w:val="28"/>
+        </w:rPr>
+        <w:t xml:space="preserve"> Hun har to.</w:t>
+      </w:r>
+    </w:p>
+    <w:p>
+      <w:r>
+        <w:rPr>
+          <w:b w:val="0"/>
+          <w:color w:val="000000"/>
+          <w:sz w:val="28"/>
+        </w:rPr>
+        <w:t>Det betyr at hun aldri har kommet unna med noenting.</w:t>
+      </w:r>
+    </w:p>
+    <w:p>
       <w:r>
         <w:rPr>
           <w:i/>
@@ -7603,46 +7791,10 @@
           <w:color w:val="000000"/>
           <w:sz w:val="28"/>
         </w:rPr>
-        <w:t xml:space="preserve"> Det settes det stor pris på.</w:t>
-      </w:r>
-    </w:p>
-    <w:p>
-      <w:r>
-        <w:rPr>
-          <w:i/>
-          <w:color w:val="CC0000"/>
-          <w:sz w:val="22"/>
-        </w:rPr>
-        <w:t>[Ola – eskalerende, ironisk CV. Helt seriøst ansikt, bygg større og større.]</w:t>
-      </w:r>
-    </w:p>
-    <w:p>
-      <w:r>
-        <w:rPr>
-          <w:b w:val="0"/>
-          <w:color w:val="000000"/>
-          <w:sz w:val="28"/>
-        </w:rPr>
-        <w:t>Ola har reist helt fra Bergen for å være her – og det er en mann med en viss fartstid.</w:t>
-      </w:r>
-    </w:p>
-    <w:p>
-      <w:r>
-        <w:rPr>
-          <w:i/>
-          <w:color w:val="CC0000"/>
-          <w:sz w:val="22"/>
-        </w:rPr>
-        <w:t>(tørr, bygg)</w:t>
-      </w:r>
-      <w:r>
-        <w:rPr>
-          <w:b w:val="0"/>
-          <w:color w:val="000000"/>
-          <w:sz w:val="28"/>
-        </w:rPr>
-        <w:t xml:space="preserve"> Tidligere en av Norges beste fotballspillere. </w:t>
-      </w:r>
+        <w:t xml:space="preserve"> Men Michelle har sagt det selv, og finere kan det ikke sies: hun har vært heldig som ikke bare har hatt én mamma – ikke to – men hele tre.</w:t>
+      </w:r>
+    </w:p>
+    <w:p>
       <w:r>
         <w:rPr>
           <w:i/>
@@ -7657,167 +7809,27 @@
           <w:color w:val="000000"/>
           <w:sz w:val="28"/>
         </w:rPr>
-        <w:t xml:space="preserve"> Deretter damemagnet uten sidestykke. </w:t>
-      </w:r>
-      <w:r>
-        <w:rPr>
-          <w:i/>
-          <w:color w:val="CC0000"/>
-          <w:sz w:val="22"/>
-        </w:rPr>
-        <w:t>(beat)</w:t>
-      </w:r>
-      <w:r>
-        <w:rPr>
-          <w:b w:val="0"/>
-          <w:color w:val="000000"/>
-          <w:sz w:val="28"/>
-        </w:rPr>
-        <w:t xml:space="preserve"> Og – etter sigende – en av landets hardeste </w:t>
-      </w:r>
-      <w:r>
-        <w:rPr>
-          <w:i/>
-          <w:color w:val="CC0000"/>
-          <w:sz w:val="22"/>
-        </w:rPr>
-        <w:t>[rallysjåfører? «rullestol/rullesjef» var utydelig i opptaket – avklar ordet]</w:t>
-      </w:r>
-      <w:r>
-        <w:rPr>
-          <w:b w:val="0"/>
-          <w:color w:val="000000"/>
-          <w:sz w:val="28"/>
-        </w:rPr>
-        <w:t xml:space="preserve">. </w:t>
-      </w:r>
-      <w:r>
-        <w:rPr>
-          <w:i/>
-          <w:color w:val="CC0000"/>
-          <w:sz w:val="22"/>
-        </w:rPr>
-        <w:t>(beat)</w:t>
-      </w:r>
-      <w:r>
-        <w:rPr>
-          <w:b w:val="0"/>
-          <w:color w:val="000000"/>
-          <w:sz w:val="28"/>
-        </w:rPr>
-        <w:t xml:space="preserve"> Så bar det til Ås: med i gjengen «Juicy», sentral i Samfunnet, og økonomisjef med et av de største vervene på huset.</w:t>
-      </w:r>
-    </w:p>
-    <w:p>
-      <w:r>
-        <w:rPr>
-          <w:i/>
-          <w:color w:val="CC0000"/>
-          <w:sz w:val="22"/>
-        </w:rPr>
-        <w:t>(beat)</w:t>
-      </w:r>
-      <w:r>
-        <w:rPr>
-          <w:b w:val="0"/>
-          <w:color w:val="000000"/>
-          <w:sz w:val="28"/>
-        </w:rPr>
-        <w:t xml:space="preserve"> Så valgte han down under – Australia. </w:t>
-      </w:r>
-      <w:r>
-        <w:rPr>
-          <w:i/>
-          <w:color w:val="CC0000"/>
-          <w:sz w:val="22"/>
-        </w:rPr>
-        <w:t>(beat)</w:t>
-      </w:r>
-      <w:r>
-        <w:rPr>
-          <w:b w:val="0"/>
-          <w:color w:val="000000"/>
-          <w:sz w:val="28"/>
-        </w:rPr>
-        <w:t xml:space="preserve"> Så NHH i Bergen. </w:t>
-      </w:r>
-      <w:r>
-        <w:rPr>
-          <w:i/>
-          <w:color w:val="CC0000"/>
-          <w:sz w:val="22"/>
-        </w:rPr>
-        <w:t>(beat)</w:t>
-      </w:r>
-      <w:r>
-        <w:rPr>
-          <w:b w:val="0"/>
-          <w:color w:val="000000"/>
-          <w:sz w:val="28"/>
-        </w:rPr>
-        <w:t xml:space="preserve"> Og nå går ryktene om utveksling til en av Europas aller beste tekniske skoler.</w:t>
-      </w:r>
-    </w:p>
-    <w:p>
-      <w:r>
-        <w:rPr>
-          <w:i/>
-          <w:color w:val="CC0000"/>
-          <w:sz w:val="22"/>
-        </w:rPr>
-        <w:t>(varm, smil)</w:t>
-      </w:r>
-      <w:r>
-        <w:rPr>
-          <w:b w:val="0"/>
-          <w:color w:val="000000"/>
-          <w:sz w:val="28"/>
-        </w:rPr>
-        <w:t xml:space="preserve"> Dette er en «upcoming» stor mann. Følg med på Ola.</w:t>
-      </w:r>
-    </w:p>
-    <w:p>
-      <w:r>
-        <w:rPr>
-          <w:i/>
-          <w:color w:val="CC0000"/>
-          <w:sz w:val="22"/>
-        </w:rPr>
-        <w:t>(beat)</w:t>
-      </w:r>
-      <w:r>
-        <w:rPr>
-          <w:b w:val="0"/>
-          <w:color w:val="000000"/>
-          <w:sz w:val="28"/>
-        </w:rPr>
-        <w:t xml:space="preserve"> To brødre. Én familiebil. Én sportsbil. Spørsmålet er hvem som er hvem. </w:t>
-      </w:r>
-      <w:r>
-        <w:rPr>
-          <w:i/>
-          <w:color w:val="CC0000"/>
-          <w:sz w:val="22"/>
-        </w:rPr>
-        <w:t>(beat)</w:t>
-      </w:r>
-      <w:r>
-        <w:rPr>
-          <w:b w:val="0"/>
-          <w:color w:val="000000"/>
-          <w:sz w:val="28"/>
-        </w:rPr>
-        <w:t xml:space="preserve"> Svaret er ikke det du tror.</w:t>
-      </w:r>
-    </w:p>
-    <w:p>
-      <w:r>
-        <w:rPr>
-          <w:b w:val="0"/>
-          <w:color w:val="000000"/>
-          <w:sz w:val="28"/>
-        </w:rPr>
-        <w:t xml:space="preserve">I kveld kommer det i samlet pakke – ta imot brudgommens søsken, </w:t>
+        <w:t xml:space="preserve"> Cathrine og Anette har stått ved siden av henne hele veien. Gode rollemodeller, og de tryggeste støttespillerne en lillesøster kan ha.</w:t>
+      </w:r>
+    </w:p>
+    <w:p>
+      <w:r>
+        <w:rPr>
+          <w:b w:val="0"/>
+          <w:color w:val="000000"/>
+          <w:sz w:val="28"/>
+        </w:rPr>
+        <w:t>To storesøstre = dobbel kjærlighet og dobbel oppdragelse.</w:t>
+      </w:r>
+    </w:p>
+    <w:p>
+      <w:r>
+        <w:rPr>
+          <w:b w:val="0"/>
+          <w:color w:val="000000"/>
+          <w:sz w:val="28"/>
+        </w:rPr>
+        <w:t xml:space="preserve">Brudens storesøstre, i felles regi – </w:t>
       </w:r>
       <w:r>
         <w:rPr>
@@ -7825,7 +7837,7 @@
           <w:color w:val="000000"/>
           <w:sz w:val="28"/>
         </w:rPr>
-        <w:t>Ingrid og Ola</w:t>
+        <w:t>Cathrine og Anette</w:t>
       </w:r>
       <w:r>
         <w:rPr>
@@ -9615,7 +9627,7 @@
           <w:color w:val="000000"/>
           <w:sz w:val="28"/>
         </w:rPr>
-        <w:t>Cathrine + Anette (søstre) som Tale 7</w:t>
+        <w:t>Ingrid + Ola (Anders' søsken) som Tale 7</w:t>
       </w:r>
       <w:r>
         <w:rPr>
@@ -9652,15 +9664,15 @@
           <w:color w:val="000000"/>
           <w:sz w:val="28"/>
         </w:rPr>
-        <w:t>Ingrid + Ola (Anders' søsken) som Tale 8</w:t>
-      </w:r>
-      <w:r>
-        <w:rPr>
-          <w:b w:val="0"/>
-          <w:color w:val="000000"/>
-          <w:sz w:val="28"/>
-        </w:rPr>
-        <w:t xml:space="preserve"> – hovedrett, etter søstrene</w:t>
+        <w:t>Cathrine + Anette (søstre) som Tale 8</w:t>
+      </w:r>
+      <w:r>
+        <w:rPr>
+          <w:b w:val="0"/>
+          <w:color w:val="000000"/>
+          <w:sz w:val="28"/>
+        </w:rPr>
+        <w:t xml:space="preserve"> – hovedrett, etter søsknene</w:t>
       </w:r>
     </w:p>
     <w:p>
@@ -10455,7 +10467,7 @@
           <w:color w:val="CC0000"/>
           <w:sz w:val="18"/>
         </w:rPr>
-        <w:t>Cathrine + Anette  ██        Walking On Sunshine, søstre (Tale 7)</w:t>
+        <w:t>Ingrid + Ola       ████      Crazy Train, søsken (Tale 7)</w:t>
       </w:r>
     </w:p>
     <w:p>
@@ -10465,7 +10477,7 @@
           <w:color w:val="CC0000"/>
           <w:sz w:val="18"/>
         </w:rPr>
-        <w:t>Ingrid + Ola       ████      Crazy Train, søsken (Tale 8)</w:t>
+        <w:t>Cathrine + Anette  ██        Walking On Sunshine, søstre (Tale 8)</w:t>
       </w:r>
     </w:p>
     <w:p>

</xml_diff>

<commit_message>
§D: crowd work-warmup før inngangen + serviett under tallerkenen
Legger inn call-and-response tidlig (familie/venner av Anders/Michelle –
«gi lyd fra dere») som energirampe rett før serviett-startflagget og
brudeparets inngang. Servietten ligger nå «under tallerkenen» (samkjørt
med FØR STIKK 1-regi).

Co-Authored-By: Claude Opus 4.8 <noreply@anthropic.com>
Claude-Session: https://claude.ai/code/session_01HH3S616y2naKXPCG25iHhw
</commit_message>
<xml_diff>
--- a/manus.docx
+++ b/manus.docx
@@ -1599,7 +1599,23 @@
           <w:color w:val="000000"/>
           <w:sz w:val="28"/>
         </w:rPr>
-        <w:t>, foldet som trekanter. Instruksjonskort ligger ved hver kuvert:</w:t>
+        <w:t xml:space="preserve">, foldet som trekanter og lagt </w:t>
+      </w:r>
+      <w:r>
+        <w:rPr>
+          <w:b/>
+          <w:color w:val="000000"/>
+          <w:sz w:val="28"/>
+        </w:rPr>
+        <w:t>under tallerkenen</w:t>
+      </w:r>
+      <w:r>
+        <w:rPr>
+          <w:b w:val="0"/>
+          <w:color w:val="000000"/>
+          <w:sz w:val="28"/>
+        </w:rPr>
+        <w:t xml:space="preserve"> ved hver kuvert. Instruksjonskort ligger ved hver kuvert:</w:t>
       </w:r>
     </w:p>
     <w:p>
@@ -2861,7 +2877,7 @@
           <w:color w:val="CC0000"/>
           <w:sz w:val="22"/>
         </w:rPr>
-        <w:t>[bygg energi – herfra og ut er det full gass]</w:t>
+        <w:t>[CROWD WORK – løft rommet før inngangen. La hvert svar få sin reaksjon; spill på trøkket. Forhåndsprogrammert = trygt (standup-teknikk §4).]</w:t>
       </w:r>
     </w:p>
     <w:p>
@@ -2879,41 +2895,177 @@
           <w:color w:val="000000"/>
           <w:sz w:val="28"/>
         </w:rPr>
-        <w:t xml:space="preserve"> For nå starter det for fullt. </w:t>
-      </w:r>
-      <w:r>
-        <w:rPr>
-          <w:i/>
-          <w:color w:val="CC0000"/>
-          <w:sz w:val="22"/>
-        </w:rPr>
-        <w:t>(2 sek)</w:t>
-      </w:r>
-      <w:r>
-        <w:rPr>
-          <w:b w:val="0"/>
-          <w:color w:val="000000"/>
-          <w:sz w:val="28"/>
-        </w:rPr>
-        <w:t xml:space="preserve"> Jeg ber dere reise dere.</w:t>
-      </w:r>
-    </w:p>
-    <w:p>
-      <w:r>
-        <w:rPr>
-          <w:i/>
-          <w:color w:val="CC0000"/>
-          <w:sz w:val="22"/>
-        </w:rPr>
-        <w:t>(vent til alle har reist seg)</w:t>
-      </w:r>
-      <w:r>
-        <w:rPr>
-          <w:b w:val="0"/>
-          <w:color w:val="000000"/>
-          <w:sz w:val="28"/>
-        </w:rPr>
-        <w:t xml:space="preserve"> Ta serviettene foran dere – hvit, foldet, på bordet.</w:t>
+        <w:t xml:space="preserve"> Og før vi slipper dem inn – la oss teste litt hvem som er her i kveld!</w:t>
+      </w:r>
+    </w:p>
+    <w:p>
+      <w:r>
+        <w:rPr>
+          <w:i/>
+          <w:color w:val="CC0000"/>
+          <w:sz w:val="22"/>
+        </w:rPr>
+        <w:t>(til salen)</w:t>
+      </w:r>
+      <w:r>
+        <w:rPr>
+          <w:b w:val="0"/>
+          <w:color w:val="000000"/>
+          <w:sz w:val="28"/>
+        </w:rPr>
+        <w:t xml:space="preserve"> Gi lyd fra dere dersom dere er … i familie med Anders!</w:t>
+      </w:r>
+    </w:p>
+    <w:p>
+      <w:r>
+        <w:rPr>
+          <w:i/>
+          <w:color w:val="CC0000"/>
+          <w:sz w:val="22"/>
+        </w:rPr>
+        <w:t>(beat – la dem svare)</w:t>
+      </w:r>
+      <w:r>
+        <w:rPr>
+          <w:b w:val="0"/>
+          <w:color w:val="000000"/>
+          <w:sz w:val="28"/>
+        </w:rPr>
+        <w:t xml:space="preserve"> Eyyy, det var trøkk!</w:t>
+      </w:r>
+    </w:p>
+    <w:p>
+      <w:r>
+        <w:rPr>
+          <w:i/>
+          <w:color w:val="CC0000"/>
+          <w:sz w:val="22"/>
+        </w:rPr>
+        <w:t>(løft)</w:t>
+      </w:r>
+      <w:r>
+        <w:rPr>
+          <w:b w:val="0"/>
+          <w:color w:val="000000"/>
+          <w:sz w:val="28"/>
+        </w:rPr>
+        <w:t xml:space="preserve"> Hva med … i familie med Michelle?</w:t>
+      </w:r>
+    </w:p>
+    <w:p>
+      <w:r>
+        <w:rPr>
+          <w:i/>
+          <w:color w:val="CC0000"/>
+          <w:sz w:val="22"/>
+        </w:rPr>
+        <w:t>(beat)</w:t>
+      </w:r>
+      <w:r>
+        <w:rPr>
+          <w:b w:val="0"/>
+          <w:color w:val="000000"/>
+          <w:sz w:val="28"/>
+        </w:rPr>
+        <w:t xml:space="preserve"> Oi – den var det enda mer trøkk i!</w:t>
+      </w:r>
+    </w:p>
+    <w:p>
+      <w:r>
+        <w:rPr>
+          <w:i/>
+          <w:color w:val="CC0000"/>
+          <w:sz w:val="22"/>
+        </w:rPr>
+        <w:t>(raskt)</w:t>
+      </w:r>
+      <w:r>
+        <w:rPr>
+          <w:b w:val="0"/>
+          <w:color w:val="000000"/>
+          <w:sz w:val="28"/>
+        </w:rPr>
+        <w:t xml:space="preserve"> Vennene av Anders? </w:t>
+      </w:r>
+      <w:r>
+        <w:rPr>
+          <w:i/>
+          <w:color w:val="CC0000"/>
+          <w:sz w:val="22"/>
+        </w:rPr>
+        <w:t>(beat)</w:t>
+      </w:r>
+      <w:r>
+        <w:rPr>
+          <w:b w:val="0"/>
+          <w:color w:val="000000"/>
+          <w:sz w:val="28"/>
+        </w:rPr>
+        <w:t xml:space="preserve"> … Og vennene av Michelle?</w:t>
+      </w:r>
+    </w:p>
+    <w:p>
+      <w:r>
+        <w:rPr>
+          <w:i/>
+          <w:color w:val="CC0000"/>
+          <w:sz w:val="22"/>
+        </w:rPr>
+        <w:t>(varm)</w:t>
+      </w:r>
+      <w:r>
+        <w:rPr>
+          <w:b w:val="0"/>
+          <w:color w:val="000000"/>
+          <w:sz w:val="28"/>
+        </w:rPr>
+        <w:t xml:space="preserve"> Supert.</w:t>
+      </w:r>
+    </w:p>
+    <w:p>
+      <w:r>
+        <w:rPr>
+          <w:i/>
+          <w:color w:val="CC0000"/>
+          <w:sz w:val="22"/>
+        </w:rPr>
+        <w:t>(stigende)</w:t>
+      </w:r>
+      <w:r>
+        <w:rPr>
+          <w:b w:val="0"/>
+          <w:color w:val="000000"/>
+          <w:sz w:val="28"/>
+        </w:rPr>
+        <w:t xml:space="preserve"> Folkens – er vi klare for å ønske kveldens brudepar velkommen?</w:t>
+      </w:r>
+    </w:p>
+    <w:p>
+      <w:r>
+        <w:rPr>
+          <w:i/>
+          <w:color w:val="CC0000"/>
+          <w:sz w:val="22"/>
+        </w:rPr>
+        <w:t>[herfra og ut er det full gass]</w:t>
+      </w:r>
+    </w:p>
+    <w:p>
+      <w:r>
+        <w:rPr>
+          <w:i/>
+          <w:color w:val="CC0000"/>
+          <w:sz w:val="22"/>
+        </w:rPr>
+        <w:t>(høyere energi)</w:t>
+      </w:r>
+      <w:r>
+        <w:rPr>
+          <w:b w:val="0"/>
+          <w:color w:val="000000"/>
+          <w:sz w:val="28"/>
+        </w:rPr>
+        <w:t xml:space="preserve"> Da ber jeg dere reise dere – og ta serviettene som ligger under tallerkenen.</w:t>
       </w:r>
     </w:p>
     <w:p>

</xml_diff>

<commit_message>
Maarud-alternativer + Werner bestefar-linjer + sprit i §E
- Maarud: erstattet svak verifisert+råversjon med 4 bedre alternativer
  (chipsens fødeby, snart 900 år/holder sammen, Crispo-gag, Glomma-poetisk)
  + verifisert faktagrunnlag. Krig/nazi-versjonen demotert til flagget
  e)-alternativ (frarådes).
- Werner-intro: varm bestefar-grace etter «Michelle»-landingen + lun
  «ikke den eneste som småhåper på smårollinger … helt uten press».
- §E: sprit-linje i drikke-beskjeden («holde ut stemmen min en hel kveld»).

Co-Authored-By: Claude Opus 4.8 <noreply@anthropic.com>
Claude-Session: https://claude.ai/code/session_01HH3S616y2naKXPCG25iHhw
</commit_message>
<xml_diff>
--- a/manus.docx
+++ b/manus.docx
@@ -1924,7 +1924,7 @@
           <w:color w:val="000000"/>
           <w:sz w:val="28"/>
         </w:rPr>
-        <w:t>Maarud-historie (2 linjer – valgfri lokalfarge, verifisert)</w:t>
+        <w:t>Maarud-historie – alternativer (velg ÉN, valgfri lokalfarge)</w:t>
       </w:r>
     </w:p>
     <w:p>
@@ -1933,11 +1933,19 @@
       </w:pPr>
       <w:r>
         <w:rPr>
-          <w:b w:val="0"/>
-          <w:color w:val="000000"/>
-          <w:sz w:val="28"/>
-        </w:rPr>
-        <w:t xml:space="preserve">«Litt om stedet vi sitter på: her på Maarud begynte hele potetgull-eventyret i 1936 – etter at Thomas Stang hadde vært i USA og smakt chips. </w:t>
+          <w:b/>
+          <w:color w:val="000000"/>
+          <w:sz w:val="28"/>
+        </w:rPr>
+        <w:t>a) Chipsens fødeby (varm, verifisert):</w:t>
+      </w:r>
+      <w:r>
+        <w:rPr>
+          <w:b w:val="0"/>
+          <w:color w:val="000000"/>
+          <w:sz w:val="28"/>
+        </w:rPr>
+        <w:t xml:space="preserve"> «Litt om stedet vi sitter på: her på Maarud begynte hele potetgull-eventyret i 1936 – etter at Thomas Stang hadde vært i USA og smakt chips. </w:t>
       </w:r>
       <w:r>
         <w:rPr>
@@ -1957,23 +1965,40 @@
       </w:r>
     </w:p>
     <w:p>
-      <w:r>
-        <w:rPr>
-          <w:i/>
-          <w:color w:val="CC0000"/>
-          <w:sz w:val="22"/>
-        </w:rPr>
-        <w:t>Verifisert (potetgull fra 1936, Stang/USA-tur – kilde: Wikipedia/maarudgaard.no).</w:t>
-      </w:r>
-    </w:p>
-    <w:p>
+      <w:pPr>
+        <w:ind w:left="283"/>
+      </w:pPr>
       <w:r>
         <w:rPr>
           <w:b/>
           <w:color w:val="000000"/>
           <w:sz w:val="28"/>
         </w:rPr>
-        <w:t>Maarud-historie – din råversjon (UTKAST, ikke verifisert – les advarsel):</w:t>
+        <w:t>b) Snart 900 år – og fortsatt sammen (varm, kobler til ekteskapet):</w:t>
+      </w:r>
+      <w:r>
+        <w:rPr>
+          <w:b w:val="0"/>
+          <w:color w:val="000000"/>
+          <w:sz w:val="28"/>
+        </w:rPr>
+        <w:t xml:space="preserve"> «Maarud har vært i samme slekt helt siden 1100-tallet. </w:t>
+      </w:r>
+      <w:r>
+        <w:rPr>
+          <w:i/>
+          <w:color w:val="CC0000"/>
+          <w:sz w:val="22"/>
+        </w:rPr>
+        <w:t>(beat)</w:t>
+      </w:r>
+      <w:r>
+        <w:rPr>
+          <w:b w:val="0"/>
+          <w:color w:val="000000"/>
+          <w:sz w:val="28"/>
+        </w:rPr>
+        <w:t xml:space="preserve"> Så hvis noen lurer på om to mennesker kan holde ut med hverandre i noen tiår – husk hvor dere sitter. Her står et sted som har klart å holde sammen i snart 900 år.»</w:t>
       </w:r>
     </w:p>
     <w:p>
@@ -1982,11 +2007,19 @@
       </w:pPr>
       <w:r>
         <w:rPr>
-          <w:b w:val="0"/>
-          <w:color w:val="000000"/>
-          <w:sz w:val="28"/>
-        </w:rPr>
-        <w:t xml:space="preserve">«Gården ble stiftet i 1936. Så gikk det tre-fire år, og så kom krigen. </w:t>
+          <w:b/>
+          <w:color w:val="000000"/>
+          <w:sz w:val="28"/>
+        </w:rPr>
+        <w:t>c) Crispo-gagen (tørr humor):</w:t>
+      </w:r>
+      <w:r>
+        <w:rPr>
+          <w:b w:val="0"/>
+          <w:color w:val="000000"/>
+          <w:sz w:val="28"/>
+        </w:rPr>
+        <w:t xml:space="preserve"> «Velkommen til Maarud Gård – hjemmet til norske chips. </w:t>
       </w:r>
       <w:r>
         <w:rPr>
@@ -2002,7 +2035,28 @@
           <w:color w:val="000000"/>
           <w:sz w:val="28"/>
         </w:rPr>
-        <w:t xml:space="preserve"> Etter den ble gården brukt i et oppgjør med krigsforbrytelser. </w:t>
+        <w:t xml:space="preserve"> Jeg skal være ærlig: jeg forventet Crispo til forrett.»</w:t>
+      </w:r>
+    </w:p>
+    <w:p>
+      <w:pPr>
+        <w:ind w:left="283"/>
+      </w:pPr>
+      <w:r>
+        <w:rPr>
+          <w:b/>
+          <w:color w:val="000000"/>
+          <w:sz w:val="28"/>
+        </w:rPr>
+        <w:t>d) Glomma (lokal, lett poetisk):</w:t>
+      </w:r>
+      <w:r>
+        <w:rPr>
+          <w:b w:val="0"/>
+          <w:color w:val="000000"/>
+          <w:sz w:val="28"/>
+        </w:rPr>
+        <w:t xml:space="preserve"> «Vi sitter her ved Glomma – Norges lengste elv. </w:t>
       </w:r>
       <w:r>
         <w:rPr>
@@ -2018,17 +2072,96 @@
           <w:color w:val="000000"/>
           <w:sz w:val="28"/>
         </w:rPr>
-        <w:t xml:space="preserve"> Og regionen her har jo en fortid – fra nazisympatisører til tjuvjakt, stjeling og gjedde i Glomma.»</w:t>
-      </w:r>
-    </w:p>
-    <w:p>
-      <w:r>
-        <w:rPr>
-          <w:i/>
-          <w:color w:val="CC0000"/>
-          <w:sz w:val="22"/>
-        </w:rPr>
-        <w:t>🔴 STERK ADVARSEL – les før du vurderer denne: (1) Jeg fant INGEN kilde som bekrefter at Maarud ble brukt i et krigsforbryter-oppgjør, eller nazi-påstanden om regionen – å si dette som fakta fra scenen er risikabelt og kan rett og slett være feil. (2) Krig/nazisme/krigsforbrytelser er uansett en tung tone midt i en bryllupsåpning og kan såre gjester. Min anbefaling: dropp krig/nazi-leddet helt, behold bare den lette bygdehumoren (tjuvjakt + gjedde i Glomma) – samme glimt i øyet uten risikoen. Sjekk fakta og tøm den med brudeparet før du bruker noe av dette.</w:t>
+        <w:t xml:space="preserve"> Passende ramme. For dette er også en av de lengste kjærlighetshistoriene jeg kjenner: Anders og Michelle har kjent hverandre nesten hele livet.»</w:t>
+      </w:r>
+    </w:p>
+    <w:p>
+      <w:r>
+        <w:rPr>
+          <w:i/>
+          <w:color w:val="CC0000"/>
+          <w:sz w:val="22"/>
+        </w:rPr>
+        <w:t xml:space="preserve">Verifisert grunnlag: potetgull fra 1936 (Stang/USA-tur), gården i Stang- slekta siden 1911 med historie tilbake til 1100-tallet, ~70 000 daa (mest skog), ligger ved Glomma i Sør-Odal. Kilder: Wikipedia / maarudgaard.no. Anbefaling: </w:t>
+      </w:r>
+      <w:r>
+        <w:rPr>
+          <w:i/>
+          <w:color w:val="CC0000"/>
+          <w:sz w:val="22"/>
+        </w:rPr>
+        <w:t>a</w:t>
+      </w:r>
+      <w:r>
+        <w:rPr>
+          <w:i/>
+          <w:color w:val="CC0000"/>
+          <w:sz w:val="22"/>
+        </w:rPr>
+        <w:t xml:space="preserve"> eller </w:t>
+      </w:r>
+      <w:r>
+        <w:rPr>
+          <w:i/>
+          <w:color w:val="CC0000"/>
+          <w:sz w:val="22"/>
+        </w:rPr>
+        <w:t>b</w:t>
+      </w:r>
+      <w:r>
+        <w:rPr>
+          <w:i/>
+          <w:color w:val="CC0000"/>
+          <w:sz w:val="22"/>
+        </w:rPr>
+        <w:t xml:space="preserve"> som åpner-krydder; </w:t>
+      </w:r>
+      <w:r>
+        <w:rPr>
+          <w:i/>
+          <w:color w:val="CC0000"/>
+          <w:sz w:val="22"/>
+        </w:rPr>
+        <w:t>b</w:t>
+      </w:r>
+      <w:r>
+        <w:rPr>
+          <w:i/>
+          <w:color w:val="CC0000"/>
+          <w:sz w:val="22"/>
+        </w:rPr>
+        <w:t xml:space="preserve"> lander ekstra fint rett før en kjærlighetstale.</w:t>
+      </w:r>
+    </w:p>
+    <w:p>
+      <w:pPr>
+        <w:ind w:left="283"/>
+      </w:pPr>
+      <w:r>
+        <w:rPr>
+          <w:b/>
+          <w:color w:val="000000"/>
+          <w:sz w:val="28"/>
+        </w:rPr>
+        <w:t>e) Krig/region (RÅVERSJON – FRARÅDES, uverifisert):</w:t>
+      </w:r>
+      <w:r>
+        <w:rPr>
+          <w:b w:val="0"/>
+          <w:color w:val="000000"/>
+          <w:sz w:val="28"/>
+        </w:rPr>
+        <w:t xml:space="preserve"> «Gården ble stiftet i 1936. Så kom krigen, og regionen her har en fortid – fra nazisympatisører til tjuvjakt og gjedde i Glomma.»</w:t>
+      </w:r>
+    </w:p>
+    <w:p>
+      <w:r>
+        <w:rPr>
+          <w:i/>
+          <w:color w:val="CC0000"/>
+          <w:sz w:val="22"/>
+        </w:rPr>
+        <w:t>🔴 Frarådes: ingen kilde bekrefter krigs-/nazi-påstandene, og det er uansett tung/feil tone for en bryllupsåpning. Bruk heller a–d. Den lette bygdehumoren (tjuvjakt + gjedde i Glomma) kan ev. stå alene uten krig/nazi-leddet.</w:t>
       </w:r>
     </w:p>
     <w:p>
@@ -3347,6 +3480,22 @@
           <w:color w:val="CC0000"/>
           <w:sz w:val="22"/>
         </w:rPr>
+        <w:t>(tørr)</w:t>
+      </w:r>
+      <w:r>
+        <w:rPr>
+          <w:b w:val="0"/>
+          <w:color w:val="000000"/>
+          <w:sz w:val="28"/>
+        </w:rPr>
+        <w:t xml:space="preserve"> Og trenger dere noe sterkere for å holde ut stemmen min en hel kveld – baren har sprit også. </w:t>
+      </w:r>
+      <w:r>
+        <w:rPr>
+          <w:i/>
+          <w:color w:val="CC0000"/>
+          <w:sz w:val="22"/>
+        </w:rPr>
         <w:t>(beat)</w:t>
       </w:r>
       <w:r>
@@ -3773,7 +3922,75 @@
           <w:color w:val="CC0000"/>
           <w:sz w:val="22"/>
         </w:rPr>
-        <w:t>🔴 HUSK: avslutt på ordet «Michelle» – ikke trail av. I gj.gang 1 forsvant selve punchlinen.</w:t>
+        <w:t xml:space="preserve">🔴 HUSK: «Michelle» er den emosjonelle landingen – la den lande </w:t>
+      </w:r>
+      <w:r>
+        <w:rPr>
+          <w:b w:val="0"/>
+          <w:color w:val="000000"/>
+          <w:sz w:val="28"/>
+        </w:rPr>
+        <w:t>(beat)</w:t>
+      </w:r>
+      <w:r>
+        <w:rPr>
+          <w:i/>
+          <w:color w:val="CC0000"/>
+          <w:sz w:val="22"/>
+        </w:rPr>
+        <w:t xml:space="preserve"> før bestefar-grasen under. Ikke trail av på selve navnet.</w:t>
+      </w:r>
+    </w:p>
+    <w:p>
+      <w:r>
+        <w:rPr>
+          <w:i/>
+          <w:color w:val="CC0000"/>
+          <w:sz w:val="22"/>
+        </w:rPr>
+        <w:t>(varm)</w:t>
+      </w:r>
+      <w:r>
+        <w:rPr>
+          <w:b w:val="0"/>
+          <w:color w:val="000000"/>
+          <w:sz w:val="28"/>
+        </w:rPr>
+        <w:t xml:space="preserve"> Og kjenner jeg Werner rett, gleder han seg allerede til neste kapittel: å bli bestefar en vakker dag.</w:t>
+      </w:r>
+    </w:p>
+    <w:p>
+      <w:r>
+        <w:rPr>
+          <w:i/>
+          <w:color w:val="CC0000"/>
+          <w:sz w:val="22"/>
+        </w:rPr>
+        <w:t>(lun, beat)</w:t>
+      </w:r>
+      <w:r>
+        <w:rPr>
+          <w:b w:val="0"/>
+          <w:color w:val="000000"/>
+          <w:sz w:val="28"/>
+        </w:rPr>
+        <w:t xml:space="preserve"> Han er nok ikke den eneste i dette rommet som småhåper på noen smårollinger etter hvert … </w:t>
+      </w:r>
+      <w:r>
+        <w:rPr>
+          <w:i/>
+          <w:color w:val="CC0000"/>
+          <w:sz w:val="22"/>
+        </w:rPr>
+        <w:t>(beat)</w:t>
+      </w:r>
+      <w:r>
+        <w:rPr>
+          <w:b w:val="0"/>
+          <w:color w:val="000000"/>
+          <w:sz w:val="28"/>
+        </w:rPr>
+        <w:t xml:space="preserve"> helt uten press, selvsagt.</w:t>
       </w:r>
     </w:p>
     <w:p>

</xml_diff>

<commit_message>
Manus-tillegg: Werner/Michelle/Even/søstre/Helene + slutt-omrokering
- Werner: bestefar-linjer + mer karakter (rolig superpappa, tørr humor,
  kjørte dem rundt med hest).
- Michelle: flere detaljer (ledertype, uredd, stall/hest, planla kvelden).
- Even: barndomssitatet «han lar meg spille» + sindig/snill.
- Cathrine + Anette: brukerens «to tanker» (gode mødre/forbilder; ser
  Michelle i dem).
- Helene: «en av de viktigste rollene … brudens forlover … sjukt svært».
- §E: gjestebok-beskjed fra bruden + to-serveringer-reassuranse.
- Slutt: Broderskapet Unity flyttet til kveldens SISTE show (etter Tom
  Christian) + ny «Händerna mot himmelen + omrigg til dans»-seksjon.

Co-Authored-By: Claude Opus 4.8 <noreply@anthropic.com>
Claude-Session: https://claude.ai/code/session_01HH3S616y2naKXPCG25iHhw
</commit_message>
<xml_diff>
--- a/manus.docx
+++ b/manus.docx
@@ -1117,6 +1117,58 @@
           <w:color w:val="CC0000"/>
           <w:sz w:val="22"/>
         </w:rPr>
+        <w:t>(varm)</w:t>
+      </w:r>
+      <w:r>
+        <w:rPr>
+          <w:b w:val="0"/>
+          <w:color w:val="000000"/>
+          <w:sz w:val="28"/>
+        </w:rPr>
+        <w:t xml:space="preserve"> Og maten: den serveres i to runder, så ingen grunn til å laste opp tallerkenen første gang. Det kommer mer av det samme – og det er nok til alle.</w:t>
+      </w:r>
+    </w:p>
+    <w:p>
+      <w:r>
+        <w:rPr>
+          <w:i/>
+          <w:color w:val="CC0000"/>
+          <w:sz w:val="22"/>
+        </w:rPr>
+        <w:t>(varm)</w:t>
+      </w:r>
+      <w:r>
+        <w:rPr>
+          <w:b w:val="0"/>
+          <w:color w:val="000000"/>
+          <w:sz w:val="28"/>
+        </w:rPr>
+        <w:t xml:space="preserve"> En liten beskjed fra bruden selv: ved inngangen står det ei gjestebok. Legg gjerne igjen en hilsen … </w:t>
+      </w:r>
+      <w:r>
+        <w:rPr>
+          <w:i/>
+          <w:color w:val="CC0000"/>
+          <w:sz w:val="22"/>
+        </w:rPr>
+        <w:t>(tørr, smil)</w:t>
+      </w:r>
+      <w:r>
+        <w:rPr>
+          <w:b w:val="0"/>
+          <w:color w:val="000000"/>
+          <w:sz w:val="28"/>
+        </w:rPr>
+        <w:t xml:space="preserve"> og dere får rate bryllupet, om dere tør.</w:t>
+      </w:r>
+    </w:p>
+    <w:p>
+      <w:r>
+        <w:rPr>
+          <w:i/>
+          <w:color w:val="CC0000"/>
+          <w:sz w:val="22"/>
+        </w:rPr>
         <w:t>(beat)</w:t>
       </w:r>
       <w:r>
@@ -1365,7 +1417,91 @@
           <w:color w:val="CC0000"/>
           <w:sz w:val="22"/>
         </w:rPr>
-        <w:t>🔴 HUSK: avslutt på ordet «Michelle» – ikke trail av. I gj.gang 1 forsvant selve punchlinen.</w:t>
+        <w:t xml:space="preserve">🔴 HUSK: «Michelle» er den emosjonelle landingen – la den lande </w:t>
+      </w:r>
+      <w:r>
+        <w:rPr>
+          <w:b w:val="0"/>
+          <w:color w:val="000000"/>
+          <w:sz w:val="28"/>
+        </w:rPr>
+        <w:t>(beat)</w:t>
+      </w:r>
+      <w:r>
+        <w:rPr>
+          <w:i/>
+          <w:color w:val="CC0000"/>
+          <w:sz w:val="22"/>
+        </w:rPr>
+        <w:t xml:space="preserve"> før du går videre.</w:t>
+      </w:r>
+    </w:p>
+    <w:p>
+      <w:r>
+        <w:rPr>
+          <w:i/>
+          <w:color w:val="CC0000"/>
+          <w:sz w:val="22"/>
+        </w:rPr>
+        <w:t>(varm)</w:t>
+      </w:r>
+      <w:r>
+        <w:rPr>
+          <w:b w:val="0"/>
+          <w:color w:val="000000"/>
+          <w:sz w:val="28"/>
+        </w:rPr>
+        <w:t xml:space="preserve"> For dere som ikke kjenner Werner: en rolig, raus «superpappa» med knusktørr humor, som sjelden sier mye – men som alltid har stilt opp. Han har kjørt dem land og strand rundt med hest i alle år.</w:t>
+      </w:r>
+    </w:p>
+    <w:p>
+      <w:r>
+        <w:rPr>
+          <w:i/>
+          <w:color w:val="CC0000"/>
+          <w:sz w:val="22"/>
+        </w:rPr>
+        <w:t>(lun, beat)</w:t>
+      </w:r>
+      <w:r>
+        <w:rPr>
+          <w:b w:val="0"/>
+          <w:color w:val="000000"/>
+          <w:sz w:val="28"/>
+        </w:rPr>
+        <w:t xml:space="preserve"> Og kjenner jeg Werner rett, gleder han seg allerede til neste kapittel: å bli bestefar en vakker dag. </w:t>
+      </w:r>
+      <w:r>
+        <w:rPr>
+          <w:i/>
+          <w:color w:val="CC0000"/>
+          <w:sz w:val="22"/>
+        </w:rPr>
+        <w:t>(beat)</w:t>
+      </w:r>
+      <w:r>
+        <w:rPr>
+          <w:b w:val="0"/>
+          <w:color w:val="000000"/>
+          <w:sz w:val="28"/>
+        </w:rPr>
+        <w:t xml:space="preserve"> Han er nok ikke den eneste i rommet som småhåper på noen smårollinger etter hvert … </w:t>
+      </w:r>
+      <w:r>
+        <w:rPr>
+          <w:i/>
+          <w:color w:val="CC0000"/>
+          <w:sz w:val="22"/>
+        </w:rPr>
+        <w:t>(beat)</w:t>
+      </w:r>
+      <w:r>
+        <w:rPr>
+          <w:b w:val="0"/>
+          <w:color w:val="000000"/>
+          <w:sz w:val="28"/>
+        </w:rPr>
+        <w:t xml:space="preserve"> helt uten press, selvsagt.</w:t>
       </w:r>
     </w:p>
     <w:p>
@@ -1951,7 +2087,31 @@
           <w:color w:val="CC0000"/>
           <w:sz w:val="22"/>
         </w:rPr>
-        <w:t>[HUSK: flett gjerne inn 1–2 konkrete poenger/sitater om Michelle fra telefonrunden.]</w:t>
+        <w:t>(varm)</w:t>
+      </w:r>
+      <w:r>
+        <w:rPr>
+          <w:b w:val="0"/>
+          <w:color w:val="000000"/>
+          <w:sz w:val="28"/>
+        </w:rPr>
+        <w:t xml:space="preserve"> Og det går igjen hos alle jeg har snakket med: Michelle har alltid vært en ledertype – nysgjerrig, uredd, en som kan snakke med hvem som helst. </w:t>
+      </w:r>
+      <w:r>
+        <w:rPr>
+          <w:i/>
+          <w:color w:val="CC0000"/>
+          <w:sz w:val="22"/>
+        </w:rPr>
+        <w:t>(beat)</w:t>
+      </w:r>
+      <w:r>
+        <w:rPr>
+          <w:b w:val="0"/>
+          <w:color w:val="000000"/>
+          <w:sz w:val="28"/>
+        </w:rPr>
+        <w:t xml:space="preserve"> Hun vokste opp i stallen og konkurrerte med hest – og hun er faktisk den som har planlagt det meste av kvelden dere sitter i akkurat nå.</w:t>
       </w:r>
     </w:p>
     <w:p>
@@ -3673,6 +3833,88 @@
     <w:p>
       <w:r>
         <w:rPr>
+          <w:i/>
+          <w:color w:val="CC0000"/>
+          <w:sz w:val="22"/>
+        </w:rPr>
+        <w:t>(energi, til salen)</w:t>
+      </w:r>
+      <w:r>
+        <w:rPr>
+          <w:b w:val="0"/>
+          <w:color w:val="000000"/>
+          <w:sz w:val="28"/>
+        </w:rPr>
+        <w:t xml:space="preserve"> Og folkens – Helene har en av de aller viktigste rollene her i kveld. </w:t>
+      </w:r>
+      <w:r>
+        <w:rPr>
+          <w:i/>
+          <w:color w:val="CC0000"/>
+          <w:sz w:val="22"/>
+        </w:rPr>
+        <w:t>(beat)</w:t>
+      </w:r>
+      <w:r>
+        <w:rPr>
+          <w:b w:val="0"/>
+          <w:color w:val="000000"/>
+          <w:sz w:val="28"/>
+        </w:rPr>
+        <w:t xml:space="preserve"> Hun er </w:t>
+      </w:r>
+      <w:r>
+        <w:rPr>
+          <w:b/>
+          <w:color w:val="000000"/>
+          <w:sz w:val="28"/>
+        </w:rPr>
+        <w:t>brudens forlover</w:t>
+      </w:r>
+      <w:r>
+        <w:rPr>
+          <w:b w:val="0"/>
+          <w:color w:val="000000"/>
+          <w:sz w:val="28"/>
+        </w:rPr>
+        <w:t xml:space="preserve">. </w:t>
+      </w:r>
+      <w:r>
+        <w:rPr>
+          <w:i/>
+          <w:color w:val="CC0000"/>
+          <w:sz w:val="22"/>
+        </w:rPr>
+        <w:t>(beat)</w:t>
+      </w:r>
+      <w:r>
+        <w:rPr>
+          <w:b w:val="0"/>
+          <w:color w:val="000000"/>
+          <w:sz w:val="28"/>
+        </w:rPr>
+        <w:t xml:space="preserve"> Og det er et jævlig viktig verv, folkens. </w:t>
+      </w:r>
+      <w:r>
+        <w:rPr>
+          <w:i/>
+          <w:color w:val="CC0000"/>
+          <w:sz w:val="22"/>
+        </w:rPr>
+        <w:t>(beat)</w:t>
+      </w:r>
+      <w:r>
+        <w:rPr>
+          <w:b w:val="0"/>
+          <w:color w:val="000000"/>
+          <w:sz w:val="28"/>
+        </w:rPr>
+        <w:t xml:space="preserve"> Det er sjukt svært.</w:t>
+      </w:r>
+    </w:p>
+    <w:p>
+      <w:r>
+        <w:rPr>
           <w:b w:val="0"/>
           <w:color w:val="000000"/>
           <w:sz w:val="28"/>
@@ -3833,6 +4075,92 @@
     <w:p>
       <w:r>
         <w:rPr>
+          <w:i/>
+          <w:color w:val="CC0000"/>
+          <w:sz w:val="22"/>
+        </w:rPr>
+        <w:t>(varm)</w:t>
+      </w:r>
+      <w:r>
+        <w:rPr>
+          <w:b w:val="0"/>
+          <w:color w:val="000000"/>
+          <w:sz w:val="28"/>
+        </w:rPr>
+        <w:t xml:space="preserve"> Jeg har kjent Even en stund selv – en sindig og snill type. </w:t>
+      </w:r>
+      <w:r>
+        <w:rPr>
+          <w:i/>
+          <w:color w:val="CC0000"/>
+          <w:sz w:val="22"/>
+        </w:rPr>
+        <w:t>(beat)</w:t>
+      </w:r>
+      <w:r>
+        <w:rPr>
+          <w:b w:val="0"/>
+          <w:color w:val="000000"/>
+          <w:sz w:val="28"/>
+        </w:rPr>
+        <w:t xml:space="preserve"> Og jeg husker noe Anders sa om ham da vi var små:</w:t>
+      </w:r>
+    </w:p>
+    <w:p>
+      <w:r>
+        <w:rPr>
+          <w:i/>
+          <w:color w:val="CC0000"/>
+          <w:sz w:val="22"/>
+        </w:rPr>
+        <w:t>(lun, sitat)</w:t>
+      </w:r>
+      <w:r>
+        <w:rPr>
+          <w:b w:val="0"/>
+          <w:color w:val="000000"/>
+          <w:sz w:val="28"/>
+        </w:rPr>
+        <w:t xml:space="preserve"> «Du Fredrik – vet du hva jeg liker med Even? </w:t>
+      </w:r>
+      <w:r>
+        <w:rPr>
+          <w:i/>
+          <w:color w:val="CC0000"/>
+          <w:sz w:val="22"/>
+        </w:rPr>
+        <w:t>(beat)</w:t>
+      </w:r>
+      <w:r>
+        <w:rPr>
+          <w:b w:val="0"/>
+          <w:color w:val="000000"/>
+          <w:sz w:val="28"/>
+        </w:rPr>
+        <w:t xml:space="preserve"> Han lar meg spille. Jeg trenger ikke bytte på – han lar meg bare spille.»</w:t>
+      </w:r>
+    </w:p>
+    <w:p>
+      <w:r>
+        <w:rPr>
+          <w:i/>
+          <w:color w:val="CC0000"/>
+          <w:sz w:val="22"/>
+        </w:rPr>
+        <w:t>(varm, beat)</w:t>
+      </w:r>
+      <w:r>
+        <w:rPr>
+          <w:b w:val="0"/>
+          <w:color w:val="000000"/>
+          <w:sz w:val="28"/>
+        </w:rPr>
+        <w:t xml:space="preserve"> Finere kan vel en liten gutt knapt beskrive en bestevenn.</w:t>
+      </w:r>
+    </w:p>
+    <w:p>
+      <w:r>
+        <w:rPr>
           <w:b w:val="0"/>
           <w:color w:val="000000"/>
           <w:sz w:val="28"/>
@@ -4327,6 +4655,86 @@
     <w:p>
       <w:r>
         <w:rPr>
+          <w:i/>
+          <w:color w:val="CC0000"/>
+          <w:sz w:val="22"/>
+        </w:rPr>
+        <w:t>[Din egen vinkel – to tanker.]</w:t>
+      </w:r>
+    </w:p>
+    <w:p>
+      <w:r>
+        <w:rPr>
+          <w:i/>
+          <w:color w:val="CC0000"/>
+          <w:sz w:val="22"/>
+        </w:rPr>
+        <w:t>(personlig, varm)</w:t>
+      </w:r>
+      <w:r>
+        <w:rPr>
+          <w:b w:val="0"/>
+          <w:color w:val="000000"/>
+          <w:sz w:val="28"/>
+        </w:rPr>
+        <w:t xml:space="preserve"> Jeg har ikke møtt Cathrine og Anette så mange ganger. Men ut ifra samtalene jeg har hatt, sitter jeg igjen med to tanker.</w:t>
+      </w:r>
+    </w:p>
+    <w:p>
+      <w:r>
+        <w:rPr>
+          <w:i/>
+          <w:color w:val="CC0000"/>
+          <w:sz w:val="22"/>
+        </w:rPr>
+        <w:t>(beat)</w:t>
+      </w:r>
+      <w:r>
+        <w:rPr>
+          <w:b w:val="0"/>
+          <w:color w:val="000000"/>
+          <w:sz w:val="28"/>
+        </w:rPr>
+        <w:t xml:space="preserve"> Den første: dette er gode mødre, gode forbilder – sterke, ressurssterke damer.</w:t>
+      </w:r>
+    </w:p>
+    <w:p>
+      <w:r>
+        <w:rPr>
+          <w:i/>
+          <w:color w:val="CC0000"/>
+          <w:sz w:val="22"/>
+        </w:rPr>
+        <w:t>(beat)</w:t>
+      </w:r>
+      <w:r>
+        <w:rPr>
+          <w:b w:val="0"/>
+          <w:color w:val="000000"/>
+          <w:sz w:val="28"/>
+        </w:rPr>
+        <w:t xml:space="preserve"> Den andre: jeg ser utrolig mye Michelle i dem. </w:t>
+      </w:r>
+      <w:r>
+        <w:rPr>
+          <w:i/>
+          <w:color w:val="CC0000"/>
+          <w:sz w:val="22"/>
+        </w:rPr>
+        <w:t>(beat)</w:t>
+      </w:r>
+      <w:r>
+        <w:rPr>
+          <w:b w:val="0"/>
+          <w:color w:val="000000"/>
+          <w:sz w:val="28"/>
+        </w:rPr>
+        <w:t xml:space="preserve"> Og det mener jeg som et stort kompliment – for bruden er tross alt den viktigste her i kveld.</w:t>
+      </w:r>
+    </w:p>
+    <w:p>
+      <w:r>
+        <w:rPr>
           <w:b w:val="0"/>
           <w:color w:val="000000"/>
           <w:sz w:val="28"/>
@@ -4691,7 +5099,7 @@
           <w:color w:val="CC0000"/>
           <w:sz w:val="32"/>
         </w:rPr>
-        <w:t>Innslag — Broderskapet Unity (Anders' Ås-vennegjeng)</w:t>
+        <w:t>Intro tale 11 — Tom Christian (venn av Anders, kveldens siste tale)</w:t>
       </w:r>
     </w:p>
     <w:p>
@@ -4701,7 +5109,7 @@
           <w:color w:val="CC0000"/>
           <w:sz w:val="22"/>
         </w:rPr>
-        <w:t>[Intro-sang: Enter Sandman, 15 sek. Tung, dramatisk – matcher broderskap-energien.]</w:t>
+        <w:t>[Intro-sang: Hold the Line (#24), 15 sek]</w:t>
       </w:r>
     </w:p>
     <w:p>
@@ -4711,7 +5119,7 @@
           <w:color w:val="000000"/>
           <w:sz w:val="28"/>
         </w:rPr>
-        <w:t>Hver gang en mann gifter seg, mister han noen rettigheter.</w:t>
+        <w:t>Når man har holdt det gående til denne timen i et bryllup, er det fordi det er noe man ikke vil gå glipp av.</w:t>
       </w:r>
     </w:p>
     <w:p>
@@ -4721,7 +5129,7 @@
           <w:color w:val="000000"/>
           <w:sz w:val="28"/>
         </w:rPr>
-        <w:t>Heldigvis er det noen som har samlet seg i et broderskap for å passe på at han ikke mister minnene.</w:t>
+        <w:t>Kveldens siste taler er en svært tilstedeværende – og til tider fraværende – type. Tidligere europamester i taekwondo.</w:t>
       </w:r>
     </w:p>
     <w:p>
@@ -4731,7 +5139,17 @@
           <w:color w:val="000000"/>
           <w:sz w:val="28"/>
         </w:rPr>
-        <w:t xml:space="preserve">Brudgommens Ås-gjeng – </w:t>
+        <w:t>Han er en god venn av Anders – og det å ha venner som blir værende lenge, både i livet og i bryllupet, sier sitt.</w:t>
+      </w:r>
+    </w:p>
+    <w:p>
+      <w:r>
+        <w:rPr>
+          <w:b w:val="0"/>
+          <w:color w:val="000000"/>
+          <w:sz w:val="28"/>
+        </w:rPr>
+        <w:t xml:space="preserve">Brudgommens gode venn – </w:t>
       </w:r>
       <w:r>
         <w:rPr>
@@ -4739,7 +5157,7 @@
           <w:color w:val="000000"/>
           <w:sz w:val="28"/>
         </w:rPr>
-        <w:t>Broderskapet Unity</w:t>
+        <w:t>Tom Christian</w:t>
       </w:r>
       <w:r>
         <w:rPr>
@@ -4747,7 +5165,7 @@
           <w:color w:val="000000"/>
           <w:sz w:val="28"/>
         </w:rPr>
-        <w:t>. Scenen er deres.</w:t>
+        <w:t>. Ordet er ditt.</w:t>
       </w:r>
     </w:p>
     <w:p>
@@ -4757,7 +5175,7 @@
           <w:color w:val="CC0000"/>
           <w:sz w:val="22"/>
         </w:rPr>
-        <w:t>[Innslag, 5 min – sang / sketsj / tale, fleksibelt format. Avklart med gjengen på forhånd: hva, varighet, tekniske behov.]</w:t>
+        <w:t>[Tale 11, 3 min – kveldens siste tale.]</w:t>
       </w:r>
     </w:p>
     <w:p>
@@ -4779,7 +5197,7 @@
           <w:color w:val="CC0000"/>
           <w:sz w:val="32"/>
         </w:rPr>
-        <w:t>Intro tale 11 — Tom Christian (venn av Anders, kveldens siste tale)</w:t>
+        <w:t>Innslag — Broderskapet Unity (kveldens siste show)</w:t>
       </w:r>
     </w:p>
     <w:p>
@@ -4789,7 +5207,7 @@
           <w:color w:val="CC0000"/>
           <w:sz w:val="22"/>
         </w:rPr>
-        <w:t>[Intro-sang: Hold the Line (#24), 15 sek]</w:t>
+        <w:t>[Intro-sang: Enter Sandman, 15 sek. Tung, dramatisk – matcher broderskap-energien. Kveldens siste show, etter Tom Christian.]</w:t>
       </w:r>
     </w:p>
     <w:p>
@@ -4799,7 +5217,7 @@
           <w:color w:val="000000"/>
           <w:sz w:val="28"/>
         </w:rPr>
-        <w:t>Når man har holdt det gående til denne timen i et bryllup, er det fordi det er noe man ikke vil gå glipp av.</w:t>
+        <w:t>Hver gang en mann gifter seg, mister han noen rettigheter.</w:t>
       </w:r>
     </w:p>
     <w:p>
@@ -4809,7 +5227,7 @@
           <w:color w:val="000000"/>
           <w:sz w:val="28"/>
         </w:rPr>
-        <w:t>Kveldens siste taler er en svært tilstedeværende – og til tider fraværende – type. Tidligere europamester i taekwondo.</w:t>
+        <w:t>Heldigvis er det noen som har samlet seg i et broderskap for å passe på at han ikke mister minnene.</w:t>
       </w:r>
     </w:p>
     <w:p>
@@ -4819,17 +5237,117 @@
           <w:color w:val="000000"/>
           <w:sz w:val="28"/>
         </w:rPr>
-        <w:t>Han er en god venn av Anders – og det å ha venner som blir værende lenge, både i livet og i bryllupet, sier sitt.</w:t>
-      </w:r>
-    </w:p>
-    <w:p>
+        <w:t xml:space="preserve">Brudgommens Ås-gjeng – </w:t>
+      </w:r>
+      <w:r>
+        <w:rPr>
+          <w:b/>
+          <w:color w:val="000000"/>
+          <w:sz w:val="28"/>
+        </w:rPr>
+        <w:t>Broderskapet Unity</w:t>
+      </w:r>
       <w:r>
         <w:rPr>
           <w:b w:val="0"/>
           <w:color w:val="000000"/>
           <w:sz w:val="28"/>
         </w:rPr>
-        <w:t xml:space="preserve">Brudgommens gode venn – </w:t>
+        <w:t>. Scenen er deres.</w:t>
+      </w:r>
+    </w:p>
+    <w:p>
+      <w:r>
+        <w:rPr>
+          <w:i/>
+          <w:color w:val="CC0000"/>
+          <w:sz w:val="22"/>
+        </w:rPr>
+        <w:t>[Innslag, 5 min – sang / sketsj / tale, fleksibelt format. Avklart med gjengen på forhånd: hva, varighet, tekniske behov.]</w:t>
+      </w:r>
+    </w:p>
+    <w:p>
+      <w:pPr>
+        <w:pBdr>
+          <w:bottom w:val="single" w:sz="6" w:space="1" w:color="CC0000"/>
+        </w:pBdr>
+      </w:pPr>
+    </w:p>
+    <w:p>
+      <w:pPr>
+        <w:pageBreakBefore/>
+        <w:spacing w:before="40"/>
+      </w:pPr>
+      <w:r>
+        <w:rPr>
+          <w:b/>
+          <w:i w:val="0"/>
+          <w:color w:val="CC0000"/>
+          <w:sz w:val="32"/>
+        </w:rPr>
+        <w:t>Avslutning — Händerna mot himmelen + omrigg til dans</w:t>
+      </w:r>
+    </w:p>
+    <w:p>
+      <w:r>
+        <w:rPr>
+          <w:i/>
+          <w:color w:val="CC0000"/>
+          <w:sz w:val="22"/>
+        </w:rPr>
+        <w:t xml:space="preserve">[Etter Broderskapets show. Händerna mot himmelen spilles. Deretter 15–20 min omrigg der dansegulvet gjøres klart – de to bordene </w:t>
+      </w:r>
+      <w:r>
+        <w:rPr>
+          <w:b w:val="0"/>
+          <w:color w:val="000000"/>
+          <w:sz w:val="28"/>
+        </w:rPr>
+        <w:t>[spesifiser hvilke]</w:t>
+      </w:r>
+      <w:r>
+        <w:rPr>
+          <w:i/>
+          <w:color w:val="CC0000"/>
+          <w:sz w:val="22"/>
+        </w:rPr>
+        <w:t xml:space="preserve"> flyttes.]</w:t>
+      </w:r>
+    </w:p>
+    <w:p>
+      <w:r>
+        <w:rPr>
+          <w:i/>
+          <w:color w:val="CC0000"/>
+          <w:sz w:val="22"/>
+        </w:rPr>
+        <w:t>(varm)</w:t>
+      </w:r>
+      <w:r>
+        <w:rPr>
+          <w:b w:val="0"/>
+          <w:color w:val="000000"/>
+          <w:sz w:val="28"/>
+        </w:rPr>
+        <w:t xml:space="preserve"> En stor applaus til Broderskapet Unity!</w:t>
+      </w:r>
+    </w:p>
+    <w:p>
+      <w:r>
+        <w:rPr>
+          <w:i/>
+          <w:color w:val="CC0000"/>
+          <w:sz w:val="22"/>
+        </w:rPr>
+        <w:t>(energi)</w:t>
+      </w:r>
+      <w:r>
+        <w:rPr>
+          <w:b w:val="0"/>
+          <w:color w:val="000000"/>
+          <w:sz w:val="28"/>
+        </w:rPr>
+        <w:t xml:space="preserve"> Og da løfter vi taket sammen – </w:t>
       </w:r>
       <w:r>
         <w:rPr>
@@ -4837,7 +5355,7 @@
           <w:color w:val="000000"/>
           <w:sz w:val="28"/>
         </w:rPr>
-        <w:t>Tom Christian</w:t>
+        <w:t>Händerna mot himmelen</w:t>
       </w:r>
       <w:r>
         <w:rPr>
@@ -4845,7 +5363,7 @@
           <w:color w:val="000000"/>
           <w:sz w:val="28"/>
         </w:rPr>
-        <w:t>. Ordet er ditt.</w:t>
+        <w:t>!</w:t>
       </w:r>
     </w:p>
     <w:p>
@@ -4855,7 +5373,57 @@
           <w:color w:val="CC0000"/>
           <w:sz w:val="22"/>
         </w:rPr>
-        <w:t>[Tale 11, 3 min – kveldens siste tale.]</w:t>
+        <w:t>[Händerna mot himmelen spilles – syng og dans med.]</w:t>
+      </w:r>
+    </w:p>
+    <w:p>
+      <w:r>
+        <w:rPr>
+          <w:i/>
+          <w:color w:val="CC0000"/>
+          <w:sz w:val="22"/>
+        </w:rPr>
+        <w:t>(praktisk, vennlig)</w:t>
+      </w:r>
+      <w:r>
+        <w:rPr>
+          <w:b w:val="0"/>
+          <w:color w:val="000000"/>
+          <w:sz w:val="28"/>
+        </w:rPr>
+        <w:t xml:space="preserve"> Mens vi rigger om til dansegulv – det tar en 15–20 minutter – er det fritt fram å strekke på beina, ta litt frisk luft eller fylle glasset. </w:t>
+      </w:r>
+      <w:r>
+        <w:rPr>
+          <w:i/>
+          <w:color w:val="CC0000"/>
+          <w:sz w:val="22"/>
+        </w:rPr>
+        <w:t>(beat)</w:t>
+      </w:r>
+      <w:r>
+        <w:rPr>
+          <w:b w:val="0"/>
+          <w:color w:val="000000"/>
+          <w:sz w:val="28"/>
+        </w:rPr>
+        <w:t xml:space="preserve"> De to bordene </w:t>
+      </w:r>
+      <w:r>
+        <w:rPr>
+          <w:i/>
+          <w:color w:val="CC0000"/>
+          <w:sz w:val="22"/>
+        </w:rPr>
+        <w:t>[pek]</w:t>
+      </w:r>
+      <w:r>
+        <w:rPr>
+          <w:b w:val="0"/>
+          <w:color w:val="000000"/>
+          <w:sz w:val="28"/>
+        </w:rPr>
+        <w:t xml:space="preserve"> flyttes for å gi plass, så hold dem gjerne klare.</w:t>
       </w:r>
     </w:p>
     <w:p>

</xml_diff>

<commit_message>
Kort-nummer pr. seksjon + avsluttende hilsen til Anders
- Word: hver seksjon får et grått [N]-kortnummer i overskriften, så
  kortene er lette å holde i rekkefølge etter klipping.
- Manus: ny avsluttende hilsen til Anders (forbilde for jaktlaget/familien/
  Vinger-kompisene, «kan til og med smi en spiker», «ingen større rettesnor
  på at man er på rett sted i livet»), plassert som siste toastmaster-ord
  etter Broderskapets show, før Händerna + omrigg.

Co-Authored-By: Claude Opus 4.8 <noreply@anthropic.com>
Claude-Session: https://claude.ai/code/session_01HH3S616y2naKXPCG25iHhw
</commit_message>
<xml_diff>
--- a/manus.docx
+++ b/manus.docx
@@ -26,6 +26,14 @@
       <w:r>
         <w:rPr>
           <w:b/>
+          <w:color w:val="555555"/>
+          <w:sz w:val="26"/>
+        </w:rPr>
+        <w:t xml:space="preserve">[1]  </w:t>
+      </w:r>
+      <w:r>
+        <w:rPr>
+          <w:b/>
           <w:color w:val="CC0000"/>
           <w:sz w:val="26"/>
         </w:rPr>
@@ -175,6 +183,14 @@
       <w:r>
         <w:rPr>
           <w:b/>
+          <w:color w:val="555555"/>
+          <w:sz w:val="26"/>
+        </w:rPr>
+        <w:t xml:space="preserve">[2]  </w:t>
+      </w:r>
+      <w:r>
+        <w:rPr>
+          <w:b/>
           <w:color w:val="CC0000"/>
           <w:sz w:val="26"/>
         </w:rPr>
@@ -548,6 +564,14 @@
       <w:r>
         <w:rPr>
           <w:b/>
+          <w:color w:val="555555"/>
+          <w:sz w:val="26"/>
+        </w:rPr>
+        <w:t xml:space="preserve">[3]  </w:t>
+      </w:r>
+      <w:r>
+        <w:rPr>
+          <w:b/>
           <w:color w:val="CC0000"/>
           <w:sz w:val="26"/>
         </w:rPr>
@@ -615,6 +639,14 @@
       <w:r>
         <w:rPr>
           <w:b/>
+          <w:color w:val="555555"/>
+          <w:sz w:val="26"/>
+        </w:rPr>
+        <w:t xml:space="preserve">[4]  </w:t>
+      </w:r>
+      <w:r>
+        <w:rPr>
+          <w:b/>
           <w:color w:val="CC0000"/>
           <w:sz w:val="26"/>
         </w:rPr>
@@ -1150,6 +1182,14 @@
       <w:r>
         <w:rPr>
           <w:b/>
+          <w:color w:val="555555"/>
+          <w:sz w:val="26"/>
+        </w:rPr>
+        <w:t xml:space="preserve">[5]  </w:t>
+      </w:r>
+      <w:r>
+        <w:rPr>
+          <w:b/>
           <w:color w:val="CC0000"/>
           <w:sz w:val="26"/>
         </w:rPr>
@@ -1487,6 +1527,14 @@
       <w:r>
         <w:rPr>
           <w:b/>
+          <w:color w:val="555555"/>
+          <w:sz w:val="26"/>
+        </w:rPr>
+        <w:t xml:space="preserve">[6]  </w:t>
+      </w:r>
+      <w:r>
+        <w:rPr>
+          <w:b/>
           <w:color w:val="CC0000"/>
           <w:sz w:val="26"/>
         </w:rPr>
@@ -1670,6 +1718,14 @@
       <w:r>
         <w:rPr>
           <w:b/>
+          <w:color w:val="555555"/>
+          <w:sz w:val="26"/>
+        </w:rPr>
+        <w:t xml:space="preserve">[7]  </w:t>
+      </w:r>
+      <w:r>
+        <w:rPr>
+          <w:b/>
           <w:color w:val="CC0000"/>
           <w:sz w:val="26"/>
         </w:rPr>
@@ -1921,6 +1977,14 @@
       <w:r>
         <w:rPr>
           <w:b/>
+          <w:color w:val="555555"/>
+          <w:sz w:val="26"/>
+        </w:rPr>
+        <w:t xml:space="preserve">[8]  </w:t>
+      </w:r>
+      <w:r>
+        <w:rPr>
+          <w:b/>
           <w:color w:val="CC0000"/>
           <w:sz w:val="26"/>
         </w:rPr>
@@ -2098,6 +2162,14 @@
       <w:r>
         <w:rPr>
           <w:b/>
+          <w:color w:val="555555"/>
+          <w:sz w:val="26"/>
+        </w:rPr>
+        <w:t xml:space="preserve">[9]  </w:t>
+      </w:r>
+      <w:r>
+        <w:rPr>
+          <w:b/>
           <w:color w:val="CC0000"/>
           <w:sz w:val="26"/>
         </w:rPr>
@@ -2179,6 +2251,14 @@
       <w:r>
         <w:rPr>
           <w:b/>
+          <w:color w:val="555555"/>
+          <w:sz w:val="26"/>
+        </w:rPr>
+        <w:t xml:space="preserve">[10]  </w:t>
+      </w:r>
+      <w:r>
+        <w:rPr>
+          <w:b/>
           <w:color w:val="CC0000"/>
           <w:sz w:val="26"/>
         </w:rPr>
@@ -2420,6 +2500,14 @@
       <w:r>
         <w:rPr>
           <w:b/>
+          <w:color w:val="555555"/>
+          <w:sz w:val="26"/>
+        </w:rPr>
+        <w:t xml:space="preserve">[11]  </w:t>
+      </w:r>
+      <w:r>
+        <w:rPr>
+          <w:b/>
           <w:color w:val="CC0000"/>
           <w:sz w:val="26"/>
         </w:rPr>
@@ -2701,6 +2789,14 @@
       <w:r>
         <w:rPr>
           <w:b/>
+          <w:color w:val="555555"/>
+          <w:sz w:val="26"/>
+        </w:rPr>
+        <w:t xml:space="preserve">[12]  </w:t>
+      </w:r>
+      <w:r>
+        <w:rPr>
+          <w:b/>
           <w:color w:val="CC0000"/>
           <w:sz w:val="26"/>
         </w:rPr>
@@ -3004,6 +3100,14 @@
       <w:r>
         <w:rPr>
           <w:b/>
+          <w:color w:val="555555"/>
+          <w:sz w:val="26"/>
+        </w:rPr>
+        <w:t xml:space="preserve">[13]  </w:t>
+      </w:r>
+      <w:r>
+        <w:rPr>
+          <w:b/>
           <w:color w:val="CC0000"/>
           <w:sz w:val="26"/>
         </w:rPr>
@@ -3077,6 +3181,14 @@
       <w:r>
         <w:rPr>
           <w:b/>
+          <w:color w:val="555555"/>
+          <w:sz w:val="26"/>
+        </w:rPr>
+        <w:t xml:space="preserve">[14]  </w:t>
+      </w:r>
+      <w:r>
+        <w:rPr>
+          <w:b/>
           <w:color w:val="CC0000"/>
           <w:sz w:val="26"/>
         </w:rPr>
@@ -3122,6 +3234,14 @@
       <w:r>
         <w:rPr>
           <w:b/>
+          <w:color w:val="555555"/>
+          <w:sz w:val="26"/>
+        </w:rPr>
+        <w:t xml:space="preserve">[15]  </w:t>
+      </w:r>
+      <w:r>
+        <w:rPr>
+          <w:b/>
           <w:color w:val="CC0000"/>
           <w:sz w:val="26"/>
         </w:rPr>
@@ -3303,6 +3423,14 @@
       <w:r>
         <w:rPr>
           <w:b/>
+          <w:color w:val="555555"/>
+          <w:sz w:val="26"/>
+        </w:rPr>
+        <w:t xml:space="preserve">[16]  </w:t>
+      </w:r>
+      <w:r>
+        <w:rPr>
+          <w:b/>
           <w:color w:val="CC0000"/>
           <w:sz w:val="26"/>
         </w:rPr>
@@ -3990,6 +4118,14 @@
       <w:r>
         <w:rPr>
           <w:b/>
+          <w:color w:val="555555"/>
+          <w:sz w:val="26"/>
+        </w:rPr>
+        <w:t xml:space="preserve">[17]  </w:t>
+      </w:r>
+      <w:r>
+        <w:rPr>
+          <w:b/>
           <w:color w:val="CC0000"/>
           <w:sz w:val="26"/>
         </w:rPr>
@@ -4551,6 +4687,14 @@
       <w:r>
         <w:rPr>
           <w:b/>
+          <w:color w:val="555555"/>
+          <w:sz w:val="26"/>
+        </w:rPr>
+        <w:t xml:space="preserve">[18]  </w:t>
+      </w:r>
+      <w:r>
+        <w:rPr>
+          <w:b/>
           <w:color w:val="CC0000"/>
           <w:sz w:val="26"/>
         </w:rPr>
@@ -4802,6 +4946,14 @@
       <w:r>
         <w:rPr>
           <w:b/>
+          <w:color w:val="555555"/>
+          <w:sz w:val="26"/>
+        </w:rPr>
+        <w:t xml:space="preserve">[19]  </w:t>
+      </w:r>
+      <w:r>
+        <w:rPr>
+          <w:b/>
           <w:color w:val="CC0000"/>
           <w:sz w:val="26"/>
         </w:rPr>
@@ -5019,6 +5171,14 @@
       <w:r>
         <w:rPr>
           <w:b/>
+          <w:color w:val="555555"/>
+          <w:sz w:val="26"/>
+        </w:rPr>
+        <w:t xml:space="preserve">[20]  </w:t>
+      </w:r>
+      <w:r>
+        <w:rPr>
+          <w:b/>
           <w:color w:val="CC0000"/>
           <w:sz w:val="26"/>
         </w:rPr>
@@ -5106,6 +5266,14 @@
       <w:r>
         <w:rPr>
           <w:b/>
+          <w:color w:val="555555"/>
+          <w:sz w:val="26"/>
+        </w:rPr>
+        <w:t xml:space="preserve">[21]  </w:t>
+      </w:r>
+      <w:r>
+        <w:rPr>
+          <w:b/>
           <w:color w:val="CC0000"/>
           <w:sz w:val="26"/>
         </w:rPr>
@@ -5335,6 +5503,14 @@
       <w:r>
         <w:rPr>
           <w:b/>
+          <w:color w:val="555555"/>
+          <w:sz w:val="26"/>
+        </w:rPr>
+        <w:t xml:space="preserve">[22]  </w:t>
+      </w:r>
+      <w:r>
+        <w:rPr>
+          <w:b/>
           <w:color w:val="CC0000"/>
           <w:sz w:val="26"/>
         </w:rPr>
@@ -5710,6 +5886,14 @@
       <w:r>
         <w:rPr>
           <w:b/>
+          <w:color w:val="555555"/>
+          <w:sz w:val="26"/>
+        </w:rPr>
+        <w:t xml:space="preserve">[23]  </w:t>
+      </w:r>
+      <w:r>
+        <w:rPr>
+          <w:b/>
           <w:color w:val="CC0000"/>
           <w:sz w:val="26"/>
         </w:rPr>
@@ -5985,6 +6169,14 @@
       <w:r>
         <w:rPr>
           <w:b/>
+          <w:color w:val="555555"/>
+          <w:sz w:val="26"/>
+        </w:rPr>
+        <w:t xml:space="preserve">[24]  </w:t>
+      </w:r>
+      <w:r>
+        <w:rPr>
+          <w:b/>
           <w:color w:val="CC0000"/>
           <w:sz w:val="26"/>
         </w:rPr>
@@ -6058,6 +6250,14 @@
       <w:r>
         <w:rPr>
           <w:b/>
+          <w:color w:val="555555"/>
+          <w:sz w:val="26"/>
+        </w:rPr>
+        <w:t xml:space="preserve">[25]  </w:t>
+      </w:r>
+      <w:r>
+        <w:rPr>
+          <w:b/>
           <w:color w:val="CC0000"/>
           <w:sz w:val="26"/>
         </w:rPr>
@@ -6103,6 +6303,14 @@
       <w:r>
         <w:rPr>
           <w:b/>
+          <w:color w:val="555555"/>
+          <w:sz w:val="26"/>
+        </w:rPr>
+        <w:t xml:space="preserve">[26]  </w:t>
+      </w:r>
+      <w:r>
+        <w:rPr>
+          <w:b/>
           <w:color w:val="CC0000"/>
           <w:sz w:val="26"/>
         </w:rPr>
@@ -6134,6 +6342,14 @@
       <w:r>
         <w:rPr>
           <w:b/>
+          <w:color w:val="555555"/>
+          <w:sz w:val="26"/>
+        </w:rPr>
+        <w:t xml:space="preserve">[27]  </w:t>
+      </w:r>
+      <w:r>
+        <w:rPr>
+          <w:b/>
           <w:color w:val="CC0000"/>
           <w:sz w:val="26"/>
         </w:rPr>
@@ -6265,6 +6481,14 @@
       <w:r>
         <w:rPr>
           <w:b/>
+          <w:color w:val="555555"/>
+          <w:sz w:val="26"/>
+        </w:rPr>
+        <w:t xml:space="preserve">[28]  </w:t>
+      </w:r>
+      <w:r>
+        <w:rPr>
+          <w:b/>
           <w:color w:val="CC0000"/>
           <w:sz w:val="26"/>
         </w:rPr>
@@ -6410,6 +6634,14 @@
       <w:r>
         <w:rPr>
           <w:b/>
+          <w:color w:val="555555"/>
+          <w:sz w:val="26"/>
+        </w:rPr>
+        <w:t xml:space="preserve">[29]  </w:t>
+      </w:r>
+      <w:r>
+        <w:rPr>
+          <w:b/>
           <w:color w:val="CC0000"/>
           <w:sz w:val="26"/>
         </w:rPr>
@@ -6541,6 +6773,14 @@
       <w:r>
         <w:rPr>
           <w:b/>
+          <w:color w:val="555555"/>
+          <w:sz w:val="26"/>
+        </w:rPr>
+        <w:t xml:space="preserve">[30]  </w:t>
+      </w:r>
+      <w:r>
+        <w:rPr>
+          <w:b/>
           <w:color w:val="CC0000"/>
           <w:sz w:val="26"/>
         </w:rPr>
@@ -6658,10 +6898,18 @@
       <w:r>
         <w:rPr>
           <w:b/>
+          <w:color w:val="555555"/>
+          <w:sz w:val="26"/>
+        </w:rPr>
+        <w:t xml:space="preserve">[31]  </w:t>
+      </w:r>
+      <w:r>
+        <w:rPr>
+          <w:b/>
           <w:color w:val="CC0000"/>
           <w:sz w:val="26"/>
         </w:rPr>
-        <w:t>Avslutning — Händerna mot himmelen + omrigg til dans</w:t>
+        <w:t>Avsluttende hilsen — til Anders</w:t>
       </w:r>
     </w:p>
     <w:p>
@@ -6675,7 +6923,21 @@
           <w:color w:val="CC0000"/>
           <w:sz w:val="20"/>
         </w:rPr>
-        <w:t xml:space="preserve">[Etter Broderskapets show. Händerna mot himmelen spilles. Deretter 15–20 min omrigg der dansegulvet gjøres klart – de to bordene </w:t>
+        <w:t>[Toastmasterens siste, varme ord. Rolig og oppriktig. Hold blikket på Anders.]</w:t>
+      </w:r>
+    </w:p>
+    <w:p>
+      <w:pPr>
+        <w:keepNext/>
+        <w:keepLines/>
+      </w:pPr>
+      <w:r>
+        <w:rPr>
+          <w:i/>
+          <w:color w:val="CC0000"/>
+          <w:sz w:val="20"/>
+        </w:rPr>
+        <w:t>(varm)</w:t>
       </w:r>
       <w:r>
         <w:rPr>
@@ -6683,15 +6945,21 @@
           <w:color w:val="000000"/>
           <w:sz w:val="25"/>
         </w:rPr>
-        <w:t>[spesifiser hvilke]</w:t>
-      </w:r>
+        <w:t xml:space="preserve"> En stor applaus til Broderskapet Unity!</w:t>
+      </w:r>
+    </w:p>
+    <w:p>
+      <w:pPr>
+        <w:keepNext/>
+        <w:keepLines/>
+      </w:pPr>
       <w:r>
         <w:rPr>
           <w:i/>
           <w:color w:val="CC0000"/>
           <w:sz w:val="20"/>
         </w:rPr>
-        <w:t xml:space="preserve"> flyttes.]</w:t>
+        <w:t>(beat)</w:t>
       </w:r>
     </w:p>
     <w:p>
@@ -6705,7 +6973,7 @@
           <w:color w:val="CC0000"/>
           <w:sz w:val="20"/>
         </w:rPr>
-        <w:t>(varm)</w:t>
+        <w:t>(varm, personlig)</w:t>
       </w:r>
       <w:r>
         <w:rPr>
@@ -6713,7 +6981,7 @@
           <w:color w:val="000000"/>
           <w:sz w:val="25"/>
         </w:rPr>
-        <w:t xml:space="preserve"> En stor applaus til Broderskapet Unity!</w:t>
+        <w:t xml:space="preserve"> Og helt til slutt vil jeg si én ting.</w:t>
       </w:r>
     </w:p>
     <w:p>
@@ -6727,7 +6995,7 @@
           <w:color w:val="CC0000"/>
           <w:sz w:val="20"/>
         </w:rPr>
-        <w:t>(energi)</w:t>
+        <w:t>(beat)</w:t>
       </w:r>
       <w:r>
         <w:rPr>
@@ -6735,15 +7003,21 @@
           <w:color w:val="000000"/>
           <w:sz w:val="25"/>
         </w:rPr>
-        <w:t xml:space="preserve"> Og da løfter vi taket sammen – </w:t>
-      </w:r>
-      <w:r>
-        <w:rPr>
-          <w:b/>
-          <w:color w:val="000000"/>
-          <w:sz w:val="25"/>
-        </w:rPr>
-        <w:t>Händerna mot himmelen</w:t>
+        <w:t xml:space="preserve"> Jeg har snakket med mange i forkant av denne kvelden – familien, gutta fra Vinger, jaktlaget.</w:t>
+      </w:r>
+    </w:p>
+    <w:p>
+      <w:pPr>
+        <w:keepNext/>
+        <w:keepLines/>
+      </w:pPr>
+      <w:r>
+        <w:rPr>
+          <w:i/>
+          <w:color w:val="CC0000"/>
+          <w:sz w:val="20"/>
+        </w:rPr>
+        <w:t>(beat)</w:t>
       </w:r>
       <w:r>
         <w:rPr>
@@ -6751,7 +7025,7 @@
           <w:color w:val="000000"/>
           <w:sz w:val="25"/>
         </w:rPr>
-        <w:t>!</w:t>
+        <w:t xml:space="preserve"> Og jeg tror ikke du helt skjønner det selv, Anders – hvilket forbilde du er for folk.</w:t>
       </w:r>
     </w:p>
     <w:p>
@@ -6765,21 +7039,23 @@
           <w:color w:val="CC0000"/>
           <w:sz w:val="20"/>
         </w:rPr>
-        <w:t>[Händerna mot himmelen spilles – syng og dans med.]</w:t>
-      </w:r>
-    </w:p>
-    <w:p>
-      <w:pPr>
-        <w:keepNext/>
-        <w:keepLines/>
-      </w:pPr>
+        <w:t>(varm)</w:t>
+      </w:r>
+      <w:r>
+        <w:rPr>
+          <w:b w:val="0"/>
+          <w:color w:val="000000"/>
+          <w:sz w:val="25"/>
+        </w:rPr>
+        <w:t xml:space="preserve"> Du er positiv. Du lytter. </w:t>
+      </w:r>
       <w:r>
         <w:rPr>
           <w:i/>
           <w:color w:val="CC0000"/>
           <w:sz w:val="20"/>
         </w:rPr>
-        <w:t>(praktisk, vennlig)</w:t>
+        <w:t>(beat)</w:t>
       </w:r>
       <w:r>
         <w:rPr>
@@ -6787,15 +7063,21 @@
           <w:color w:val="000000"/>
           <w:sz w:val="25"/>
         </w:rPr>
-        <w:t xml:space="preserve"> Mens vi rigger om til dansegulv – det tar en 15–20 minutter – er det fritt fram å strekke på beina, ta litt frisk luft eller fylle glasset. </w:t>
-      </w:r>
+        <w:t xml:space="preserve"> Og nå snakker jeg på vegne av jaktlaget, familien og kompisene fra Vinger: du er et forbilde, Anders.</w:t>
+      </w:r>
+    </w:p>
+    <w:p>
+      <w:pPr>
+        <w:keepNext/>
+        <w:keepLines/>
+      </w:pPr>
       <w:r>
         <w:rPr>
           <w:i/>
           <w:color w:val="CC0000"/>
           <w:sz w:val="20"/>
         </w:rPr>
-        <w:t>(beat)</w:t>
+        <w:t>(tørr, lite smil)</w:t>
       </w:r>
       <w:r>
         <w:rPr>
@@ -6803,15 +7085,35 @@
           <w:color w:val="000000"/>
           <w:sz w:val="25"/>
         </w:rPr>
-        <w:t xml:space="preserve"> De to bordene </w:t>
-      </w:r>
+        <w:t xml:space="preserve"> Du kan til og med smi en spiker.</w:t>
+      </w:r>
+    </w:p>
+    <w:p>
+      <w:pPr>
+        <w:keepNext/>
+        <w:keepLines/>
+      </w:pPr>
       <w:r>
         <w:rPr>
           <w:i/>
           <w:color w:val="CC0000"/>
           <w:sz w:val="20"/>
         </w:rPr>
-        <w:t>[pek]</w:t>
+        <w:t>(LAND – 3 sek)</w:t>
+      </w:r>
+    </w:p>
+    <w:p>
+      <w:pPr>
+        <w:keepNext/>
+        <w:keepLines/>
+      </w:pPr>
+      <w:r>
+        <w:rPr>
+          <w:i/>
+          <w:color w:val="CC0000"/>
+          <w:sz w:val="20"/>
+        </w:rPr>
+        <w:t>(varm)</w:t>
       </w:r>
       <w:r>
         <w:rPr>
@@ -6819,7 +7121,7 @@
           <w:color w:val="000000"/>
           <w:sz w:val="25"/>
         </w:rPr>
-        <w:t xml:space="preserve"> flyttes for å gi plass, så hold dem gjerne klare.</w:t>
+        <w:t xml:space="preserve"> Og det finnes vel ikke en større rettesnor på at man er på akkurat rett sted i livet.</w:t>
       </w:r>
     </w:p>
     <w:p>
@@ -6844,6 +7146,189 @@
         <w:keepNext/>
         <w:keepLines/>
       </w:pPr>
+      <w:r>
+        <w:rPr>
+          <w:b/>
+          <w:color w:val="555555"/>
+          <w:sz w:val="26"/>
+        </w:rPr>
+        <w:t xml:space="preserve">[32]  </w:t>
+      </w:r>
+      <w:r>
+        <w:rPr>
+          <w:b/>
+          <w:color w:val="CC0000"/>
+          <w:sz w:val="26"/>
+        </w:rPr>
+        <w:t>Avslutning — Händerna mot himmelen + omrigg til dans</w:t>
+      </w:r>
+    </w:p>
+    <w:p>
+      <w:pPr>
+        <w:keepNext/>
+        <w:keepLines/>
+      </w:pPr>
+      <w:r>
+        <w:rPr>
+          <w:i/>
+          <w:color w:val="CC0000"/>
+          <w:sz w:val="20"/>
+        </w:rPr>
+        <w:t xml:space="preserve">[Etter den avsluttende hilsenen. Händerna mot himmelen spilles. Deretter 15–20 min omrigg der dansegulvet gjøres klart – de to bordene </w:t>
+      </w:r>
+      <w:r>
+        <w:rPr>
+          <w:b w:val="0"/>
+          <w:color w:val="000000"/>
+          <w:sz w:val="25"/>
+        </w:rPr>
+        <w:t>[spesifiser hvilke]</w:t>
+      </w:r>
+      <w:r>
+        <w:rPr>
+          <w:i/>
+          <w:color w:val="CC0000"/>
+          <w:sz w:val="20"/>
+        </w:rPr>
+        <w:t xml:space="preserve"> flyttes.]</w:t>
+      </w:r>
+    </w:p>
+    <w:p>
+      <w:pPr>
+        <w:keepNext/>
+        <w:keepLines/>
+      </w:pPr>
+      <w:r>
+        <w:rPr>
+          <w:i/>
+          <w:color w:val="CC0000"/>
+          <w:sz w:val="20"/>
+        </w:rPr>
+        <w:t>(energi)</w:t>
+      </w:r>
+      <w:r>
+        <w:rPr>
+          <w:b w:val="0"/>
+          <w:color w:val="000000"/>
+          <w:sz w:val="25"/>
+        </w:rPr>
+        <w:t xml:space="preserve"> Og da løfter vi taket sammen – </w:t>
+      </w:r>
+      <w:r>
+        <w:rPr>
+          <w:b/>
+          <w:color w:val="000000"/>
+          <w:sz w:val="25"/>
+        </w:rPr>
+        <w:t>Händerna mot himmelen</w:t>
+      </w:r>
+      <w:r>
+        <w:rPr>
+          <w:b w:val="0"/>
+          <w:color w:val="000000"/>
+          <w:sz w:val="25"/>
+        </w:rPr>
+        <w:t>!</w:t>
+      </w:r>
+    </w:p>
+    <w:p>
+      <w:pPr>
+        <w:keepNext/>
+        <w:keepLines/>
+      </w:pPr>
+      <w:r>
+        <w:rPr>
+          <w:i/>
+          <w:color w:val="CC0000"/>
+          <w:sz w:val="20"/>
+        </w:rPr>
+        <w:t>[Händerna mot himmelen spilles – syng og dans med.]</w:t>
+      </w:r>
+    </w:p>
+    <w:p>
+      <w:pPr>
+        <w:keepNext/>
+        <w:keepLines/>
+      </w:pPr>
+      <w:r>
+        <w:rPr>
+          <w:i/>
+          <w:color w:val="CC0000"/>
+          <w:sz w:val="20"/>
+        </w:rPr>
+        <w:t>(praktisk, vennlig)</w:t>
+      </w:r>
+      <w:r>
+        <w:rPr>
+          <w:b w:val="0"/>
+          <w:color w:val="000000"/>
+          <w:sz w:val="25"/>
+        </w:rPr>
+        <w:t xml:space="preserve"> Mens vi rigger om til dansegulv – det tar en 15–20 minutter – er det fritt fram å strekke på beina, ta litt frisk luft eller fylle glasset. </w:t>
+      </w:r>
+      <w:r>
+        <w:rPr>
+          <w:i/>
+          <w:color w:val="CC0000"/>
+          <w:sz w:val="20"/>
+        </w:rPr>
+        <w:t>(beat)</w:t>
+      </w:r>
+      <w:r>
+        <w:rPr>
+          <w:b w:val="0"/>
+          <w:color w:val="000000"/>
+          <w:sz w:val="25"/>
+        </w:rPr>
+        <w:t xml:space="preserve"> De to bordene </w:t>
+      </w:r>
+      <w:r>
+        <w:rPr>
+          <w:i/>
+          <w:color w:val="CC0000"/>
+          <w:sz w:val="20"/>
+        </w:rPr>
+        <w:t>[pek]</w:t>
+      </w:r>
+      <w:r>
+        <w:rPr>
+          <w:b w:val="0"/>
+          <w:color w:val="000000"/>
+          <w:sz w:val="25"/>
+        </w:rPr>
+        <w:t xml:space="preserve"> flyttes for å gi plass, så hold dem gjerne klare.</w:t>
+      </w:r>
+    </w:p>
+    <w:p>
+      <w:pPr>
+        <w:spacing w:before="140" w:after="140"/>
+        <w:pBdr>
+          <w:bottom w:val="dashed" w:sz="6" w:space="4" w:color="999999"/>
+        </w:pBdr>
+        <w:keepLines/>
+      </w:pPr>
+      <w:r>
+        <w:rPr>
+          <w:color w:val="555555"/>
+          <w:sz w:val="18"/>
+        </w:rPr>
+        <w:t xml:space="preserve">✂     </w:t>
+      </w:r>
+    </w:p>
+    <w:p>
+      <w:pPr>
+        <w:spacing w:before="40"/>
+        <w:keepNext/>
+        <w:keepLines/>
+      </w:pPr>
+      <w:r>
+        <w:rPr>
+          <w:b/>
+          <w:color w:val="555555"/>
+          <w:sz w:val="26"/>
+        </w:rPr>
+        <w:t xml:space="preserve">[33]  </w:t>
+      </w:r>
       <w:r>
         <w:rPr>
           <w:b/>

</xml_diff>

<commit_message>
Avsluttende hilsen: trekk inn Michelle + paret som forbilde for forhold
Legger til linje som binder Anders og Michelle sammen i hilsenen: «sammen
med Michelle er dere et forbilde for mange på hvordan et godt og vellykket
forhold ser ut», med blikk på brudeparet før dansen.

Co-Authored-By: Claude Opus 4.8 <noreply@anthropic.com>
Claude-Session: https://claude.ai/code/session_01HH3S616y2naKXPCG25iHhw
</commit_message>
<xml_diff>
--- a/manus.docx
+++ b/manus.docx
@@ -7122,6 +7122,42 @@
           <w:sz w:val="25"/>
         </w:rPr>
         <w:t xml:space="preserve"> Og det finnes vel ikke en større rettesnor på at man er på akkurat rett sted i livet.</w:t>
+      </w:r>
+    </w:p>
+    <w:p>
+      <w:pPr>
+        <w:keepNext/>
+        <w:keepLines/>
+      </w:pPr>
+      <w:r>
+        <w:rPr>
+          <w:i/>
+          <w:color w:val="CC0000"/>
+          <w:sz w:val="20"/>
+        </w:rPr>
+        <w:t>(varm, til begge nå – blikk på brudeparet)</w:t>
+      </w:r>
+      <w:r>
+        <w:rPr>
+          <w:b w:val="0"/>
+          <w:color w:val="000000"/>
+          <w:sz w:val="25"/>
+        </w:rPr>
+        <w:t xml:space="preserve"> Og Anders – sammen med Michelle er dere noe enda større: et forbilde for mange på hvordan et godt og vellykket forhold ser ut.</w:t>
+      </w:r>
+    </w:p>
+    <w:p>
+      <w:pPr>
+        <w:keepNext/>
+        <w:keepLines/>
+      </w:pPr>
+      <w:r>
+        <w:rPr>
+          <w:i/>
+          <w:color w:val="CC0000"/>
+          <w:sz w:val="20"/>
+        </w:rPr>
+        <w:t>(LAND – 3 sek. Hold blikket på dem.)</w:t>
       </w:r>
     </w:p>
     <w:p>

</xml_diff>

<commit_message>
Logg gjennomgang 3 + fang nødutgang-adlib
- gjennomganger.md: logget gj.gang 3 (full Stikk 1 + Werner + FF) – sterk
  levering, datteren Michelle + Brudens far inne, bestefar satt.
- manus §E: erstattet bleke «[peker]»-nødutgangslinja med den tørre
  ad-lib-en fra leveringen («vindu eller dør … jeg er litt fan av at dere
  kommer dere ut»).

Co-Authored-By: Claude Opus 4.8 <noreply@anthropic.com>
Claude-Session: https://claude.ai/code/session_01HH3S616y2naKXPCG25iHhw
</commit_message>
<xml_diff>
--- a/manus.docx
+++ b/manus.docx
@@ -1475,7 +1475,7 @@
           <w:color w:val="CC0000"/>
           <w:sz w:val="20"/>
         </w:rPr>
-        <w:t>(beat)</w:t>
+        <w:t>(tørr)</w:t>
       </w:r>
       <w:r>
         <w:rPr>
@@ -1483,7 +1483,7 @@
           <w:color w:val="000000"/>
           <w:sz w:val="25"/>
         </w:rPr>
-        <w:t xml:space="preserve"> Nødutgangene er </w:t>
+        <w:t xml:space="preserve"> Nødutgangene: det er vindu, og det er dør. </w:t>
       </w:r>
       <w:r>
         <w:rPr>
@@ -1491,7 +1491,7 @@
           <w:color w:val="CC0000"/>
           <w:sz w:val="20"/>
         </w:rPr>
-        <w:t>[peker]</w:t>
+        <w:t>(beat)</w:t>
       </w:r>
       <w:r>
         <w:rPr>
@@ -1499,7 +1499,23 @@
           <w:color w:val="000000"/>
           <w:sz w:val="25"/>
         </w:rPr>
-        <w:t>. Hvis det brenner, går vi ut der – og hjelper hverandre.</w:t>
+        <w:t xml:space="preserve"> Og jeg er egentlig litt fan av at dere kommer dere ut – </w:t>
+      </w:r>
+      <w:r>
+        <w:rPr>
+          <w:i/>
+          <w:color w:val="CC0000"/>
+          <w:sz w:val="20"/>
+        </w:rPr>
+        <w:t>(beat)</w:t>
+      </w:r>
+      <w:r>
+        <w:rPr>
+          <w:b w:val="0"/>
+          <w:color w:val="000000"/>
+          <w:sz w:val="25"/>
+        </w:rPr>
+        <w:t xml:space="preserve"> det er viktig for meg.</w:t>
       </w:r>
     </w:p>
     <w:p>

</xml_diff>

<commit_message>
Anders-hilsen: plant forbilde-frø i Tale 2, pay off i avslutningen
Per valg «begge steder»: kort forbilde-hilsen i Anders' intro (Tale 2) med
«mer om det senere», og den fulle avsluttende hilsenen til slutt som pay
off. Regi-markører kobler plant og pay off.

Co-Authored-By: Claude Opus 4.8 <noreply@anthropic.com>
Claude-Session: https://claude.ai/code/session_01HH3S616y2naKXPCG25iHhw
</commit_message>
<xml_diff>
--- a/manus.docx
+++ b/manus.docx
@@ -2454,6 +2454,58 @@
       </w:pPr>
       <w:r>
         <w:rPr>
+          <w:i/>
+          <w:color w:val="CC0000"/>
+          <w:sz w:val="20"/>
+        </w:rPr>
+        <w:t>(varm, oppriktig – skift tone)</w:t>
+      </w:r>
+      <w:r>
+        <w:rPr>
+          <w:b w:val="0"/>
+          <w:color w:val="000000"/>
+          <w:sz w:val="25"/>
+        </w:rPr>
+        <w:t xml:space="preserve"> Men spøk til side et øyeblikk: jeg har snakket med jaktlaget og gutta fra Vinger i forkant – og jeg tror ikke du helt skjønner selv hvilket forbilde du er for folk, Anders. </w:t>
+      </w:r>
+      <w:r>
+        <w:rPr>
+          <w:i/>
+          <w:color w:val="CC0000"/>
+          <w:sz w:val="20"/>
+        </w:rPr>
+        <w:t>(beat)</w:t>
+      </w:r>
+      <w:r>
+        <w:rPr>
+          <w:b w:val="0"/>
+          <w:color w:val="000000"/>
+          <w:sz w:val="25"/>
+        </w:rPr>
+        <w:t xml:space="preserve"> Mer om det senere i kveld.</w:t>
+      </w:r>
+    </w:p>
+    <w:p>
+      <w:pPr>
+        <w:keepNext/>
+        <w:keepLines/>
+      </w:pPr>
+      <w:r>
+        <w:rPr>
+          <w:i/>
+          <w:color w:val="CC0000"/>
+          <w:sz w:val="20"/>
+        </w:rPr>
+        <w:t>[FORBILDE-PLANT: betales ut i «Avsluttende hilsen — til Anders».]</w:t>
+      </w:r>
+    </w:p>
+    <w:p>
+      <w:pPr>
+        <w:keepNext/>
+        <w:keepLines/>
+      </w:pPr>
+      <w:r>
+        <w:rPr>
           <w:b w:val="0"/>
           <w:color w:val="000000"/>
           <w:sz w:val="25"/>
@@ -6939,7 +6991,7 @@
           <w:color w:val="CC0000"/>
           <w:sz w:val="20"/>
         </w:rPr>
-        <w:t>[Toastmasterens siste, varme ord. Rolig og oppriktig. Hold blikket på Anders.]</w:t>
+        <w:t>[Toastmasterens siste, varme ord. Rolig og oppriktig. Hold blikket på Anders. FORBILDE-PAY OFF: frøet ble plantet i Anders' intro (Tale 2, «mer om det senere»).]</w:t>
       </w:r>
     </w:p>
     <w:p>

</xml_diff>

<commit_message>
Stikk2 fra 2015 + Ingrid-detaljer + FF-pitch + Even fyr-opp
- Stikk 2: historien renskrevet og starter nå fra sommeren 2015 (kuttet
  6.-klasse/skoleball-setupen). Helene står fortsatt rett etter historien.
- Ingrid (Tale 7): toppverv i elevorg. ung, håndball, snill, bidratt i
  bryllupet, jobber på Bæreia (krigsinvalide), til Oslo til høsten som
  statsviter.
- FF (Tale 10): bygget om til en skikkelig stigende pitch med callback til
  matpresentasjonen («feminin OG fornem»).
- Even (Tale 6): fyrer opp på slutten i Rumble-stil («EEEVEN!»).

Co-Authored-By: Claude Opus 4.8 <noreply@anthropic.com>
Claude-Session: https://claude.ai/code/session_01HH3S616y2naKXPCG25iHhw
</commit_message>
<xml_diff>
--- a/manus.docx
+++ b/manus.docx
@@ -3502,7 +3502,7 @@
           <w:color w:val="CC0000"/>
           <w:sz w:val="26"/>
         </w:rPr>
-        <w:t>B — Skoleballet og en sommer som nesten avgjorde det (90 sek)</w:t>
+        <w:t>Historien – sommeren 2015 (90 sek)</w:t>
       </w:r>
     </w:p>
     <w:p>
@@ -3516,7 +3516,7 @@
           <w:color w:val="CC0000"/>
           <w:sz w:val="20"/>
         </w:rPr>
-        <w:t>—tempo opp—</w:t>
+        <w:t>(myk, fortrolig)</w:t>
       </w:r>
     </w:p>
     <w:p>
@@ -3530,7 +3530,7 @@
           <w:color w:val="000000"/>
           <w:sz w:val="25"/>
         </w:rPr>
-        <w:t>Det første ekte tegnet kom i 6. klasse.</w:t>
+        <w:t>Vi starter sommeren 2015.</w:t>
       </w:r>
     </w:p>
     <w:p>
@@ -3546,26 +3546,14 @@
         </w:rPr>
         <w:t>(beat)</w:t>
       </w:r>
-    </w:p>
-    <w:p>
-      <w:pPr>
-        <w:keepNext/>
-        <w:keepLines/>
-      </w:pPr>
       <w:r>
         <w:rPr>
           <w:b w:val="0"/>
           <w:color w:val="000000"/>
           <w:sz w:val="25"/>
         </w:rPr>
-        <w:t>Skoleballet.</w:t>
-      </w:r>
-    </w:p>
-    <w:p>
-      <w:pPr>
-        <w:keepNext/>
-        <w:keepLines/>
-      </w:pPr>
+        <w:t xml:space="preserve"> Anders hadde vært interessert i Michelle lenge. </w:t>
+      </w:r>
       <w:r>
         <w:rPr>
           <w:i/>
@@ -3574,61 +3562,51 @@
         </w:rPr>
         <w:t>(beat)</w:t>
       </w:r>
-    </w:p>
-    <w:p>
-      <w:pPr>
-        <w:keepNext/>
-        <w:keepLines/>
-      </w:pPr>
       <w:r>
         <w:rPr>
           <w:b w:val="0"/>
           <w:color w:val="000000"/>
           <w:sz w:val="25"/>
         </w:rPr>
-        <w:t>Anders – tolv år gammel, allerede god på fest.</w:t>
-      </w:r>
-    </w:p>
-    <w:p>
-      <w:pPr>
-        <w:keepNext/>
-        <w:keepLines/>
-      </w:pPr>
+        <w:t xml:space="preserve"> Mer enn hun var i ham.</w:t>
+      </w:r>
+    </w:p>
+    <w:p>
+      <w:pPr>
+        <w:keepNext/>
+        <w:keepLines/>
+      </w:pPr>
+      <w:r>
+        <w:rPr>
+          <w:i/>
+          <w:color w:val="CC0000"/>
+          <w:sz w:val="20"/>
+        </w:rPr>
+        <w:t>(beat)</w:t>
+      </w:r>
       <w:r>
         <w:rPr>
           <w:b w:val="0"/>
           <w:color w:val="000000"/>
           <w:sz w:val="25"/>
         </w:rPr>
-        <w:t>Michelle – tolv år gammel, og hun visste nøyaktig hva hun gjorde.</w:t>
-      </w:r>
-    </w:p>
-    <w:p>
-      <w:pPr>
-        <w:keepNext/>
-        <w:keepLines/>
-      </w:pPr>
+        <w:t xml:space="preserve"> Og til slutt sa han det rett ut: skulle dette ikke bli noe, kunne de ikke henge så mye. </w:t>
+      </w:r>
       <w:r>
         <w:rPr>
           <w:i/>
           <w:color w:val="CC0000"/>
           <w:sz w:val="20"/>
         </w:rPr>
-        <w:t>(2 sek)</w:t>
-      </w:r>
-    </w:p>
-    <w:p>
-      <w:pPr>
-        <w:keepNext/>
-        <w:keepLines/>
-      </w:pPr>
+        <w:t>(beat)</w:t>
+      </w:r>
       <w:r>
         <w:rPr>
           <w:b w:val="0"/>
           <w:color w:val="000000"/>
           <w:sz w:val="25"/>
         </w:rPr>
-        <w:t>Det er en av Cathrine og Anettes favoritthistorier.</w:t>
+        <w:t xml:space="preserve"> «Jeg har følelser for deg – jeg må få litt avstand, så jeg kommer meg over deg.»</w:t>
       </w:r>
     </w:p>
     <w:p>
@@ -3644,47 +3622,51 @@
         </w:rPr>
         <w:t>(beat)</w:t>
       </w:r>
-    </w:p>
-    <w:p>
-      <w:pPr>
-        <w:keepNext/>
-        <w:keepLines/>
-      </w:pPr>
       <w:r>
         <w:rPr>
           <w:b w:val="0"/>
           <w:color w:val="000000"/>
           <w:sz w:val="25"/>
         </w:rPr>
-        <w:t>Sitatet fra storesøstrene har gått igjen i alle familieselskaper siden:</w:t>
-      </w:r>
-    </w:p>
-    <w:p>
-      <w:pPr>
-        <w:keepNext/>
-        <w:keepLines/>
-      </w:pPr>
+        <w:t xml:space="preserve"> Så de tok avstand.</w:t>
+      </w:r>
+    </w:p>
+    <w:p>
+      <w:pPr>
+        <w:keepNext/>
+        <w:keepLines/>
+      </w:pPr>
+      <w:r>
+        <w:rPr>
+          <w:i/>
+          <w:color w:val="CC0000"/>
+          <w:sz w:val="20"/>
+        </w:rPr>
+        <w:t>(beat)</w:t>
+      </w:r>
       <w:r>
         <w:rPr>
           <w:b w:val="0"/>
           <w:color w:val="000000"/>
           <w:sz w:val="25"/>
         </w:rPr>
-        <w:t>«Hu player deg rundt lillefingern, Anders.»</w:t>
-      </w:r>
-    </w:p>
-    <w:p>
-      <w:pPr>
-        <w:keepNext/>
-        <w:keepLines/>
-      </w:pPr>
+        <w:t xml:space="preserve"> Fem, seks uker uten et ord. </w:t>
+      </w:r>
       <w:r>
         <w:rPr>
           <w:i/>
           <w:color w:val="CC0000"/>
           <w:sz w:val="20"/>
         </w:rPr>
-        <w:t>(beat – la latter komme)</w:t>
+        <w:t>(beat)</w:t>
+      </w:r>
+      <w:r>
+        <w:rPr>
+          <w:b w:val="0"/>
+          <w:color w:val="000000"/>
+          <w:sz w:val="25"/>
+        </w:rPr>
+        <w:t xml:space="preserve"> En hel sommerferie.</w:t>
       </w:r>
     </w:p>
     <w:p>
@@ -3698,35 +3680,31 @@
           <w:color w:val="CC0000"/>
           <w:sz w:val="20"/>
         </w:rPr>
-        <w:t>(varm)</w:t>
-      </w:r>
-    </w:p>
-    <w:p>
-      <w:pPr>
-        <w:keepNext/>
-        <w:keepLines/>
-      </w:pPr>
+        <w:t>(beat)</w:t>
+      </w:r>
       <w:r>
         <w:rPr>
           <w:b w:val="0"/>
           <w:color w:val="000000"/>
           <w:sz w:val="25"/>
         </w:rPr>
-        <w:t>Og det gjorde hun.</w:t>
-      </w:r>
-    </w:p>
-    <w:p>
-      <w:pPr>
-        <w:keepNext/>
-        <w:keepLines/>
-      </w:pPr>
+        <w:t xml:space="preserve"> Stille. </w:t>
+      </w:r>
+      <w:r>
+        <w:rPr>
+          <w:i/>
+          <w:color w:val="CC0000"/>
+          <w:sz w:val="20"/>
+        </w:rPr>
+        <w:t>(dempet)</w:t>
+      </w:r>
       <w:r>
         <w:rPr>
           <w:b w:val="0"/>
           <w:color w:val="000000"/>
           <w:sz w:val="25"/>
         </w:rPr>
-        <w:t>I årevis.</w:t>
+        <w:t xml:space="preserve"> Slutt – trodde vi.</w:t>
       </w:r>
     </w:p>
     <w:p>
@@ -3750,11 +3728,19 @@
       </w:pPr>
       <w:r>
         <w:rPr>
+          <w:b w:val="0"/>
+          <w:color w:val="000000"/>
+          <w:sz w:val="25"/>
+        </w:rPr>
+        <w:t xml:space="preserve">Familien lurte. Vennegjengen lurte. </w:t>
+      </w:r>
+      <w:r>
+        <w:rPr>
           <w:i/>
           <w:color w:val="CC0000"/>
           <w:sz w:val="20"/>
         </w:rPr>
-        <w:t>—tempo ned—</w:t>
+        <w:t>(beat)</w:t>
       </w:r>
       <w:r>
         <w:rPr>
@@ -3762,15 +3748,21 @@
           <w:color w:val="000000"/>
           <w:sz w:val="25"/>
         </w:rPr>
-        <w:t xml:space="preserve"> </w:t>
-      </w:r>
+        <w:t xml:space="preserve"> Werner lurte sannsynligvis også – men sa ingenting.</w:t>
+      </w:r>
+    </w:p>
+    <w:p>
+      <w:pPr>
+        <w:keepNext/>
+        <w:keepLines/>
+      </w:pPr>
       <w:r>
         <w:rPr>
           <w:i/>
           <w:color w:val="CC0000"/>
           <w:sz w:val="20"/>
         </w:rPr>
-        <w:t>—register ned—</w:t>
+        <w:t>(tørr)</w:t>
       </w:r>
       <w:r>
         <w:rPr>
@@ -3778,359 +3770,7 @@
           <w:color w:val="000000"/>
           <w:sz w:val="25"/>
         </w:rPr>
-        <w:t xml:space="preserve"> </w:t>
-      </w:r>
-      <w:r>
-        <w:rPr>
-          <w:i/>
-          <w:color w:val="CC0000"/>
-          <w:sz w:val="20"/>
-        </w:rPr>
-        <w:t>(dempet, alvorlig)</w:t>
-      </w:r>
-    </w:p>
-    <w:p>
-      <w:pPr>
-        <w:keepNext/>
-        <w:keepLines/>
-      </w:pPr>
-      <w:r>
-        <w:rPr>
-          <w:b w:val="0"/>
-          <w:color w:val="000000"/>
-          <w:sz w:val="25"/>
-        </w:rPr>
-        <w:t>Helt til sommeren 2015.</w:t>
-      </w:r>
-    </w:p>
-    <w:p>
-      <w:pPr>
-        <w:keepNext/>
-        <w:keepLines/>
-      </w:pPr>
-      <w:r>
-        <w:rPr>
-          <w:i/>
-          <w:color w:val="CC0000"/>
-          <w:sz w:val="20"/>
-        </w:rPr>
-        <w:t>(LAND – 4 sek. La rytmen bryte.)</w:t>
-      </w:r>
-    </w:p>
-    <w:p>
-      <w:pPr>
-        <w:keepNext/>
-        <w:keepLines/>
-      </w:pPr>
-      <w:r>
-        <w:rPr>
-          <w:i/>
-          <w:color w:val="CC0000"/>
-          <w:sz w:val="20"/>
-        </w:rPr>
-        <w:t>(myk, fortrolig)</w:t>
-      </w:r>
-    </w:p>
-    <w:p>
-      <w:pPr>
-        <w:keepNext/>
-        <w:keepLines/>
-      </w:pPr>
-      <w:r>
-        <w:rPr>
-          <w:b w:val="0"/>
-          <w:color w:val="000000"/>
-          <w:sz w:val="25"/>
-        </w:rPr>
-        <w:t xml:space="preserve">Anders hadde vært interessert lenge. </w:t>
-      </w:r>
-      <w:r>
-        <w:rPr>
-          <w:i/>
-          <w:color w:val="CC0000"/>
-          <w:sz w:val="20"/>
-        </w:rPr>
-        <w:t>(beat)</w:t>
-      </w:r>
-      <w:r>
-        <w:rPr>
-          <w:b w:val="0"/>
-          <w:color w:val="000000"/>
-          <w:sz w:val="25"/>
-        </w:rPr>
-        <w:t xml:space="preserve"> Mer enn Michelle.</w:t>
-      </w:r>
-    </w:p>
-    <w:p>
-      <w:pPr>
-        <w:keepNext/>
-        <w:keepLines/>
-      </w:pPr>
-      <w:r>
-        <w:rPr>
-          <w:i/>
-          <w:color w:val="CC0000"/>
-          <w:sz w:val="20"/>
-        </w:rPr>
-        <w:t>(beat)</w:t>
-      </w:r>
-    </w:p>
-    <w:p>
-      <w:pPr>
-        <w:keepNext/>
-        <w:keepLines/>
-      </w:pPr>
-      <w:r>
-        <w:rPr>
-          <w:b w:val="0"/>
-          <w:color w:val="000000"/>
-          <w:sz w:val="25"/>
-        </w:rPr>
-        <w:t xml:space="preserve">Og til slutt sa han det rett ut: hvis dette ikke skulle bli noe, kunne de ikke henge så mye – </w:t>
-      </w:r>
-      <w:r>
-        <w:rPr>
-          <w:i/>
-          <w:color w:val="CC0000"/>
-          <w:sz w:val="20"/>
-        </w:rPr>
-        <w:t>(beat)</w:t>
-      </w:r>
-      <w:r>
-        <w:rPr>
-          <w:b w:val="0"/>
-          <w:color w:val="000000"/>
-          <w:sz w:val="25"/>
-        </w:rPr>
-        <w:t xml:space="preserve"> «jeg har følelser for deg, og da må jeg få litt avstand, så jeg kommer meg over deg.»</w:t>
-      </w:r>
-    </w:p>
-    <w:p>
-      <w:pPr>
-        <w:keepNext/>
-        <w:keepLines/>
-      </w:pPr>
-      <w:r>
-        <w:rPr>
-          <w:i/>
-          <w:color w:val="CC0000"/>
-          <w:sz w:val="20"/>
-        </w:rPr>
-        <w:t>(beat)</w:t>
-      </w:r>
-    </w:p>
-    <w:p>
-      <w:pPr>
-        <w:keepNext/>
-        <w:keepLines/>
-      </w:pPr>
-      <w:r>
-        <w:rPr>
-          <w:b w:val="0"/>
-          <w:color w:val="000000"/>
-          <w:sz w:val="25"/>
-        </w:rPr>
-        <w:t>Så de tok avstand.</w:t>
-      </w:r>
-    </w:p>
-    <w:p>
-      <w:pPr>
-        <w:keepNext/>
-        <w:keepLines/>
-      </w:pPr>
-      <w:r>
-        <w:rPr>
-          <w:i/>
-          <w:color w:val="CC0000"/>
-          <w:sz w:val="20"/>
-        </w:rPr>
-        <w:t>(beat)</w:t>
-      </w:r>
-    </w:p>
-    <w:p>
-      <w:pPr>
-        <w:keepNext/>
-        <w:keepLines/>
-      </w:pPr>
-      <w:r>
-        <w:rPr>
-          <w:b w:val="0"/>
-          <w:color w:val="000000"/>
-          <w:sz w:val="25"/>
-        </w:rPr>
-        <w:t xml:space="preserve">Fem, seks uker uten et ord. </w:t>
-      </w:r>
-      <w:r>
-        <w:rPr>
-          <w:i/>
-          <w:color w:val="CC0000"/>
-          <w:sz w:val="20"/>
-        </w:rPr>
-        <w:t>(beat)</w:t>
-      </w:r>
-      <w:r>
-        <w:rPr>
-          <w:b w:val="0"/>
-          <w:color w:val="000000"/>
-          <w:sz w:val="25"/>
-        </w:rPr>
-        <w:t xml:space="preserve"> En hel sommerferie.</w:t>
-      </w:r>
-    </w:p>
-    <w:p>
-      <w:pPr>
-        <w:keepNext/>
-        <w:keepLines/>
-      </w:pPr>
-      <w:r>
-        <w:rPr>
-          <w:i/>
-          <w:color w:val="CC0000"/>
-          <w:sz w:val="20"/>
-        </w:rPr>
-        <w:t>(beat)</w:t>
-      </w:r>
-    </w:p>
-    <w:p>
-      <w:pPr>
-        <w:keepNext/>
-        <w:keepLines/>
-      </w:pPr>
-      <w:r>
-        <w:rPr>
-          <w:b w:val="0"/>
-          <w:color w:val="000000"/>
-          <w:sz w:val="25"/>
-        </w:rPr>
-        <w:t>Stille.</w:t>
-      </w:r>
-    </w:p>
-    <w:p>
-      <w:pPr>
-        <w:keepNext/>
-        <w:keepLines/>
-      </w:pPr>
-      <w:r>
-        <w:rPr>
-          <w:i/>
-          <w:color w:val="CC0000"/>
-          <w:sz w:val="20"/>
-        </w:rPr>
-        <w:t>(beat)</w:t>
-      </w:r>
-    </w:p>
-    <w:p>
-      <w:pPr>
-        <w:keepNext/>
-        <w:keepLines/>
-      </w:pPr>
-      <w:r>
-        <w:rPr>
-          <w:i/>
-          <w:color w:val="CC0000"/>
-          <w:sz w:val="20"/>
-        </w:rPr>
-        <w:t>(dempet)</w:t>
-      </w:r>
-      <w:r>
-        <w:rPr>
-          <w:b w:val="0"/>
-          <w:color w:val="000000"/>
-          <w:sz w:val="25"/>
-        </w:rPr>
-        <w:t xml:space="preserve"> Slutt – trodde vi.</w:t>
-      </w:r>
-    </w:p>
-    <w:p>
-      <w:pPr>
-        <w:keepNext/>
-        <w:keepLines/>
-      </w:pPr>
-      <w:r>
-        <w:rPr>
-          <w:i/>
-          <w:color w:val="CC0000"/>
-          <w:sz w:val="20"/>
-        </w:rPr>
-        <w:t>(2 sek)</w:t>
-      </w:r>
-    </w:p>
-    <w:p>
-      <w:pPr>
-        <w:keepNext/>
-        <w:keepLines/>
-      </w:pPr>
-      <w:r>
-        <w:rPr>
-          <w:b w:val="0"/>
-          <w:color w:val="000000"/>
-          <w:sz w:val="25"/>
-        </w:rPr>
-        <w:t>Familien lurte.</w:t>
-      </w:r>
-    </w:p>
-    <w:p>
-      <w:pPr>
-        <w:keepNext/>
-        <w:keepLines/>
-      </w:pPr>
-      <w:r>
-        <w:rPr>
-          <w:b w:val="0"/>
-          <w:color w:val="000000"/>
-          <w:sz w:val="25"/>
-        </w:rPr>
-        <w:t>Vennegjengen lurte.</w:t>
-      </w:r>
-    </w:p>
-    <w:p>
-      <w:pPr>
-        <w:keepNext/>
-        <w:keepLines/>
-      </w:pPr>
-      <w:r>
-        <w:rPr>
-          <w:b w:val="0"/>
-          <w:color w:val="000000"/>
-          <w:sz w:val="25"/>
-        </w:rPr>
-        <w:t>Werner lurte sannsynligvis også – men sa ingenting.</w:t>
-      </w:r>
-    </w:p>
-    <w:p>
-      <w:pPr>
-        <w:keepNext/>
-        <w:keepLines/>
-      </w:pPr>
-      <w:r>
-        <w:rPr>
-          <w:i/>
-          <w:color w:val="CC0000"/>
-          <w:sz w:val="20"/>
-        </w:rPr>
-        <w:t>(beat)</w:t>
-      </w:r>
-    </w:p>
-    <w:p>
-      <w:pPr>
-        <w:keepNext/>
-        <w:keepLines/>
-      </w:pPr>
-      <w:r>
-        <w:rPr>
-          <w:i/>
-          <w:color w:val="CC0000"/>
-          <w:sz w:val="20"/>
-        </w:rPr>
-        <w:t>(tørr)</w:t>
-      </w:r>
-      <w:r>
-        <w:rPr>
-          <w:b w:val="0"/>
-          <w:color w:val="000000"/>
-          <w:sz w:val="25"/>
-        </w:rPr>
-        <w:t xml:space="preserve"> Werner sier sjelden noe.</w:t>
+        <w:t xml:space="preserve"> Werner sier jo sjelden noe.</w:t>
       </w:r>
     </w:p>
     <w:p>
@@ -5509,11 +5149,71 @@
       </w:pPr>
       <w:r>
         <w:rPr>
+          <w:i/>
+          <w:color w:val="CC0000"/>
+          <w:sz w:val="20"/>
+        </w:rPr>
+        <w:t>[FYR OPP til slutt – match «Let's Get Ready to Rumble»-energien. Reis trøkket, høyt volum, boksekamp-annonsør-stil. La Simen dra på.]</w:t>
+      </w:r>
+    </w:p>
+    <w:p>
+      <w:pPr>
+        <w:keepNext/>
+        <w:keepLines/>
+      </w:pPr>
+      <w:r>
+        <w:rPr>
+          <w:i/>
+          <w:color w:val="CC0000"/>
+          <w:sz w:val="20"/>
+        </w:rPr>
+        <w:t>(crescendo, til salen)</w:t>
+      </w:r>
+      <w:r>
+        <w:rPr>
           <w:b w:val="0"/>
           <w:color w:val="000000"/>
           <w:sz w:val="25"/>
         </w:rPr>
-        <w:t xml:space="preserve">Vær så god – brudgommens forlover, </w:t>
+        <w:t xml:space="preserve"> Så da, folkens – gjør dere klare! </w:t>
+      </w:r>
+      <w:r>
+        <w:rPr>
+          <w:i/>
+          <w:color w:val="CC0000"/>
+          <w:sz w:val="20"/>
+        </w:rPr>
+        <w:t>(beat)</w:t>
+      </w:r>
+      <w:r>
+        <w:rPr>
+          <w:b w:val="0"/>
+          <w:color w:val="000000"/>
+          <w:sz w:val="25"/>
+        </w:rPr>
+        <w:t xml:space="preserve"> På vegne av brudgommen, fra ringside …</w:t>
+      </w:r>
+    </w:p>
+    <w:p>
+      <w:pPr>
+        <w:keepNext/>
+        <w:keepLines/>
+      </w:pPr>
+      <w:r>
+        <w:rPr>
+          <w:i/>
+          <w:color w:val="CC0000"/>
+          <w:sz w:val="20"/>
+        </w:rPr>
+        <w:t>(maks)</w:t>
+      </w:r>
+      <w:r>
+        <w:rPr>
+          <w:b w:val="0"/>
+          <w:color w:val="000000"/>
+          <w:sz w:val="25"/>
+        </w:rPr>
+        <w:t xml:space="preserve"> Ta imot brudgommens forlover – </w:t>
       </w:r>
       <w:r>
         <w:rPr>
@@ -5521,15 +5221,7 @@
           <w:color w:val="000000"/>
           <w:sz w:val="25"/>
         </w:rPr>
-        <w:t>Even</w:t>
-      </w:r>
-      <w:r>
-        <w:rPr>
-          <w:b w:val="0"/>
-          <w:color w:val="000000"/>
-          <w:sz w:val="25"/>
-        </w:rPr>
-        <w:t>.</w:t>
+        <w:t>EEEVEN!</w:t>
       </w:r>
     </w:p>
     <w:p>
@@ -5638,7 +5330,7 @@
           <w:color w:val="000000"/>
           <w:sz w:val="25"/>
         </w:rPr>
-        <w:t xml:space="preserve">Ingrid har akkurat lagt russetiden bak seg – og har faktisk prioritert å bruke helga på dette bryllupet, framfor det de fleste attenåringer ville valgt. </w:t>
+        <w:t xml:space="preserve">Ingrid har akkurat lagt russetiden bak seg – men ikke la alderen lure dere: </w:t>
       </w:r>
       <w:r>
         <w:rPr>
@@ -5646,7 +5338,7 @@
           <w:color w:val="CC0000"/>
           <w:sz w:val="20"/>
         </w:rPr>
-        <w:t>(varm)</w:t>
+        <w:t>(beat)</w:t>
       </w:r>
       <w:r>
         <w:rPr>
@@ -5654,7 +5346,83 @@
           <w:color w:val="000000"/>
           <w:sz w:val="25"/>
         </w:rPr>
-        <w:t xml:space="preserve"> Det settes det stor pris på.</w:t>
+        <w:t xml:space="preserve"> hun har allerede hatt toppverv i elevorganisasjonen i ung alder. </w:t>
+      </w:r>
+      <w:r>
+        <w:rPr>
+          <w:i/>
+          <w:color w:val="CC0000"/>
+          <w:sz w:val="20"/>
+        </w:rPr>
+        <w:t>(beat)</w:t>
+      </w:r>
+      <w:r>
+        <w:rPr>
+          <w:b w:val="0"/>
+          <w:color w:val="000000"/>
+          <w:sz w:val="25"/>
+        </w:rPr>
+        <w:t xml:space="preserve"> Håndballspiller, snill som dagen er lang, og hun har bidratt masse i dette bryllupet.</w:t>
+      </w:r>
+    </w:p>
+    <w:p>
+      <w:pPr>
+        <w:keepNext/>
+        <w:keepLines/>
+      </w:pPr>
+      <w:r>
+        <w:rPr>
+          <w:i/>
+          <w:color w:val="CC0000"/>
+          <w:sz w:val="20"/>
+        </w:rPr>
+        <w:t>(varm)</w:t>
+      </w:r>
+      <w:r>
+        <w:rPr>
+          <w:b w:val="0"/>
+          <w:color w:val="000000"/>
+          <w:sz w:val="25"/>
+        </w:rPr>
+        <w:t xml:space="preserve"> Til daglig jobber hun på Bæreia – for krigsinvalide. </w:t>
+      </w:r>
+      <w:r>
+        <w:rPr>
+          <w:i/>
+          <w:color w:val="CC0000"/>
+          <w:sz w:val="20"/>
+        </w:rPr>
+        <w:t>(beat)</w:t>
+      </w:r>
+      <w:r>
+        <w:rPr>
+          <w:b w:val="0"/>
+          <w:color w:val="000000"/>
+          <w:sz w:val="25"/>
+        </w:rPr>
+        <w:t xml:space="preserve"> Og til høsten bærer reisen til Oslo, som kommende statsviter.</w:t>
+      </w:r>
+    </w:p>
+    <w:p>
+      <w:pPr>
+        <w:keepNext/>
+        <w:keepLines/>
+      </w:pPr>
+      <w:r>
+        <w:rPr>
+          <w:i/>
+          <w:color w:val="CC0000"/>
+          <w:sz w:val="20"/>
+        </w:rPr>
+        <w:t>(varm)</w:t>
+      </w:r>
+      <w:r>
+        <w:rPr>
+          <w:b w:val="0"/>
+          <w:color w:val="000000"/>
+          <w:sz w:val="25"/>
+        </w:rPr>
+        <w:t xml:space="preserve"> At hun har prioritert å bruke helga på dette bryllupet, framfor det de fleste attenåringer ville valgt – det settes det stor pris på.</w:t>
       </w:r>
     </w:p>
     <w:p>
@@ -6574,77 +6342,203 @@
           <w:color w:val="CC0000"/>
           <w:sz w:val="20"/>
         </w:rPr>
-        <w:t>[Intro-sang: Voulez-Vous, 20 sek. Tonen skal matche gjengnavnet – elegant, sjarmerende, lett ironisk.]</w:t>
-      </w:r>
-    </w:p>
-    <w:p>
-      <w:pPr>
-        <w:keepNext/>
-        <w:keepLines/>
-      </w:pPr>
+        <w:t>[Intro-sang: Voulez-Vous, 20 sek. Tonen skal matche gjengnavnet – elegant, sjarmerende, lett ironisk. Bygg dette som en skikkelig pitch – la det stige.]</w:t>
+      </w:r>
+    </w:p>
+    <w:p>
+      <w:pPr>
+        <w:keepNext/>
+        <w:keepLines/>
+      </w:pPr>
+      <w:r>
+        <w:rPr>
+          <w:i/>
+          <w:color w:val="CC0000"/>
+          <w:sz w:val="20"/>
+        </w:rPr>
+        <w:t>(tørr)</w:t>
+      </w:r>
       <w:r>
         <w:rPr>
           <w:b w:val="0"/>
           <w:color w:val="000000"/>
           <w:sz w:val="25"/>
         </w:rPr>
-        <w:t>Det finnes vennegjenger med beskjedne navn.</w:t>
-      </w:r>
-    </w:p>
-    <w:p>
-      <w:pPr>
-        <w:keepNext/>
-        <w:keepLines/>
-      </w:pPr>
+        <w:t xml:space="preserve"> De fleste vennegjenger har beskjedne navn. «Gutta». «Tirsdagsklubben». «Vinkjellergjengen».</w:t>
+      </w:r>
+    </w:p>
+    <w:p>
+      <w:pPr>
+        <w:keepNext/>
+        <w:keepLines/>
+      </w:pPr>
+      <w:r>
+        <w:rPr>
+          <w:i/>
+          <w:color w:val="CC0000"/>
+          <w:sz w:val="20"/>
+        </w:rPr>
+        <w:t>(beat)</w:t>
+      </w:r>
       <w:r>
         <w:rPr>
           <w:b w:val="0"/>
           <w:color w:val="000000"/>
           <w:sz w:val="25"/>
         </w:rPr>
-        <w:t>«Gutta». «Tirsdagsklubben». «Vinkjellergjengen».</w:t>
-      </w:r>
-    </w:p>
-    <w:p>
-      <w:pPr>
-        <w:keepNext/>
-        <w:keepLines/>
-      </w:pPr>
+        <w:t xml:space="preserve"> Og så finnes det én gjeng som satte lista litt høyere.</w:t>
+      </w:r>
+    </w:p>
+    <w:p>
+      <w:pPr>
+        <w:keepNext/>
+        <w:keepLines/>
+      </w:pPr>
+      <w:r>
+        <w:rPr>
+          <w:i/>
+          <w:color w:val="CC0000"/>
+          <w:sz w:val="20"/>
+        </w:rPr>
+        <w:t>(elegant, smak på ordene)</w:t>
+      </w:r>
       <w:r>
         <w:rPr>
           <w:b w:val="0"/>
           <w:color w:val="000000"/>
           <w:sz w:val="25"/>
         </w:rPr>
-        <w:t>Og så finnes det vennegjenger som har bestemt seg for å være – og jeg siterer – feminine og fornemme. Og holdt på det siden NMBU.</w:t>
-      </w:r>
-    </w:p>
-    <w:p>
-      <w:pPr>
-        <w:keepNext/>
-        <w:keepLines/>
-      </w:pPr>
+        <w:t xml:space="preserve"> En gjeng som rett og slett bestemte seg for å være – og jeg siterer – </w:t>
+      </w:r>
+      <w:r>
+        <w:rPr>
+          <w:b/>
+          <w:color w:val="000000"/>
+          <w:sz w:val="25"/>
+        </w:rPr>
+        <w:t>feminine og fornemme</w:t>
+      </w:r>
       <w:r>
         <w:rPr>
           <w:b w:val="0"/>
           <w:color w:val="000000"/>
           <w:sz w:val="25"/>
         </w:rPr>
-        <w:t>Michelle har én slik gjeng.</w:t>
-      </w:r>
-    </w:p>
-    <w:p>
-      <w:pPr>
-        <w:keepNext/>
-        <w:keepLines/>
-      </w:pPr>
+        <w:t xml:space="preserve">. </w:t>
+      </w:r>
+      <w:r>
+        <w:rPr>
+          <w:i/>
+          <w:color w:val="CC0000"/>
+          <w:sz w:val="20"/>
+        </w:rPr>
+        <w:t>(beat)</w:t>
+      </w:r>
       <w:r>
         <w:rPr>
           <w:b w:val="0"/>
           <w:color w:val="000000"/>
           <w:sz w:val="25"/>
         </w:rPr>
-        <w:t xml:space="preserve">Ta vel imot brudens Ås-gjeng – </w:t>
+        <w:t xml:space="preserve"> Og som har holdt stilen helt siden NMBU.</w:t>
+      </w:r>
+    </w:p>
+    <w:p>
+      <w:pPr>
+        <w:keepNext/>
+        <w:keepLines/>
+      </w:pPr>
+      <w:r>
+        <w:rPr>
+          <w:i/>
+          <w:color w:val="CC0000"/>
+          <w:sz w:val="20"/>
+        </w:rPr>
+        <w:t>(varm)</w:t>
+      </w:r>
+      <w:r>
+        <w:rPr>
+          <w:b w:val="0"/>
+          <w:color w:val="000000"/>
+          <w:sz w:val="25"/>
+        </w:rPr>
+        <w:t xml:space="preserve"> Dette er faktisk damene dere allerede har møtt i kveld: de som presenterte maten, som stiller på dugnad, og som bruker helga si på å løfte denne festen. </w:t>
+      </w:r>
+      <w:r>
+        <w:rPr>
+          <w:i/>
+          <w:color w:val="CC0000"/>
+          <w:sz w:val="20"/>
+        </w:rPr>
+        <w:t>(beat)</w:t>
+      </w:r>
+      <w:r>
+        <w:rPr>
+          <w:b w:val="0"/>
+          <w:color w:val="000000"/>
+          <w:sz w:val="25"/>
+        </w:rPr>
+        <w:t xml:space="preserve"> Klasse hele veien.</w:t>
+      </w:r>
+    </w:p>
+    <w:p>
+      <w:pPr>
+        <w:keepNext/>
+        <w:keepLines/>
+      </w:pPr>
+      <w:r>
+        <w:rPr>
+          <w:i/>
+          <w:color w:val="CC0000"/>
+          <w:sz w:val="20"/>
+        </w:rPr>
+        <w:t>(beat)</w:t>
+      </w:r>
+      <w:r>
+        <w:rPr>
+          <w:b w:val="0"/>
+          <w:color w:val="000000"/>
+          <w:sz w:val="25"/>
+        </w:rPr>
+        <w:t xml:space="preserve"> Michelle har mange venner. </w:t>
+      </w:r>
+      <w:r>
+        <w:rPr>
+          <w:i/>
+          <w:color w:val="CC0000"/>
+          <w:sz w:val="20"/>
+        </w:rPr>
+        <w:t>(beat)</w:t>
+      </w:r>
+      <w:r>
+        <w:rPr>
+          <w:b w:val="0"/>
+          <w:color w:val="000000"/>
+          <w:sz w:val="25"/>
+        </w:rPr>
+        <w:t xml:space="preserve"> Men hun har bare én gjeng som er både feminin OG fornem.</w:t>
+      </w:r>
+    </w:p>
+    <w:p>
+      <w:pPr>
+        <w:keepNext/>
+        <w:keepLines/>
+      </w:pPr>
+      <w:r>
+        <w:rPr>
+          <w:i/>
+          <w:color w:val="CC0000"/>
+          <w:sz w:val="20"/>
+        </w:rPr>
+        <w:t>(stigende, til salen)</w:t>
+      </w:r>
+      <w:r>
+        <w:rPr>
+          <w:b w:val="0"/>
+          <w:color w:val="000000"/>
+          <w:sz w:val="25"/>
+        </w:rPr>
+        <w:t xml:space="preserve"> Ta vel imot brudens Ås-gjeng – med eleganse, glitter og litt selvironi: </w:t>
       </w:r>
       <w:r>
         <w:rPr>
@@ -6660,7 +6554,7 @@
           <w:color w:val="000000"/>
           <w:sz w:val="25"/>
         </w:rPr>
-        <w:t>.</w:t>
+        <w:t>!</w:t>
       </w:r>
     </w:p>
     <w:p>

</xml_diff>

<commit_message>
Michelle-intro: «gått til krigen med – soldat og offiser»
Legger inn brukerens sterke Michelle-linje. Beholder logisk rekkefølge i
manus (innlimingen hadde stokket rekkefølge + manglende Kjernehistorie-
setup = kopierings-artefakter, ikke anvendt).

Co-Authored-By: Claude Opus 4.8 <noreply@anthropic.com>
Claude-Session: https://claude.ai/code/session_01HH3S616y2naKXPCG25iHhw
</commit_message>
<xml_diff>
--- a/manus.docx
+++ b/manus.docx
@@ -2666,6 +2666,28 @@
           <w:sz w:val="25"/>
         </w:rPr>
         <w:t xml:space="preserve"> Og der har hun helt rett. Men Michelle er mye mer enn som så.</w:t>
+      </w:r>
+    </w:p>
+    <w:p>
+      <w:pPr>
+        <w:keepNext/>
+        <w:keepLines/>
+      </w:pPr>
+      <w:r>
+        <w:rPr>
+          <w:i/>
+          <w:color w:val="CC0000"/>
+          <w:sz w:val="20"/>
+        </w:rPr>
+        <w:t>(oppriktig, tyngde)</w:t>
+      </w:r>
+      <w:r>
+        <w:rPr>
+          <w:b w:val="0"/>
+          <w:color w:val="000000"/>
+          <w:sz w:val="25"/>
+        </w:rPr>
+        <w:t xml:space="preserve"> Er det én person jeg ville gått til krigen med – som både soldat og offiser – så er det Michelle Walberg.</w:t>
       </w:r>
     </w:p>
     <w:p>

</xml_diff>

<commit_message>
Kirke-notater inn i manus
- §A (tidlig): «var det bare meg som gråt fire ganger i kirka i dag?»
- Helene (Tale 5): nydelig sangstemme, sang i koret i kirka i dag.
- Even (Tale 6): spilte nydelig keyboard i kirka («spille»-callback).
- Stikk 2 Landing: presten-callback – «man slutter ikke å vokse sammen den
  dagen man gifter seg».

Co-Authored-By: Claude Opus 4.8 <noreply@anthropic.com>
Claude-Session: https://claude.ai/code/session_01HH3S616y2naKXPCG25iHhw
</commit_message>
<xml_diff>
--- a/manus.docx
+++ b/manus.docx
@@ -280,6 +280,58 @@
           <w:color w:val="CC0000"/>
           <w:sz w:val="20"/>
         </w:rPr>
+        <w:t>(varm)</w:t>
+      </w:r>
+      <w:r>
+        <w:rPr>
+          <w:b w:val="0"/>
+          <w:color w:val="000000"/>
+          <w:sz w:val="25"/>
+        </w:rPr>
+        <w:t xml:space="preserve"> Og for en seremoni det var i kirka i dag. </w:t>
+      </w:r>
+      <w:r>
+        <w:rPr>
+          <w:i/>
+          <w:color w:val="CC0000"/>
+          <w:sz w:val="20"/>
+        </w:rPr>
+        <w:t>(glimt i øyet)</w:t>
+      </w:r>
+      <w:r>
+        <w:rPr>
+          <w:b w:val="0"/>
+          <w:color w:val="000000"/>
+          <w:sz w:val="25"/>
+        </w:rPr>
+        <w:t xml:space="preserve"> Var det bare meg som gråt fire ganger?</w:t>
+      </w:r>
+    </w:p>
+    <w:p>
+      <w:pPr>
+        <w:keepNext/>
+        <w:keepLines/>
+      </w:pPr>
+      <w:r>
+        <w:rPr>
+          <w:i/>
+          <w:color w:val="CC0000"/>
+          <w:sz w:val="20"/>
+        </w:rPr>
+        <w:t>(beat – la gjenkjennelsen og latteren komme)</w:t>
+      </w:r>
+    </w:p>
+    <w:p>
+      <w:pPr>
+        <w:keepNext/>
+        <w:keepLines/>
+      </w:pPr>
+      <w:r>
+        <w:rPr>
+          <w:i/>
+          <w:color w:val="CC0000"/>
+          <w:sz w:val="20"/>
+        </w:rPr>
         <w:t>(tørr)</w:t>
       </w:r>
       <w:r>
@@ -4648,7 +4700,59 @@
           <w:color w:val="CC0000"/>
           <w:sz w:val="20"/>
         </w:rPr>
-        <w:t>(LAND – 5 sek. Hold blikket på brudeparet.)</w:t>
+        <w:t>(LAND – 4 sek)</w:t>
+      </w:r>
+    </w:p>
+    <w:p>
+      <w:pPr>
+        <w:keepNext/>
+        <w:keepLines/>
+      </w:pPr>
+      <w:r>
+        <w:rPr>
+          <w:i/>
+          <w:color w:val="CC0000"/>
+          <w:sz w:val="20"/>
+        </w:rPr>
+        <w:t>(varm, framoverlent)</w:t>
+      </w:r>
+      <w:r>
+        <w:rPr>
+          <w:b w:val="0"/>
+          <w:color w:val="000000"/>
+          <w:sz w:val="25"/>
+        </w:rPr>
+        <w:t xml:space="preserve"> Og som presten minnet oss på i kirka i dag: man slutter ikke å vokse sammen den dagen man gifter seg. </w:t>
+      </w:r>
+      <w:r>
+        <w:rPr>
+          <w:i/>
+          <w:color w:val="CC0000"/>
+          <w:sz w:val="20"/>
+        </w:rPr>
+        <w:t>(beat)</w:t>
+      </w:r>
+      <w:r>
+        <w:rPr>
+          <w:b w:val="0"/>
+          <w:color w:val="000000"/>
+          <w:sz w:val="25"/>
+        </w:rPr>
+        <w:t xml:space="preserve"> Kanskje er det akkurat da det virkelig begynner.</w:t>
+      </w:r>
+    </w:p>
+    <w:p>
+      <w:pPr>
+        <w:keepNext/>
+        <w:keepLines/>
+      </w:pPr>
+      <w:r>
+        <w:rPr>
+          <w:i/>
+          <w:color w:val="CC0000"/>
+          <w:sz w:val="20"/>
+        </w:rPr>
+        <w:t>(LAND – 4 sek. Hold blikket på brudeparet.)</w:t>
       </w:r>
     </w:p>
     <w:p>
@@ -4757,6 +4861,28 @@
           <w:color w:val="CC0000"/>
           <w:sz w:val="20"/>
         </w:rPr>
+        <w:t>(varm)</w:t>
+      </w:r>
+      <w:r>
+        <w:rPr>
+          <w:b w:val="0"/>
+          <w:color w:val="000000"/>
+          <w:sz w:val="25"/>
+        </w:rPr>
+        <w:t xml:space="preserve"> Og dere som var i kirka i dag, fikk høre at hun har mer enn ord – en helt nydelig sangstemme, der hun sang i koret.</w:t>
+      </w:r>
+    </w:p>
+    <w:p>
+      <w:pPr>
+        <w:keepNext/>
+        <w:keepLines/>
+      </w:pPr>
+      <w:r>
+        <w:rPr>
+          <w:i/>
+          <w:color w:val="CC0000"/>
+          <w:sz w:val="20"/>
+        </w:rPr>
         <w:t>(energi, til salen)</w:t>
       </w:r>
       <w:r>
@@ -5162,6 +5288,28 @@
           <w:sz w:val="25"/>
         </w:rPr>
         <w:t xml:space="preserve"> Finere kan vel en liten gutt knapt beskrive en bestevenn.</w:t>
+      </w:r>
+    </w:p>
+    <w:p>
+      <w:pPr>
+        <w:keepNext/>
+        <w:keepLines/>
+      </w:pPr>
+      <w:r>
+        <w:rPr>
+          <w:i/>
+          <w:color w:val="CC0000"/>
+          <w:sz w:val="20"/>
+        </w:rPr>
+        <w:t>(varm)</w:t>
+      </w:r>
+      <w:r>
+        <w:rPr>
+          <w:b w:val="0"/>
+          <w:color w:val="000000"/>
+          <w:sz w:val="25"/>
+        </w:rPr>
+        <w:t xml:space="preserve"> Og i dag fikk vi forresten høre Even spille på ordentlig – et nydelig keyboard i kirka.</w:t>
       </w:r>
     </w:p>
     <w:p>

</xml_diff>

<commit_message>
Refleksjoner-dokument + hils-på-brudeparet + fotograf-plassholder
- refleksjoner.md/.pdf: nytt dokument med avsluttende refleksjoner til
  Fredrik (hva kvelden handler om, de tre tingene som teller, bomb-
  håndtering, hjertet i Stikk 2, en siste tanke).
- manus: ny seksjon «Hils på brudeparet (i stedet for pause)» før Tale 11
  – gratulasjons-/kysse-runde i stedet for vanlig 10-min pause.
- manus §E: plassholder for fotografens egne føringer (fylles inn).

Co-Authored-By: Claude Opus 4.8 <noreply@anthropic.com>
Claude-Session: https://claude.ai/code/session_01HH3S616y2naKXPCG25iHhw
</commit_message>
<xml_diff>
--- a/manus.docx
+++ b/manus.docx
@@ -1527,6 +1527,36 @@
           <w:color w:val="CC0000"/>
           <w:sz w:val="20"/>
         </w:rPr>
+        <w:t>(varm)</w:t>
+      </w:r>
+      <w:r>
+        <w:rPr>
+          <w:b w:val="0"/>
+          <w:color w:val="000000"/>
+          <w:sz w:val="25"/>
+        </w:rPr>
+        <w:t xml:space="preserve"> Og en beskjed fra fotografen: </w:t>
+      </w:r>
+      <w:r>
+        <w:rPr>
+          <w:i/>
+          <w:color w:val="CC0000"/>
+          <w:sz w:val="20"/>
+        </w:rPr>
+        <w:t>[FYLL INN fotografens egne føringer – f.eks. legg vekk mobilen i de store øyeblikkene, ikke stå i veien under inngang/ dans, eller hold gangen fri. Avklar nøyaktig hva hen ønsker.]</w:t>
+      </w:r>
+    </w:p>
+    <w:p>
+      <w:pPr>
+        <w:keepNext/>
+        <w:keepLines/>
+      </w:pPr>
+      <w:r>
+        <w:rPr>
+          <w:i/>
+          <w:color w:val="CC0000"/>
+          <w:sz w:val="20"/>
+        </w:rPr>
         <w:t>(tørr)</w:t>
       </w:r>
       <w:r>
@@ -6777,7 +6807,7 @@
           <w:color w:val="CC0000"/>
           <w:sz w:val="26"/>
         </w:rPr>
-        <w:t>Intro tale 11 — Tom Christian (venn av Anders, kveldens siste tale)</w:t>
+        <w:t>Hils på brudeparet (i stedet for pause)</w:t>
       </w:r>
     </w:p>
     <w:p>
@@ -6791,71 +6821,97 @@
           <w:color w:val="CC0000"/>
           <w:sz w:val="20"/>
         </w:rPr>
-        <w:t>[Intro-sang: Hold the Line (#24), 15 sek]</w:t>
-      </w:r>
-    </w:p>
-    <w:p>
-      <w:pPr>
-        <w:keepNext/>
-        <w:keepLines/>
-      </w:pPr>
+        <w:t>[Erstatter den vanlige 10-min-pausen før siste taler. En varm gratulasjons- runde. Avklar med fotograf (gull-bilder her!) og kjøkken/kaffe. Hent inn med Fireball-lyden når dere er klare.]</w:t>
+      </w:r>
+    </w:p>
+    <w:p>
+      <w:pPr>
+        <w:keepNext/>
+        <w:keepLines/>
+      </w:pPr>
+      <w:r>
+        <w:rPr>
+          <w:i/>
+          <w:color w:val="CC0000"/>
+          <w:sz w:val="20"/>
+        </w:rPr>
+        <w:t>(varm)</w:t>
+      </w:r>
       <w:r>
         <w:rPr>
           <w:b w:val="0"/>
           <w:color w:val="000000"/>
           <w:sz w:val="25"/>
         </w:rPr>
-        <w:t>Når man har holdt det gående til denne timen i et bryllup, er det fordi det er noe man ikke vil gå glipp av.</w:t>
-      </w:r>
-    </w:p>
-    <w:p>
-      <w:pPr>
-        <w:keepNext/>
-        <w:keepLines/>
-      </w:pPr>
+        <w:t xml:space="preserve"> Før kveldens aller siste taler tar vi en liten pust.</w:t>
+      </w:r>
+    </w:p>
+    <w:p>
+      <w:pPr>
+        <w:keepNext/>
+        <w:keepLines/>
+      </w:pPr>
+      <w:r>
+        <w:rPr>
+          <w:i/>
+          <w:color w:val="CC0000"/>
+          <w:sz w:val="20"/>
+        </w:rPr>
+        <w:t>(beat)</w:t>
+      </w:r>
       <w:r>
         <w:rPr>
           <w:b w:val="0"/>
           <w:color w:val="000000"/>
           <w:sz w:val="25"/>
         </w:rPr>
-        <w:t>Kveldens siste taler er en svært tilstedeværende – og til tider fraværende – type. Tidligere europamester i taekwondo.</w:t>
-      </w:r>
-    </w:p>
-    <w:p>
-      <w:pPr>
-        <w:keepNext/>
-        <w:keepLines/>
-      </w:pPr>
+        <w:t xml:space="preserve"> Men ikke en helt vanlig pause. </w:t>
+      </w:r>
+      <w:r>
+        <w:rPr>
+          <w:i/>
+          <w:color w:val="CC0000"/>
+          <w:sz w:val="20"/>
+        </w:rPr>
+        <w:t>(varm)</w:t>
+      </w:r>
       <w:r>
         <w:rPr>
           <w:b w:val="0"/>
           <w:color w:val="000000"/>
           <w:sz w:val="25"/>
         </w:rPr>
-        <w:t>Han er en god venn av Anders – og det å ha venner som blir værende lenge, både i livet og i bryllupet, sier sitt.</w:t>
-      </w:r>
-    </w:p>
-    <w:p>
-      <w:pPr>
-        <w:keepNext/>
-        <w:keepLines/>
-      </w:pPr>
+        <w:t xml:space="preserve"> Dette er sjansen for dere som vil: kom bort, gratuler – og gi brudeparet en velfortjent klem eller et kyss.</w:t>
+      </w:r>
+    </w:p>
+    <w:p>
+      <w:pPr>
+        <w:keepNext/>
+        <w:keepLines/>
+      </w:pPr>
+      <w:r>
+        <w:rPr>
+          <w:i/>
+          <w:color w:val="CC0000"/>
+          <w:sz w:val="20"/>
+        </w:rPr>
+        <w:t>(praktisk, vennlig)</w:t>
+      </w:r>
       <w:r>
         <w:rPr>
           <w:b w:val="0"/>
           <w:color w:val="000000"/>
           <w:sz w:val="25"/>
         </w:rPr>
-        <w:t xml:space="preserve">Brudgommens gode venn – </w:t>
-      </w:r>
-      <w:r>
-        <w:rPr>
-          <w:b/>
-          <w:color w:val="000000"/>
-          <w:sz w:val="25"/>
-        </w:rPr>
-        <w:t>Tom Christian</w:t>
+        <w:t xml:space="preserve"> Ta den tida dere trenger. </w:t>
+      </w:r>
+      <w:r>
+        <w:rPr>
+          <w:i/>
+          <w:color w:val="CC0000"/>
+          <w:sz w:val="20"/>
+        </w:rPr>
+        <w:t>(beat)</w:t>
       </w:r>
       <w:r>
         <w:rPr>
@@ -6863,7 +6919,7 @@
           <w:color w:val="000000"/>
           <w:sz w:val="25"/>
         </w:rPr>
-        <w:t>. Ordet er ditt.</w:t>
+        <w:t xml:space="preserve"> Så samler vi oss igjen til kveldens siste tale.</w:t>
       </w:r>
     </w:p>
     <w:p>
@@ -6877,7 +6933,7 @@
           <w:color w:val="CC0000"/>
           <w:sz w:val="20"/>
         </w:rPr>
-        <w:t>[Tale 11, 3 min – kveldens siste tale.]</w:t>
+        <w:t>[5–10 min gratulasjon/mingling. Fotograf fanger øyeblikkene.]</w:t>
       </w:r>
     </w:p>
     <w:p>
@@ -6916,7 +6972,7 @@
           <w:color w:val="CC0000"/>
           <w:sz w:val="26"/>
         </w:rPr>
-        <w:t>Innslag — Broderskapet Unity (kveldens siste show)</w:t>
+        <w:t>Intro tale 11 — Tom Christian (venn av Anders, kveldens siste tale)</w:t>
       </w:r>
     </w:p>
     <w:p>
@@ -6930,7 +6986,7 @@
           <w:color w:val="CC0000"/>
           <w:sz w:val="20"/>
         </w:rPr>
-        <w:t>[Intro-sang: Enter Sandman, 15 sek. Tung, dramatisk – matcher broderskap-energien. Kveldens siste show, etter Tom Christian.]</w:t>
+        <w:t>[Intro-sang: Hold the Line (#24), 15 sek]</w:t>
       </w:r>
     </w:p>
     <w:p>
@@ -6944,7 +7000,7 @@
           <w:color w:val="000000"/>
           <w:sz w:val="25"/>
         </w:rPr>
-        <w:t>Hver gang en mann gifter seg, mister han noen rettigheter.</w:t>
+        <w:t>Når man har holdt det gående til denne timen i et bryllup, er det fordi det er noe man ikke vil gå glipp av.</w:t>
       </w:r>
     </w:p>
     <w:p>
@@ -6958,7 +7014,7 @@
           <w:color w:val="000000"/>
           <w:sz w:val="25"/>
         </w:rPr>
-        <w:t>Heldigvis er det noen som har samlet seg i et broderskap for å passe på at han ikke mister minnene.</w:t>
+        <w:t>Kveldens siste taler er en svært tilstedeværende – og til tider fraværende – type. Tidligere europamester i taekwondo.</w:t>
       </w:r>
     </w:p>
     <w:p>
@@ -6972,7 +7028,21 @@
           <w:color w:val="000000"/>
           <w:sz w:val="25"/>
         </w:rPr>
-        <w:t xml:space="preserve">Brudgommens Ås-gjeng – </w:t>
+        <w:t>Han er en god venn av Anders – og det å ha venner som blir værende lenge, både i livet og i bryllupet, sier sitt.</w:t>
+      </w:r>
+    </w:p>
+    <w:p>
+      <w:pPr>
+        <w:keepNext/>
+        <w:keepLines/>
+      </w:pPr>
+      <w:r>
+        <w:rPr>
+          <w:b w:val="0"/>
+          <w:color w:val="000000"/>
+          <w:sz w:val="25"/>
+        </w:rPr>
+        <w:t xml:space="preserve">Brudgommens gode venn – </w:t>
       </w:r>
       <w:r>
         <w:rPr>
@@ -6980,7 +7050,7 @@
           <w:color w:val="000000"/>
           <w:sz w:val="25"/>
         </w:rPr>
-        <w:t>Broderskapet Unity</w:t>
+        <w:t>Tom Christian</w:t>
       </w:r>
       <w:r>
         <w:rPr>
@@ -6988,7 +7058,7 @@
           <w:color w:val="000000"/>
           <w:sz w:val="25"/>
         </w:rPr>
-        <w:t>. Scenen er deres.</w:t>
+        <w:t>. Ordet er ditt.</w:t>
       </w:r>
     </w:p>
     <w:p>
@@ -7002,7 +7072,7 @@
           <w:color w:val="CC0000"/>
           <w:sz w:val="20"/>
         </w:rPr>
-        <w:t>[Innslag, 5 min – sang / sketsj / tale, fleksibelt format. Avklart med gjengen på forhånd: hva, varighet, tekniske behov.]</w:t>
+        <w:t>[Tale 11, 3 min – kveldens siste tale.]</w:t>
       </w:r>
     </w:p>
     <w:p>
@@ -7041,7 +7111,7 @@
           <w:color w:val="CC0000"/>
           <w:sz w:val="26"/>
         </w:rPr>
-        <w:t>Avsluttende hilsen — til Anders</w:t>
+        <w:t>Innslag — Broderskapet Unity (kveldens siste show)</w:t>
       </w:r>
     </w:p>
     <w:p>
@@ -7055,101 +7125,57 @@
           <w:color w:val="CC0000"/>
           <w:sz w:val="20"/>
         </w:rPr>
-        <w:t>[Toastmasterens siste, varme ord. Rolig og oppriktig. Hold blikket på Anders. FORBILDE-PAY OFF: frøet ble plantet i Anders' intro (Tale 2, «mer om det senere»).]</w:t>
-      </w:r>
-    </w:p>
-    <w:p>
-      <w:pPr>
-        <w:keepNext/>
-        <w:keepLines/>
-      </w:pPr>
-      <w:r>
-        <w:rPr>
-          <w:i/>
-          <w:color w:val="CC0000"/>
-          <w:sz w:val="20"/>
-        </w:rPr>
-        <w:t>(varm)</w:t>
-      </w:r>
+        <w:t>[Intro-sang: Enter Sandman, 15 sek. Tung, dramatisk – matcher broderskap-energien. Kveldens siste show, etter Tom Christian.]</w:t>
+      </w:r>
+    </w:p>
+    <w:p>
+      <w:pPr>
+        <w:keepNext/>
+        <w:keepLines/>
+      </w:pPr>
       <w:r>
         <w:rPr>
           <w:b w:val="0"/>
           <w:color w:val="000000"/>
           <w:sz w:val="25"/>
         </w:rPr>
-        <w:t xml:space="preserve"> En stor applaus til Broderskapet Unity!</w:t>
-      </w:r>
-    </w:p>
-    <w:p>
-      <w:pPr>
-        <w:keepNext/>
-        <w:keepLines/>
-      </w:pPr>
-      <w:r>
-        <w:rPr>
-          <w:i/>
-          <w:color w:val="CC0000"/>
-          <w:sz w:val="20"/>
-        </w:rPr>
-        <w:t>(beat)</w:t>
-      </w:r>
-    </w:p>
-    <w:p>
-      <w:pPr>
-        <w:keepNext/>
-        <w:keepLines/>
-      </w:pPr>
-      <w:r>
-        <w:rPr>
-          <w:i/>
-          <w:color w:val="CC0000"/>
-          <w:sz w:val="20"/>
-        </w:rPr>
-        <w:t>(varm, personlig)</w:t>
-      </w:r>
+        <w:t>Hver gang en mann gifter seg, mister han noen rettigheter.</w:t>
+      </w:r>
+    </w:p>
+    <w:p>
+      <w:pPr>
+        <w:keepNext/>
+        <w:keepLines/>
+      </w:pPr>
       <w:r>
         <w:rPr>
           <w:b w:val="0"/>
           <w:color w:val="000000"/>
           <w:sz w:val="25"/>
         </w:rPr>
-        <w:t xml:space="preserve"> Og helt til slutt vil jeg si én ting.</w:t>
-      </w:r>
-    </w:p>
-    <w:p>
-      <w:pPr>
-        <w:keepNext/>
-        <w:keepLines/>
-      </w:pPr>
-      <w:r>
-        <w:rPr>
-          <w:i/>
-          <w:color w:val="CC0000"/>
-          <w:sz w:val="20"/>
-        </w:rPr>
-        <w:t>(beat)</w:t>
-      </w:r>
+        <w:t>Heldigvis er det noen som har samlet seg i et broderskap for å passe på at han ikke mister minnene.</w:t>
+      </w:r>
+    </w:p>
+    <w:p>
+      <w:pPr>
+        <w:keepNext/>
+        <w:keepLines/>
+      </w:pPr>
       <w:r>
         <w:rPr>
           <w:b w:val="0"/>
           <w:color w:val="000000"/>
           <w:sz w:val="25"/>
         </w:rPr>
-        <w:t xml:space="preserve"> Jeg har snakket med mange i forkant av denne kvelden – familien, gutta fra Vinger, jaktlaget.</w:t>
-      </w:r>
-    </w:p>
-    <w:p>
-      <w:pPr>
-        <w:keepNext/>
-        <w:keepLines/>
-      </w:pPr>
-      <w:r>
-        <w:rPr>
-          <w:i/>
-          <w:color w:val="CC0000"/>
-          <w:sz w:val="20"/>
-        </w:rPr>
-        <w:t>(beat)</w:t>
+        <w:t xml:space="preserve">Brudgommens Ås-gjeng – </w:t>
+      </w:r>
+      <w:r>
+        <w:rPr>
+          <w:b/>
+          <w:color w:val="000000"/>
+          <w:sz w:val="25"/>
+        </w:rPr>
+        <w:t>Broderskapet Unity</w:t>
       </w:r>
       <w:r>
         <w:rPr>
@@ -7157,7 +7183,7 @@
           <w:color w:val="000000"/>
           <w:sz w:val="25"/>
         </w:rPr>
-        <w:t xml:space="preserve"> Og jeg tror ikke du helt skjønner det selv, Anders – hvilket forbilde du er for folk.</w:t>
+        <w:t>. Scenen er deres.</w:t>
       </w:r>
     </w:p>
     <w:p>
@@ -7171,125 +7197,7 @@
           <w:color w:val="CC0000"/>
           <w:sz w:val="20"/>
         </w:rPr>
-        <w:t>(varm)</w:t>
-      </w:r>
-      <w:r>
-        <w:rPr>
-          <w:b w:val="0"/>
-          <w:color w:val="000000"/>
-          <w:sz w:val="25"/>
-        </w:rPr>
-        <w:t xml:space="preserve"> Du er positiv. Du lytter. </w:t>
-      </w:r>
-      <w:r>
-        <w:rPr>
-          <w:i/>
-          <w:color w:val="CC0000"/>
-          <w:sz w:val="20"/>
-        </w:rPr>
-        <w:t>(beat)</w:t>
-      </w:r>
-      <w:r>
-        <w:rPr>
-          <w:b w:val="0"/>
-          <w:color w:val="000000"/>
-          <w:sz w:val="25"/>
-        </w:rPr>
-        <w:t xml:space="preserve"> Og nå snakker jeg på vegne av jaktlaget, familien og kompisene fra Vinger: du er et forbilde, Anders.</w:t>
-      </w:r>
-    </w:p>
-    <w:p>
-      <w:pPr>
-        <w:keepNext/>
-        <w:keepLines/>
-      </w:pPr>
-      <w:r>
-        <w:rPr>
-          <w:i/>
-          <w:color w:val="CC0000"/>
-          <w:sz w:val="20"/>
-        </w:rPr>
-        <w:t>(tørr, lite smil)</w:t>
-      </w:r>
-      <w:r>
-        <w:rPr>
-          <w:b w:val="0"/>
-          <w:color w:val="000000"/>
-          <w:sz w:val="25"/>
-        </w:rPr>
-        <w:t xml:space="preserve"> Du kan til og med smi en spiker.</w:t>
-      </w:r>
-    </w:p>
-    <w:p>
-      <w:pPr>
-        <w:keepNext/>
-        <w:keepLines/>
-      </w:pPr>
-      <w:r>
-        <w:rPr>
-          <w:i/>
-          <w:color w:val="CC0000"/>
-          <w:sz w:val="20"/>
-        </w:rPr>
-        <w:t>(LAND – 3 sek)</w:t>
-      </w:r>
-    </w:p>
-    <w:p>
-      <w:pPr>
-        <w:keepNext/>
-        <w:keepLines/>
-      </w:pPr>
-      <w:r>
-        <w:rPr>
-          <w:i/>
-          <w:color w:val="CC0000"/>
-          <w:sz w:val="20"/>
-        </w:rPr>
-        <w:t>(varm)</w:t>
-      </w:r>
-      <w:r>
-        <w:rPr>
-          <w:b w:val="0"/>
-          <w:color w:val="000000"/>
-          <w:sz w:val="25"/>
-        </w:rPr>
-        <w:t xml:space="preserve"> Og det finnes vel ikke en større rettesnor på at man er på akkurat rett sted i livet.</w:t>
-      </w:r>
-    </w:p>
-    <w:p>
-      <w:pPr>
-        <w:keepNext/>
-        <w:keepLines/>
-      </w:pPr>
-      <w:r>
-        <w:rPr>
-          <w:i/>
-          <w:color w:val="CC0000"/>
-          <w:sz w:val="20"/>
-        </w:rPr>
-        <w:t>(varm, til begge nå – blikk på brudeparet)</w:t>
-      </w:r>
-      <w:r>
-        <w:rPr>
-          <w:b w:val="0"/>
-          <w:color w:val="000000"/>
-          <w:sz w:val="25"/>
-        </w:rPr>
-        <w:t xml:space="preserve"> Og Anders – sammen med Michelle er dere noe enda større: et forbilde for mange på hvordan et godt og vellykket forhold ser ut.</w:t>
-      </w:r>
-    </w:p>
-    <w:p>
-      <w:pPr>
-        <w:keepNext/>
-        <w:keepLines/>
-      </w:pPr>
-      <w:r>
-        <w:rPr>
-          <w:i/>
-          <w:color w:val="CC0000"/>
-          <w:sz w:val="20"/>
-        </w:rPr>
-        <w:t>(LAND – 3 sek. Hold blikket på dem.)</w:t>
+        <w:t>[Innslag, 5 min – sang / sketsj / tale, fleksibelt format. Avklart med gjengen på forhånd: hva, varighet, tekniske behov.]</w:t>
       </w:r>
     </w:p>
     <w:p>
@@ -7328,7 +7236,7 @@
           <w:color w:val="CC0000"/>
           <w:sz w:val="26"/>
         </w:rPr>
-        <w:t>Avslutning — Händerna mot himmelen + omrigg til dans</w:t>
+        <w:t>Avsluttende hilsen — til Anders</w:t>
       </w:r>
     </w:p>
     <w:p>
@@ -7342,7 +7250,21 @@
           <w:color w:val="CC0000"/>
           <w:sz w:val="20"/>
         </w:rPr>
-        <w:t xml:space="preserve">[Etter den avsluttende hilsenen. Händerna mot himmelen spilles. Deretter 15–20 min omrigg der dansegulvet gjøres klart – de to bordene </w:t>
+        <w:t>[Toastmasterens siste, varme ord. Rolig og oppriktig. Hold blikket på Anders. FORBILDE-PAY OFF: frøet ble plantet i Anders' intro (Tale 2, «mer om det senere»).]</w:t>
+      </w:r>
+    </w:p>
+    <w:p>
+      <w:pPr>
+        <w:keepNext/>
+        <w:keepLines/>
+      </w:pPr>
+      <w:r>
+        <w:rPr>
+          <w:i/>
+          <w:color w:val="CC0000"/>
+          <w:sz w:val="20"/>
+        </w:rPr>
+        <w:t>(varm)</w:t>
       </w:r>
       <w:r>
         <w:rPr>
@@ -7350,15 +7272,21 @@
           <w:color w:val="000000"/>
           <w:sz w:val="25"/>
         </w:rPr>
-        <w:t>[spesifiser hvilke]</w:t>
-      </w:r>
+        <w:t xml:space="preserve"> En stor applaus til Broderskapet Unity!</w:t>
+      </w:r>
+    </w:p>
+    <w:p>
+      <w:pPr>
+        <w:keepNext/>
+        <w:keepLines/>
+      </w:pPr>
       <w:r>
         <w:rPr>
           <w:i/>
           <w:color w:val="CC0000"/>
           <w:sz w:val="20"/>
         </w:rPr>
-        <w:t xml:space="preserve"> flyttes.]</w:t>
+        <w:t>(beat)</w:t>
       </w:r>
     </w:p>
     <w:p>
@@ -7372,7 +7300,7 @@
           <w:color w:val="CC0000"/>
           <w:sz w:val="20"/>
         </w:rPr>
-        <w:t>(energi)</w:t>
+        <w:t>(varm, personlig)</w:t>
       </w:r>
       <w:r>
         <w:rPr>
@@ -7380,15 +7308,21 @@
           <w:color w:val="000000"/>
           <w:sz w:val="25"/>
         </w:rPr>
-        <w:t xml:space="preserve"> Og da løfter vi taket sammen – </w:t>
-      </w:r>
-      <w:r>
-        <w:rPr>
-          <w:b/>
-          <w:color w:val="000000"/>
-          <w:sz w:val="25"/>
-        </w:rPr>
-        <w:t>Händerna mot himmelen</w:t>
+        <w:t xml:space="preserve"> Og helt til slutt vil jeg si én ting.</w:t>
+      </w:r>
+    </w:p>
+    <w:p>
+      <w:pPr>
+        <w:keepNext/>
+        <w:keepLines/>
+      </w:pPr>
+      <w:r>
+        <w:rPr>
+          <w:i/>
+          <w:color w:val="CC0000"/>
+          <w:sz w:val="20"/>
+        </w:rPr>
+        <w:t>(beat)</w:t>
       </w:r>
       <w:r>
         <w:rPr>
@@ -7396,7 +7330,7 @@
           <w:color w:val="000000"/>
           <w:sz w:val="25"/>
         </w:rPr>
-        <w:t>!</w:t>
+        <w:t xml:space="preserve"> Jeg har snakket med mange i forkant av denne kvelden – familien, gutta fra Vinger, jaktlaget.</w:t>
       </w:r>
     </w:p>
     <w:p>
@@ -7410,21 +7344,7 @@
           <w:color w:val="CC0000"/>
           <w:sz w:val="20"/>
         </w:rPr>
-        <w:t>[Händerna mot himmelen spilles – syng og dans med.]</w:t>
-      </w:r>
-    </w:p>
-    <w:p>
-      <w:pPr>
-        <w:keepNext/>
-        <w:keepLines/>
-      </w:pPr>
-      <w:r>
-        <w:rPr>
-          <w:i/>
-          <w:color w:val="CC0000"/>
-          <w:sz w:val="20"/>
-        </w:rPr>
-        <w:t>(praktisk, vennlig)</w:t>
+        <w:t>(beat)</w:t>
       </w:r>
       <w:r>
         <w:rPr>
@@ -7432,15 +7352,21 @@
           <w:color w:val="000000"/>
           <w:sz w:val="25"/>
         </w:rPr>
-        <w:t xml:space="preserve"> Mens vi rigger om til dansegulv – det tar en 15–20 minutter – er det fritt fram å strekke på beina, ta litt frisk luft eller fylle glasset. </w:t>
-      </w:r>
+        <w:t xml:space="preserve"> Og jeg tror ikke du helt skjønner det selv, Anders – hvilket forbilde du er for folk.</w:t>
+      </w:r>
+    </w:p>
+    <w:p>
+      <w:pPr>
+        <w:keepNext/>
+        <w:keepLines/>
+      </w:pPr>
       <w:r>
         <w:rPr>
           <w:i/>
           <w:color w:val="CC0000"/>
           <w:sz w:val="20"/>
         </w:rPr>
-        <w:t>(beat)</w:t>
+        <w:t>(varm)</w:t>
       </w:r>
       <w:r>
         <w:rPr>
@@ -7448,7 +7374,7 @@
           <w:color w:val="000000"/>
           <w:sz w:val="25"/>
         </w:rPr>
-        <w:t xml:space="preserve"> De to bordene </w:t>
+        <w:t xml:space="preserve"> Du er positiv. Du lytter. </w:t>
       </w:r>
       <w:r>
         <w:rPr>
@@ -7456,7 +7382,7 @@
           <w:color w:val="CC0000"/>
           <w:sz w:val="20"/>
         </w:rPr>
-        <w:t>[pek]</w:t>
+        <w:t>(beat)</w:t>
       </w:r>
       <w:r>
         <w:rPr>
@@ -7464,7 +7390,101 @@
           <w:color w:val="000000"/>
           <w:sz w:val="25"/>
         </w:rPr>
-        <w:t xml:space="preserve"> flyttes for å gi plass, så hold dem gjerne klare.</w:t>
+        <w:t xml:space="preserve"> Og nå snakker jeg på vegne av jaktlaget, familien og kompisene fra Vinger: du er et forbilde, Anders.</w:t>
+      </w:r>
+    </w:p>
+    <w:p>
+      <w:pPr>
+        <w:keepNext/>
+        <w:keepLines/>
+      </w:pPr>
+      <w:r>
+        <w:rPr>
+          <w:i/>
+          <w:color w:val="CC0000"/>
+          <w:sz w:val="20"/>
+        </w:rPr>
+        <w:t>(tørr, lite smil)</w:t>
+      </w:r>
+      <w:r>
+        <w:rPr>
+          <w:b w:val="0"/>
+          <w:color w:val="000000"/>
+          <w:sz w:val="25"/>
+        </w:rPr>
+        <w:t xml:space="preserve"> Du kan til og med smi en spiker.</w:t>
+      </w:r>
+    </w:p>
+    <w:p>
+      <w:pPr>
+        <w:keepNext/>
+        <w:keepLines/>
+      </w:pPr>
+      <w:r>
+        <w:rPr>
+          <w:i/>
+          <w:color w:val="CC0000"/>
+          <w:sz w:val="20"/>
+        </w:rPr>
+        <w:t>(LAND – 3 sek)</w:t>
+      </w:r>
+    </w:p>
+    <w:p>
+      <w:pPr>
+        <w:keepNext/>
+        <w:keepLines/>
+      </w:pPr>
+      <w:r>
+        <w:rPr>
+          <w:i/>
+          <w:color w:val="CC0000"/>
+          <w:sz w:val="20"/>
+        </w:rPr>
+        <w:t>(varm)</w:t>
+      </w:r>
+      <w:r>
+        <w:rPr>
+          <w:b w:val="0"/>
+          <w:color w:val="000000"/>
+          <w:sz w:val="25"/>
+        </w:rPr>
+        <w:t xml:space="preserve"> Og det finnes vel ikke en større rettesnor på at man er på akkurat rett sted i livet.</w:t>
+      </w:r>
+    </w:p>
+    <w:p>
+      <w:pPr>
+        <w:keepNext/>
+        <w:keepLines/>
+      </w:pPr>
+      <w:r>
+        <w:rPr>
+          <w:i/>
+          <w:color w:val="CC0000"/>
+          <w:sz w:val="20"/>
+        </w:rPr>
+        <w:t>(varm, til begge nå – blikk på brudeparet)</w:t>
+      </w:r>
+      <w:r>
+        <w:rPr>
+          <w:b w:val="0"/>
+          <w:color w:val="000000"/>
+          <w:sz w:val="25"/>
+        </w:rPr>
+        <w:t xml:space="preserve"> Og Anders – sammen med Michelle er dere noe enda større: et forbilde for mange på hvordan et godt og vellykket forhold ser ut.</w:t>
+      </w:r>
+    </w:p>
+    <w:p>
+      <w:pPr>
+        <w:keepNext/>
+        <w:keepLines/>
+      </w:pPr>
+      <w:r>
+        <w:rPr>
+          <w:i/>
+          <w:color w:val="CC0000"/>
+          <w:sz w:val="20"/>
+        </w:rPr>
+        <w:t>(LAND – 3 sek. Hold blikket på dem.)</w:t>
       </w:r>
     </w:p>
     <w:p>
@@ -7496,6 +7516,181 @@
           <w:sz w:val="26"/>
         </w:rPr>
         <w:t xml:space="preserve">[33]  </w:t>
+      </w:r>
+      <w:r>
+        <w:rPr>
+          <w:b/>
+          <w:color w:val="CC0000"/>
+          <w:sz w:val="26"/>
+        </w:rPr>
+        <w:t>Avslutning — Händerna mot himmelen + omrigg til dans</w:t>
+      </w:r>
+    </w:p>
+    <w:p>
+      <w:pPr>
+        <w:keepNext/>
+        <w:keepLines/>
+      </w:pPr>
+      <w:r>
+        <w:rPr>
+          <w:i/>
+          <w:color w:val="CC0000"/>
+          <w:sz w:val="20"/>
+        </w:rPr>
+        <w:t xml:space="preserve">[Etter den avsluttende hilsenen. Händerna mot himmelen spilles. Deretter 15–20 min omrigg der dansegulvet gjøres klart – de to bordene </w:t>
+      </w:r>
+      <w:r>
+        <w:rPr>
+          <w:b w:val="0"/>
+          <w:color w:val="000000"/>
+          <w:sz w:val="25"/>
+        </w:rPr>
+        <w:t>[spesifiser hvilke]</w:t>
+      </w:r>
+      <w:r>
+        <w:rPr>
+          <w:i/>
+          <w:color w:val="CC0000"/>
+          <w:sz w:val="20"/>
+        </w:rPr>
+        <w:t xml:space="preserve"> flyttes.]</w:t>
+      </w:r>
+    </w:p>
+    <w:p>
+      <w:pPr>
+        <w:keepNext/>
+        <w:keepLines/>
+      </w:pPr>
+      <w:r>
+        <w:rPr>
+          <w:i/>
+          <w:color w:val="CC0000"/>
+          <w:sz w:val="20"/>
+        </w:rPr>
+        <w:t>(energi)</w:t>
+      </w:r>
+      <w:r>
+        <w:rPr>
+          <w:b w:val="0"/>
+          <w:color w:val="000000"/>
+          <w:sz w:val="25"/>
+        </w:rPr>
+        <w:t xml:space="preserve"> Og da løfter vi taket sammen – </w:t>
+      </w:r>
+      <w:r>
+        <w:rPr>
+          <w:b/>
+          <w:color w:val="000000"/>
+          <w:sz w:val="25"/>
+        </w:rPr>
+        <w:t>Händerna mot himmelen</w:t>
+      </w:r>
+      <w:r>
+        <w:rPr>
+          <w:b w:val="0"/>
+          <w:color w:val="000000"/>
+          <w:sz w:val="25"/>
+        </w:rPr>
+        <w:t>!</w:t>
+      </w:r>
+    </w:p>
+    <w:p>
+      <w:pPr>
+        <w:keepNext/>
+        <w:keepLines/>
+      </w:pPr>
+      <w:r>
+        <w:rPr>
+          <w:i/>
+          <w:color w:val="CC0000"/>
+          <w:sz w:val="20"/>
+        </w:rPr>
+        <w:t>[Händerna mot himmelen spilles – syng og dans med.]</w:t>
+      </w:r>
+    </w:p>
+    <w:p>
+      <w:pPr>
+        <w:keepNext/>
+        <w:keepLines/>
+      </w:pPr>
+      <w:r>
+        <w:rPr>
+          <w:i/>
+          <w:color w:val="CC0000"/>
+          <w:sz w:val="20"/>
+        </w:rPr>
+        <w:t>(praktisk, vennlig)</w:t>
+      </w:r>
+      <w:r>
+        <w:rPr>
+          <w:b w:val="0"/>
+          <w:color w:val="000000"/>
+          <w:sz w:val="25"/>
+        </w:rPr>
+        <w:t xml:space="preserve"> Mens vi rigger om til dansegulv – det tar en 15–20 minutter – er det fritt fram å strekke på beina, ta litt frisk luft eller fylle glasset. </w:t>
+      </w:r>
+      <w:r>
+        <w:rPr>
+          <w:i/>
+          <w:color w:val="CC0000"/>
+          <w:sz w:val="20"/>
+        </w:rPr>
+        <w:t>(beat)</w:t>
+      </w:r>
+      <w:r>
+        <w:rPr>
+          <w:b w:val="0"/>
+          <w:color w:val="000000"/>
+          <w:sz w:val="25"/>
+        </w:rPr>
+        <w:t xml:space="preserve"> De to bordene </w:t>
+      </w:r>
+      <w:r>
+        <w:rPr>
+          <w:i/>
+          <w:color w:val="CC0000"/>
+          <w:sz w:val="20"/>
+        </w:rPr>
+        <w:t>[pek]</w:t>
+      </w:r>
+      <w:r>
+        <w:rPr>
+          <w:b w:val="0"/>
+          <w:color w:val="000000"/>
+          <w:sz w:val="25"/>
+        </w:rPr>
+        <w:t xml:space="preserve"> flyttes for å gi plass, så hold dem gjerne klare.</w:t>
+      </w:r>
+    </w:p>
+    <w:p>
+      <w:pPr>
+        <w:spacing w:before="140" w:after="140"/>
+        <w:pBdr>
+          <w:bottom w:val="dashed" w:sz="6" w:space="4" w:color="999999"/>
+        </w:pBdr>
+        <w:keepLines/>
+      </w:pPr>
+      <w:r>
+        <w:rPr>
+          <w:color w:val="555555"/>
+          <w:sz w:val="18"/>
+        </w:rPr>
+        <w:t xml:space="preserve">✂     </w:t>
+      </w:r>
+    </w:p>
+    <w:p>
+      <w:pPr>
+        <w:spacing w:before="40"/>
+        <w:keepNext/>
+        <w:keepLines/>
+      </w:pPr>
+      <w:r>
+        <w:rPr>
+          <w:b/>
+          <w:color w:val="555555"/>
+          <w:sz w:val="26"/>
+        </w:rPr>
+        <w:t xml:space="preserve">[34]  </w:t>
       </w:r>
       <w:r>
         <w:rPr>

</xml_diff>